<commit_message>
mise à jour des documentations
</commit_message>
<xml_diff>
--- a/docs/Fr/Lisez-moi.docx
+++ b/docs/Fr/Lisez-moi.docx
@@ -1094,6 +1094,7 @@
                 <w14:ligatures w14:val="none"/>
               </w:rPr>
             </w:pPr>
+            <w:proofErr w:type="spellStart"/>
             <w:r>
               <w:rPr>
                 <w:rFonts w:ascii="Times New Roman" w:eastAsia="Times New Roman" w:hAnsi="Times New Roman" w:cs="Times New Roman"/>
@@ -1103,6 +1104,7 @@
               </w:rPr>
               <w:t>Auditabilité</w:t>
             </w:r>
+            <w:proofErr w:type="spellEnd"/>
           </w:p>
         </w:tc>
         <w:tc>
@@ -1609,7 +1611,7 @@
           <w:lang w:eastAsia="fr-FR"/>
           <w14:ligatures w14:val="none"/>
         </w:rPr>
-        <w:t>type Price = ognum(20,2)</w:t>
+        <w:t>type Price: ognum(20,2)</w:t>
       </w:r>
     </w:p>
     <w:p>
@@ -1733,6 +1735,7 @@
           <w14:ligatures w14:val="none"/>
         </w:rPr>
       </w:pPr>
+      <w:proofErr w:type="spellStart"/>
       <w:r>
         <w:rPr>
           <w:rFonts w:ascii="Courier New" w:eastAsia="Times New Roman" w:hAnsi="Courier New" w:cs="Courier New"/>
@@ -1742,7 +1745,91 @@
           <w:lang w:val="en-GB" w:eastAsia="fr-FR"/>
           <w14:ligatures w14:val="none"/>
         </w:rPr>
-        <w:t>calculate_ttc: fn(ht: Price, tax_rate: Price) -&gt; Price {</w:t>
+        <w:t>calculate_ttc</w:t>
+      </w:r>
+      <w:proofErr w:type="spellEnd"/>
+      <w:r>
+        <w:rPr>
+          <w:rFonts w:ascii="Courier New" w:eastAsia="Times New Roman" w:hAnsi="Courier New" w:cs="Courier New"/>
+          <w:kern w:val="0"/>
+          <w:sz w:val="20"/>
+          <w:szCs w:val="20"/>
+          <w:lang w:val="en-GB" w:eastAsia="fr-FR"/>
+          <w14:ligatures w14:val="none"/>
+        </w:rPr>
+        <w:t xml:space="preserve">: </w:t>
+      </w:r>
+      <w:proofErr w:type="spellStart"/>
+      <w:r>
+        <w:rPr>
+          <w:rFonts w:ascii="Courier New" w:eastAsia="Times New Roman" w:hAnsi="Courier New" w:cs="Courier New"/>
+          <w:kern w:val="0"/>
+          <w:sz w:val="20"/>
+          <w:szCs w:val="20"/>
+          <w:lang w:val="en-GB" w:eastAsia="fr-FR"/>
+          <w14:ligatures w14:val="none"/>
+        </w:rPr>
+        <w:t>fn</w:t>
+      </w:r>
+      <w:proofErr w:type="spellEnd"/>
+      <w:r>
+        <w:rPr>
+          <w:rFonts w:ascii="Courier New" w:eastAsia="Times New Roman" w:hAnsi="Courier New" w:cs="Courier New"/>
+          <w:kern w:val="0"/>
+          <w:sz w:val="20"/>
+          <w:szCs w:val="20"/>
+          <w:lang w:val="en-GB" w:eastAsia="fr-FR"/>
+          <w14:ligatures w14:val="none"/>
+        </w:rPr>
+        <w:t>(</w:t>
+      </w:r>
+      <w:proofErr w:type="spellStart"/>
+      <w:r>
+        <w:rPr>
+          <w:rFonts w:ascii="Courier New" w:eastAsia="Times New Roman" w:hAnsi="Courier New" w:cs="Courier New"/>
+          <w:kern w:val="0"/>
+          <w:sz w:val="20"/>
+          <w:szCs w:val="20"/>
+          <w:lang w:val="en-GB" w:eastAsia="fr-FR"/>
+          <w14:ligatures w14:val="none"/>
+        </w:rPr>
+        <w:t>ht</w:t>
+      </w:r>
+      <w:proofErr w:type="spellEnd"/>
+      <w:r>
+        <w:rPr>
+          <w:rFonts w:ascii="Courier New" w:eastAsia="Times New Roman" w:hAnsi="Courier New" w:cs="Courier New"/>
+          <w:kern w:val="0"/>
+          <w:sz w:val="20"/>
+          <w:szCs w:val="20"/>
+          <w:lang w:val="en-GB" w:eastAsia="fr-FR"/>
+          <w14:ligatures w14:val="none"/>
+        </w:rPr>
+        <w:t xml:space="preserve">: Price, </w:t>
+      </w:r>
+      <w:proofErr w:type="spellStart"/>
+      <w:r>
+        <w:rPr>
+          <w:rFonts w:ascii="Courier New" w:eastAsia="Times New Roman" w:hAnsi="Courier New" w:cs="Courier New"/>
+          <w:kern w:val="0"/>
+          <w:sz w:val="20"/>
+          <w:szCs w:val="20"/>
+          <w:lang w:val="en-GB" w:eastAsia="fr-FR"/>
+          <w14:ligatures w14:val="none"/>
+        </w:rPr>
+        <w:t>tax_rate</w:t>
+      </w:r>
+      <w:proofErr w:type="spellEnd"/>
+      <w:r>
+        <w:rPr>
+          <w:rFonts w:ascii="Courier New" w:eastAsia="Times New Roman" w:hAnsi="Courier New" w:cs="Courier New"/>
+          <w:kern w:val="0"/>
+          <w:sz w:val="20"/>
+          <w:szCs w:val="20"/>
+          <w:lang w:val="en-GB" w:eastAsia="fr-FR"/>
+          <w14:ligatures w14:val="none"/>
+        </w:rPr>
+        <w:t>: Price) -&gt; Price {</w:t>
       </w:r>
     </w:p>
     <w:p>
@@ -1790,7 +1877,7 @@
           <w:lang w:val="en-GB" w:eastAsia="fr-FR"/>
           <w14:ligatures w14:val="none"/>
         </w:rPr>
-        <w:t xml:space="preserve">    let one = Price("1.00")</w:t>
+        <w:t xml:space="preserve">    one: Price = Price("1.00")</w:t>
       </w:r>
     </w:p>
     <w:p>
@@ -1838,7 +1925,55 @@
           <w:lang w:val="en-GB" w:eastAsia="fr-FR"/>
           <w14:ligatures w14:val="none"/>
         </w:rPr>
-        <w:t xml:space="preserve">    let multiplier = math/ognum-add(one, tax_rate)</w:t>
+        <w:t xml:space="preserve">    multiplier: Price = </w:t>
+      </w:r>
+      <w:proofErr w:type="spellStart"/>
+      <w:r>
+        <w:rPr>
+          <w:rFonts w:ascii="Courier New" w:eastAsia="Times New Roman" w:hAnsi="Courier New" w:cs="Courier New"/>
+          <w:kern w:val="0"/>
+          <w:sz w:val="20"/>
+          <w:szCs w:val="20"/>
+          <w:lang w:val="en-GB" w:eastAsia="fr-FR"/>
+          <w14:ligatures w14:val="none"/>
+        </w:rPr>
+        <w:t>math.add</w:t>
+      </w:r>
+      <w:proofErr w:type="spellEnd"/>
+      <w:r>
+        <w:rPr>
+          <w:rFonts w:ascii="Courier New" w:eastAsia="Times New Roman" w:hAnsi="Courier New" w:cs="Courier New"/>
+          <w:kern w:val="0"/>
+          <w:sz w:val="20"/>
+          <w:szCs w:val="20"/>
+          <w:lang w:val="en-GB" w:eastAsia="fr-FR"/>
+          <w14:ligatures w14:val="none"/>
+        </w:rPr>
+        <w:t xml:space="preserve">(one, </w:t>
+      </w:r>
+      <w:proofErr w:type="spellStart"/>
+      <w:r>
+        <w:rPr>
+          <w:rFonts w:ascii="Courier New" w:eastAsia="Times New Roman" w:hAnsi="Courier New" w:cs="Courier New"/>
+          <w:kern w:val="0"/>
+          <w:sz w:val="20"/>
+          <w:szCs w:val="20"/>
+          <w:lang w:val="en-GB" w:eastAsia="fr-FR"/>
+          <w14:ligatures w14:val="none"/>
+        </w:rPr>
+        <w:t>tax_rate</w:t>
+      </w:r>
+      <w:proofErr w:type="spellEnd"/>
+      <w:r>
+        <w:rPr>
+          <w:rFonts w:ascii="Courier New" w:eastAsia="Times New Roman" w:hAnsi="Courier New" w:cs="Courier New"/>
+          <w:kern w:val="0"/>
+          <w:sz w:val="20"/>
+          <w:szCs w:val="20"/>
+          <w:lang w:val="en-GB" w:eastAsia="fr-FR"/>
+          <w14:ligatures w14:val="none"/>
+        </w:rPr>
+        <w:t>)</w:t>
       </w:r>
     </w:p>
     <w:p>
@@ -1886,7 +2021,55 @@
           <w:lang w:val="en-GB" w:eastAsia="fr-FR"/>
           <w14:ligatures w14:val="none"/>
         </w:rPr>
-        <w:t xml:space="preserve">    math/ognum-mul(ht, multiplier)</w:t>
+        <w:t xml:space="preserve">    </w:t>
+      </w:r>
+      <w:proofErr w:type="spellStart"/>
+      <w:r>
+        <w:rPr>
+          <w:rFonts w:ascii="Courier New" w:eastAsia="Times New Roman" w:hAnsi="Courier New" w:cs="Courier New"/>
+          <w:kern w:val="0"/>
+          <w:sz w:val="20"/>
+          <w:szCs w:val="20"/>
+          <w:lang w:val="en-GB" w:eastAsia="fr-FR"/>
+          <w14:ligatures w14:val="none"/>
+        </w:rPr>
+        <w:t>math.mul</w:t>
+      </w:r>
+      <w:proofErr w:type="spellEnd"/>
+      <w:r>
+        <w:rPr>
+          <w:rFonts w:ascii="Courier New" w:eastAsia="Times New Roman" w:hAnsi="Courier New" w:cs="Courier New"/>
+          <w:kern w:val="0"/>
+          <w:sz w:val="20"/>
+          <w:szCs w:val="20"/>
+          <w:lang w:val="en-GB" w:eastAsia="fr-FR"/>
+          <w14:ligatures w14:val="none"/>
+        </w:rPr>
+        <w:t>(</w:t>
+      </w:r>
+      <w:proofErr w:type="spellStart"/>
+      <w:r>
+        <w:rPr>
+          <w:rFonts w:ascii="Courier New" w:eastAsia="Times New Roman" w:hAnsi="Courier New" w:cs="Courier New"/>
+          <w:kern w:val="0"/>
+          <w:sz w:val="20"/>
+          <w:szCs w:val="20"/>
+          <w:lang w:val="en-GB" w:eastAsia="fr-FR"/>
+          <w14:ligatures w14:val="none"/>
+        </w:rPr>
+        <w:t>ht</w:t>
+      </w:r>
+      <w:proofErr w:type="spellEnd"/>
+      <w:r>
+        <w:rPr>
+          <w:rFonts w:ascii="Courier New" w:eastAsia="Times New Roman" w:hAnsi="Courier New" w:cs="Courier New"/>
+          <w:kern w:val="0"/>
+          <w:sz w:val="20"/>
+          <w:szCs w:val="20"/>
+          <w:lang w:val="en-GB" w:eastAsia="fr-FR"/>
+          <w14:ligatures w14:val="none"/>
+        </w:rPr>
+        <w:t>, multiplier)</w:t>
       </w:r>
     </w:p>
     <w:p>
@@ -2019,7 +2202,31 @@
           <w:lang w:val="en-GB" w:eastAsia="fr-FR"/>
           <w14:ligatures w14:val="none"/>
         </w:rPr>
-        <w:t>main: fn() {</w:t>
+        <w:t xml:space="preserve">main: </w:t>
+      </w:r>
+      <w:proofErr w:type="spellStart"/>
+      <w:r>
+        <w:rPr>
+          <w:rFonts w:ascii="Courier New" w:eastAsia="Times New Roman" w:hAnsi="Courier New" w:cs="Courier New"/>
+          <w:kern w:val="0"/>
+          <w:sz w:val="20"/>
+          <w:szCs w:val="20"/>
+          <w:lang w:val="en-GB" w:eastAsia="fr-FR"/>
+          <w14:ligatures w14:val="none"/>
+        </w:rPr>
+        <w:t>fn</w:t>
+      </w:r>
+      <w:proofErr w:type="spellEnd"/>
+      <w:r>
+        <w:rPr>
+          <w:rFonts w:ascii="Courier New" w:eastAsia="Times New Roman" w:hAnsi="Courier New" w:cs="Courier New"/>
+          <w:kern w:val="0"/>
+          <w:sz w:val="20"/>
+          <w:szCs w:val="20"/>
+          <w:lang w:val="en-GB" w:eastAsia="fr-FR"/>
+          <w14:ligatures w14:val="none"/>
+        </w:rPr>
+        <w:t>() {</w:t>
       </w:r>
     </w:p>
     <w:p>
@@ -2067,7 +2274,31 @@
           <w:lang w:val="en-GB" w:eastAsia="fr-FR"/>
           <w14:ligatures w14:val="none"/>
         </w:rPr>
-        <w:t xml:space="preserve">    let price_ht = Price("100.00")</w:t>
+        <w:t xml:space="preserve">    </w:t>
+      </w:r>
+      <w:proofErr w:type="spellStart"/>
+      <w:r>
+        <w:rPr>
+          <w:rFonts w:ascii="Courier New" w:eastAsia="Times New Roman" w:hAnsi="Courier New" w:cs="Courier New"/>
+          <w:kern w:val="0"/>
+          <w:sz w:val="20"/>
+          <w:szCs w:val="20"/>
+          <w:lang w:val="en-GB" w:eastAsia="fr-FR"/>
+          <w14:ligatures w14:val="none"/>
+        </w:rPr>
+        <w:t>price_ht</w:t>
+      </w:r>
+      <w:proofErr w:type="spellEnd"/>
+      <w:r>
+        <w:rPr>
+          <w:rFonts w:ascii="Courier New" w:eastAsia="Times New Roman" w:hAnsi="Courier New" w:cs="Courier New"/>
+          <w:kern w:val="0"/>
+          <w:sz w:val="20"/>
+          <w:szCs w:val="20"/>
+          <w:lang w:val="en-GB" w:eastAsia="fr-FR"/>
+          <w14:ligatures w14:val="none"/>
+        </w:rPr>
+        <w:t>: Price = Price("100.00")</w:t>
       </w:r>
     </w:p>
     <w:p>
@@ -2115,7 +2346,31 @@
           <w:lang w:val="en-GB" w:eastAsia="fr-FR"/>
           <w14:ligatures w14:val="none"/>
         </w:rPr>
-        <w:t xml:space="preserve">    let tva = Price("0.20")</w:t>
+        <w:t xml:space="preserve">    </w:t>
+      </w:r>
+      <w:proofErr w:type="spellStart"/>
+      <w:r>
+        <w:rPr>
+          <w:rFonts w:ascii="Courier New" w:eastAsia="Times New Roman" w:hAnsi="Courier New" w:cs="Courier New"/>
+          <w:kern w:val="0"/>
+          <w:sz w:val="20"/>
+          <w:szCs w:val="20"/>
+          <w:lang w:val="en-GB" w:eastAsia="fr-FR"/>
+          <w14:ligatures w14:val="none"/>
+        </w:rPr>
+        <w:t>tva</w:t>
+      </w:r>
+      <w:proofErr w:type="spellEnd"/>
+      <w:r>
+        <w:rPr>
+          <w:rFonts w:ascii="Courier New" w:eastAsia="Times New Roman" w:hAnsi="Courier New" w:cs="Courier New"/>
+          <w:kern w:val="0"/>
+          <w:sz w:val="20"/>
+          <w:szCs w:val="20"/>
+          <w:lang w:val="en-GB" w:eastAsia="fr-FR"/>
+          <w14:ligatures w14:val="none"/>
+        </w:rPr>
+        <w:t>: Price = Price("0.20")</w:t>
       </w:r>
     </w:p>
     <w:p>
@@ -2163,7 +2418,103 @@
           <w:lang w:val="en-GB" w:eastAsia="fr-FR"/>
           <w14:ligatures w14:val="none"/>
         </w:rPr>
-        <w:t xml:space="preserve">    let price_ttc = calculate_ttc(price_ht, tva)</w:t>
+        <w:t xml:space="preserve">    </w:t>
+      </w:r>
+      <w:proofErr w:type="spellStart"/>
+      <w:r>
+        <w:rPr>
+          <w:rFonts w:ascii="Courier New" w:eastAsia="Times New Roman" w:hAnsi="Courier New" w:cs="Courier New"/>
+          <w:kern w:val="0"/>
+          <w:sz w:val="20"/>
+          <w:szCs w:val="20"/>
+          <w:lang w:val="en-GB" w:eastAsia="fr-FR"/>
+          <w14:ligatures w14:val="none"/>
+        </w:rPr>
+        <w:t>price_ttc</w:t>
+      </w:r>
+      <w:proofErr w:type="spellEnd"/>
+      <w:r>
+        <w:rPr>
+          <w:rFonts w:ascii="Courier New" w:eastAsia="Times New Roman" w:hAnsi="Courier New" w:cs="Courier New"/>
+          <w:kern w:val="0"/>
+          <w:sz w:val="20"/>
+          <w:szCs w:val="20"/>
+          <w:lang w:val="en-GB" w:eastAsia="fr-FR"/>
+          <w14:ligatures w14:val="none"/>
+        </w:rPr>
+        <w:t xml:space="preserve">: Price = </w:t>
+      </w:r>
+      <w:proofErr w:type="spellStart"/>
+      <w:r>
+        <w:rPr>
+          <w:rFonts w:ascii="Courier New" w:eastAsia="Times New Roman" w:hAnsi="Courier New" w:cs="Courier New"/>
+          <w:kern w:val="0"/>
+          <w:sz w:val="20"/>
+          <w:szCs w:val="20"/>
+          <w:lang w:val="en-GB" w:eastAsia="fr-FR"/>
+          <w14:ligatures w14:val="none"/>
+        </w:rPr>
+        <w:t>calculate_ttc</w:t>
+      </w:r>
+      <w:proofErr w:type="spellEnd"/>
+      <w:r>
+        <w:rPr>
+          <w:rFonts w:ascii="Courier New" w:eastAsia="Times New Roman" w:hAnsi="Courier New" w:cs="Courier New"/>
+          <w:kern w:val="0"/>
+          <w:sz w:val="20"/>
+          <w:szCs w:val="20"/>
+          <w:lang w:val="en-GB" w:eastAsia="fr-FR"/>
+          <w14:ligatures w14:val="none"/>
+        </w:rPr>
+        <w:t>(</w:t>
+      </w:r>
+      <w:proofErr w:type="spellStart"/>
+      <w:r>
+        <w:rPr>
+          <w:rFonts w:ascii="Courier New" w:eastAsia="Times New Roman" w:hAnsi="Courier New" w:cs="Courier New"/>
+          <w:kern w:val="0"/>
+          <w:sz w:val="20"/>
+          <w:szCs w:val="20"/>
+          <w:lang w:val="en-GB" w:eastAsia="fr-FR"/>
+          <w14:ligatures w14:val="none"/>
+        </w:rPr>
+        <w:t>price_ht</w:t>
+      </w:r>
+      <w:proofErr w:type="spellEnd"/>
+      <w:r>
+        <w:rPr>
+          <w:rFonts w:ascii="Courier New" w:eastAsia="Times New Roman" w:hAnsi="Courier New" w:cs="Courier New"/>
+          <w:kern w:val="0"/>
+          <w:sz w:val="20"/>
+          <w:szCs w:val="20"/>
+          <w:lang w:val="en-GB" w:eastAsia="fr-FR"/>
+          <w14:ligatures w14:val="none"/>
+        </w:rPr>
+        <w:t xml:space="preserve">, </w:t>
+      </w:r>
+      <w:proofErr w:type="spellStart"/>
+      <w:r>
+        <w:rPr>
+          <w:rFonts w:ascii="Courier New" w:eastAsia="Times New Roman" w:hAnsi="Courier New" w:cs="Courier New"/>
+          <w:kern w:val="0"/>
+          <w:sz w:val="20"/>
+          <w:szCs w:val="20"/>
+          <w:lang w:val="en-GB" w:eastAsia="fr-FR"/>
+          <w14:ligatures w14:val="none"/>
+        </w:rPr>
+        <w:t>tva</w:t>
+      </w:r>
+      <w:proofErr w:type="spellEnd"/>
+      <w:r>
+        <w:rPr>
+          <w:rFonts w:ascii="Courier New" w:eastAsia="Times New Roman" w:hAnsi="Courier New" w:cs="Courier New"/>
+          <w:kern w:val="0"/>
+          <w:sz w:val="20"/>
+          <w:szCs w:val="20"/>
+          <w:lang w:val="en-GB" w:eastAsia="fr-FR"/>
+          <w14:ligatures w14:val="none"/>
+        </w:rPr>
+        <w:t>)</w:t>
       </w:r>
     </w:p>
     <w:p>
@@ -2202,17 +2553,6 @@
           <w14:ligatures w14:val="none"/>
         </w:rPr>
       </w:pPr>
-      <w:r>
-        <w:rPr>
-          <w:rFonts w:ascii="Courier New" w:eastAsia="Times New Roman" w:hAnsi="Courier New" w:cs="Courier New"/>
-          <w:kern w:val="0"/>
-          <w:sz w:val="20"/>
-          <w:szCs w:val="20"/>
-          <w:lang w:val="en-GB" w:eastAsia="fr-FR"/>
-          <w14:ligatures w14:val="none"/>
-        </w:rPr>
-        <w:t xml:space="preserve">    print(string/concat("Prix TTC : ", string(price_ttc)))</w:t>
-      </w:r>
     </w:p>
     <w:p>
       <w:pPr>
@@ -2246,7 +2586,7 @@
           <w:kern w:val="0"/>
           <w:sz w:val="20"/>
           <w:szCs w:val="20"/>
-          <w:lang w:eastAsia="fr-FR"/>
+          <w:lang w:val="en-GB" w:eastAsia="fr-FR"/>
           <w14:ligatures w14:val="none"/>
         </w:rPr>
       </w:pPr>
@@ -2256,30 +2596,58 @@
           <w:kern w:val="0"/>
           <w:sz w:val="20"/>
           <w:szCs w:val="20"/>
-          <w:lang w:eastAsia="fr-FR"/>
-          <w14:ligatures w14:val="none"/>
-        </w:rPr>
-        <w:t>}</w:t>
-      </w:r>
-    </w:p>
-    <w:p>
-      <w:pPr>
-        <w:spacing w:before="100" w:beforeAutospacing="1" w:after="100" w:afterAutospacing="1" w:line="240" w:lineRule="auto"/>
-        <w:rPr>
-          <w:rFonts w:ascii="Times New Roman" w:eastAsia="Times New Roman" w:hAnsi="Times New Roman" w:cs="Times New Roman"/>
-          <w:kern w:val="0"/>
-          <w:lang w:eastAsia="fr-FR"/>
-          <w14:ligatures w14:val="none"/>
-        </w:rPr>
-      </w:pPr>
-      <w:r>
-        <w:rPr>
-          <w:rFonts w:ascii="Times New Roman" w:eastAsia="Times New Roman" w:hAnsi="Times New Roman" w:cs="Times New Roman"/>
-          <w:kern w:val="0"/>
-          <w:lang w:eastAsia="fr-FR"/>
-          <w14:ligatures w14:val="none"/>
-        </w:rPr>
-        <w:t>Exemple 2</w:t>
+          <w:lang w:val="en-GB" w:eastAsia="fr-FR"/>
+          <w14:ligatures w14:val="none"/>
+        </w:rPr>
+        <w:t xml:space="preserve">    print(</w:t>
+      </w:r>
+      <w:proofErr w:type="spellStart"/>
+      <w:r>
+        <w:rPr>
+          <w:rFonts w:ascii="Courier New" w:eastAsia="Times New Roman" w:hAnsi="Courier New" w:cs="Courier New"/>
+          <w:kern w:val="0"/>
+          <w:sz w:val="20"/>
+          <w:szCs w:val="20"/>
+          <w:lang w:val="en-GB" w:eastAsia="fr-FR"/>
+          <w14:ligatures w14:val="none"/>
+        </w:rPr>
+        <w:t>string.concat</w:t>
+      </w:r>
+      <w:proofErr w:type="spellEnd"/>
+      <w:r>
+        <w:rPr>
+          <w:rFonts w:ascii="Courier New" w:eastAsia="Times New Roman" w:hAnsi="Courier New" w:cs="Courier New"/>
+          <w:kern w:val="0"/>
+          <w:sz w:val="20"/>
+          <w:szCs w:val="20"/>
+          <w:lang w:val="en-GB" w:eastAsia="fr-FR"/>
+          <w14:ligatures w14:val="none"/>
+        </w:rPr>
+        <w:t>("Prix TTC : ", string(</w:t>
+      </w:r>
+      <w:proofErr w:type="spellStart"/>
+      <w:r>
+        <w:rPr>
+          <w:rFonts w:ascii="Courier New" w:eastAsia="Times New Roman" w:hAnsi="Courier New" w:cs="Courier New"/>
+          <w:kern w:val="0"/>
+          <w:sz w:val="20"/>
+          <w:szCs w:val="20"/>
+          <w:lang w:val="en-GB" w:eastAsia="fr-FR"/>
+          <w14:ligatures w14:val="none"/>
+        </w:rPr>
+        <w:t>price_ttc</w:t>
+      </w:r>
+      <w:proofErr w:type="spellEnd"/>
+      <w:r>
+        <w:rPr>
+          <w:rFonts w:ascii="Courier New" w:eastAsia="Times New Roman" w:hAnsi="Courier New" w:cs="Courier New"/>
+          <w:kern w:val="0"/>
+          <w:sz w:val="20"/>
+          <w:szCs w:val="20"/>
+          <w:lang w:val="en-GB" w:eastAsia="fr-FR"/>
+          <w14:ligatures w14:val="none"/>
+        </w:rPr>
+        <w:t>)))</w:t>
       </w:r>
     </w:p>
     <w:p>
@@ -2290,31 +2658,64 @@
           <w:bottom w:val="single" w:sz="4" w:space="1" w:color="auto"/>
           <w:right w:val="single" w:sz="4" w:space="4" w:color="auto"/>
         </w:pBdr>
-        <w:spacing w:before="100" w:beforeAutospacing="1" w:after="100" w:afterAutospacing="1" w:line="240" w:lineRule="auto"/>
-        <w:rPr>
-          <w:rFonts w:ascii="Times New Roman" w:eastAsia="Times New Roman" w:hAnsi="Times New Roman" w:cs="Times New Roman"/>
-          <w:kern w:val="0"/>
-          <w:lang w:eastAsia="fr-FR"/>
-          <w14:ligatures w14:val="none"/>
-        </w:rPr>
-      </w:pPr>
-      <w:r>
-        <w:rPr>
-          <w:rFonts w:ascii="Times New Roman" w:eastAsia="Times New Roman" w:hAnsi="Times New Roman" w:cs="Times New Roman"/>
-          <w:kern w:val="0"/>
-          <w:lang w:eastAsia="fr-FR"/>
-          <w14:ligatures w14:val="none"/>
-        </w:rPr>
-        <w:br/>
-      </w:r>
-      <w:r>
-        <w:rPr>
-          <w:rFonts w:ascii="Times New Roman" w:eastAsia="Times New Roman" w:hAnsi="Times New Roman" w:cs="Times New Roman"/>
-          <w:kern w:val="0"/>
-          <w:lang w:eastAsia="fr-FR"/>
-          <w14:ligatures w14:val="none"/>
-        </w:rPr>
-        <w:t>// Convertit une température en degrés Celsius vers Fahrenheit</w:t>
+        <w:tabs>
+          <w:tab w:val="left" w:pos="916"/>
+          <w:tab w:val="left" w:pos="1832"/>
+          <w:tab w:val="left" w:pos="2748"/>
+          <w:tab w:val="left" w:pos="3664"/>
+          <w:tab w:val="left" w:pos="4580"/>
+          <w:tab w:val="left" w:pos="5496"/>
+          <w:tab w:val="left" w:pos="6412"/>
+          <w:tab w:val="left" w:pos="7328"/>
+          <w:tab w:val="left" w:pos="8244"/>
+          <w:tab w:val="left" w:pos="9160"/>
+          <w:tab w:val="left" w:pos="10076"/>
+          <w:tab w:val="left" w:pos="10992"/>
+          <w:tab w:val="left" w:pos="11908"/>
+          <w:tab w:val="left" w:pos="12824"/>
+          <w:tab w:val="left" w:pos="13740"/>
+          <w:tab w:val="left" w:pos="14656"/>
+        </w:tabs>
+        <w:spacing w:after="0" w:line="240" w:lineRule="auto"/>
+        <w:rPr>
+          <w:rFonts w:ascii="Courier New" w:eastAsia="Times New Roman" w:hAnsi="Courier New" w:cs="Courier New"/>
+          <w:kern w:val="0"/>
+          <w:sz w:val="20"/>
+          <w:szCs w:val="20"/>
+          <w:lang w:eastAsia="fr-FR"/>
+          <w14:ligatures w14:val="none"/>
+        </w:rPr>
+      </w:pPr>
+      <w:r>
+        <w:rPr>
+          <w:rFonts w:ascii="Courier New" w:eastAsia="Times New Roman" w:hAnsi="Courier New" w:cs="Courier New"/>
+          <w:kern w:val="0"/>
+          <w:sz w:val="20"/>
+          <w:szCs w:val="20"/>
+          <w:lang w:eastAsia="fr-FR"/>
+          <w14:ligatures w14:val="none"/>
+        </w:rPr>
+        <w:t>}</w:t>
+      </w:r>
+    </w:p>
+    <w:p>
+      <w:pPr>
+        <w:spacing w:before="100" w:beforeAutospacing="1" w:after="100" w:afterAutospacing="1" w:line="240" w:lineRule="auto"/>
+        <w:rPr>
+          <w:rFonts w:ascii="Times New Roman" w:eastAsia="Times New Roman" w:hAnsi="Times New Roman" w:cs="Times New Roman"/>
+          <w:kern w:val="0"/>
+          <w:lang w:eastAsia="fr-FR"/>
+          <w14:ligatures w14:val="none"/>
+        </w:rPr>
+      </w:pPr>
+      <w:r>
+        <w:rPr>
+          <w:rFonts w:ascii="Times New Roman" w:eastAsia="Times New Roman" w:hAnsi="Times New Roman" w:cs="Times New Roman"/>
+          <w:kern w:val="0"/>
+          <w:lang w:eastAsia="fr-FR"/>
+          <w14:ligatures w14:val="none"/>
+        </w:rPr>
+        <w:t>Exemple 2</w:t>
       </w:r>
     </w:p>
     <w:p>
@@ -2329,18 +2730,18 @@
         <w:rPr>
           <w:rFonts w:ascii="Times New Roman" w:eastAsia="Times New Roman" w:hAnsi="Times New Roman" w:cs="Times New Roman"/>
           <w:kern w:val="0"/>
-          <w:lang w:val="en-GB" w:eastAsia="fr-FR"/>
-          <w14:ligatures w14:val="none"/>
-        </w:rPr>
-      </w:pPr>
-      <w:r>
-        <w:rPr>
-          <w:rFonts w:ascii="Times New Roman" w:eastAsia="Times New Roman" w:hAnsi="Times New Roman" w:cs="Times New Roman"/>
-          <w:kern w:val="0"/>
-          <w:lang w:val="en-GB" w:eastAsia="fr-FR"/>
-          <w14:ligatures w14:val="none"/>
-        </w:rPr>
-        <w:t>// Formule : F = C * 9/5 + 32</w:t>
+          <w:lang w:eastAsia="fr-FR"/>
+          <w14:ligatures w14:val="none"/>
+        </w:rPr>
+      </w:pPr>
+      <w:r>
+        <w:rPr>
+          <w:rFonts w:ascii="Times New Roman" w:eastAsia="Times New Roman" w:hAnsi="Times New Roman" w:cs="Times New Roman"/>
+          <w:kern w:val="0"/>
+          <w:lang w:eastAsia="fr-FR"/>
+          <w14:ligatures w14:val="none"/>
+        </w:rPr>
+        <w:t>// Conversion Celsius vers Fahrenheit (F = C * 1.8 + 32)</w:t>
       </w:r>
     </w:p>
     <w:p>
@@ -2359,15 +2760,65 @@
           <w14:ligatures w14:val="none"/>
         </w:rPr>
       </w:pPr>
-      <w:r>
-        <w:rPr>
-          <w:rFonts w:ascii="Times New Roman" w:eastAsia="Times New Roman" w:hAnsi="Times New Roman" w:cs="Times New Roman"/>
-          <w:kern w:val="0"/>
-          <w:lang w:val="en-GB" w:eastAsia="fr-FR"/>
-          <w14:ligatures w14:val="none"/>
-        </w:rPr>
-        <w:lastRenderedPageBreak/>
-        <w:t>celsius_to_fahrenheit: fn(celsius: decimal) -&gt; decimal {</w:t>
+      <w:proofErr w:type="spellStart"/>
+      <w:r>
+        <w:rPr>
+          <w:rFonts w:ascii="Times New Roman" w:eastAsia="Times New Roman" w:hAnsi="Times New Roman" w:cs="Times New Roman"/>
+          <w:kern w:val="0"/>
+          <w:lang w:val="en-GB" w:eastAsia="fr-FR"/>
+          <w14:ligatures w14:val="none"/>
+        </w:rPr>
+        <w:t>celsius_to_fahrenheit</w:t>
+      </w:r>
+      <w:proofErr w:type="spellEnd"/>
+      <w:r>
+        <w:rPr>
+          <w:rFonts w:ascii="Times New Roman" w:eastAsia="Times New Roman" w:hAnsi="Times New Roman" w:cs="Times New Roman"/>
+          <w:kern w:val="0"/>
+          <w:lang w:val="en-GB" w:eastAsia="fr-FR"/>
+          <w14:ligatures w14:val="none"/>
+        </w:rPr>
+        <w:t xml:space="preserve">: </w:t>
+      </w:r>
+      <w:proofErr w:type="spellStart"/>
+      <w:r>
+        <w:rPr>
+          <w:rFonts w:ascii="Times New Roman" w:eastAsia="Times New Roman" w:hAnsi="Times New Roman" w:cs="Times New Roman"/>
+          <w:kern w:val="0"/>
+          <w:lang w:val="en-GB" w:eastAsia="fr-FR"/>
+          <w14:ligatures w14:val="none"/>
+        </w:rPr>
+        <w:t>fn</w:t>
+      </w:r>
+      <w:proofErr w:type="spellEnd"/>
+      <w:r>
+        <w:rPr>
+          <w:rFonts w:ascii="Times New Roman" w:eastAsia="Times New Roman" w:hAnsi="Times New Roman" w:cs="Times New Roman"/>
+          <w:kern w:val="0"/>
+          <w:lang w:val="en-GB" w:eastAsia="fr-FR"/>
+          <w14:ligatures w14:val="none"/>
+        </w:rPr>
+        <w:t>(</w:t>
+      </w:r>
+      <w:proofErr w:type="spellStart"/>
+      <w:r>
+        <w:rPr>
+          <w:rFonts w:ascii="Times New Roman" w:eastAsia="Times New Roman" w:hAnsi="Times New Roman" w:cs="Times New Roman"/>
+          <w:kern w:val="0"/>
+          <w:lang w:val="en-GB" w:eastAsia="fr-FR"/>
+          <w14:ligatures w14:val="none"/>
+        </w:rPr>
+        <w:t>celsius</w:t>
+      </w:r>
+      <w:proofErr w:type="spellEnd"/>
+      <w:r>
+        <w:rPr>
+          <w:rFonts w:ascii="Times New Roman" w:eastAsia="Times New Roman" w:hAnsi="Times New Roman" w:cs="Times New Roman"/>
+          <w:kern w:val="0"/>
+          <w:lang w:val="en-GB" w:eastAsia="fr-FR"/>
+          <w14:ligatures w14:val="none"/>
+        </w:rPr>
+        <w:t>: decimal) -&gt; decimal {</w:t>
       </w:r>
     </w:p>
     <w:p>
@@ -2382,10 +2833,48 @@
         <w:rPr>
           <w:rFonts w:ascii="Times New Roman" w:eastAsia="Times New Roman" w:hAnsi="Times New Roman" w:cs="Times New Roman"/>
           <w:kern w:val="0"/>
-          <w:lang w:val="en-GB" w:eastAsia="fr-FR"/>
-          <w14:ligatures w14:val="none"/>
-        </w:rPr>
-      </w:pPr>
+          <w:lang w:eastAsia="fr-FR"/>
+          <w14:ligatures w14:val="none"/>
+        </w:rPr>
+      </w:pPr>
+      <w:r>
+        <w:rPr>
+          <w:rFonts w:ascii="Times New Roman" w:eastAsia="Times New Roman" w:hAnsi="Times New Roman" w:cs="Times New Roman"/>
+          <w:kern w:val="0"/>
+          <w:lang w:val="en-GB" w:eastAsia="fr-FR"/>
+          <w14:ligatures w14:val="none"/>
+        </w:rPr>
+        <w:t xml:space="preserve">    </w:t>
+      </w:r>
+      <w:r>
+        <w:rPr>
+          <w:rFonts w:ascii="Times New Roman" w:eastAsia="Times New Roman" w:hAnsi="Times New Roman" w:cs="Times New Roman"/>
+          <w:kern w:val="0"/>
+          <w:lang w:eastAsia="fr-FR"/>
+          <w14:ligatures w14:val="none"/>
+        </w:rPr>
+        <w:t xml:space="preserve">ratio: </w:t>
+      </w:r>
+      <w:proofErr w:type="spellStart"/>
+      <w:r>
+        <w:rPr>
+          <w:rFonts w:ascii="Times New Roman" w:eastAsia="Times New Roman" w:hAnsi="Times New Roman" w:cs="Times New Roman"/>
+          <w:kern w:val="0"/>
+          <w:lang w:eastAsia="fr-FR"/>
+          <w14:ligatures w14:val="none"/>
+        </w:rPr>
+        <w:t>decimal</w:t>
+      </w:r>
+      <w:proofErr w:type="spellEnd"/>
+      <w:r>
+        <w:rPr>
+          <w:rFonts w:ascii="Times New Roman" w:eastAsia="Times New Roman" w:hAnsi="Times New Roman" w:cs="Times New Roman"/>
+          <w:kern w:val="0"/>
+          <w:lang w:eastAsia="fr-FR"/>
+          <w14:ligatures w14:val="none"/>
+        </w:rPr>
+        <w:t xml:space="preserve"> = 1.8</w:t>
+      </w:r>
     </w:p>
     <w:p>
       <w:pPr>
@@ -2407,19 +2896,71 @@
         <w:rPr>
           <w:rFonts w:ascii="Times New Roman" w:eastAsia="Times New Roman" w:hAnsi="Times New Roman" w:cs="Times New Roman"/>
           <w:kern w:val="0"/>
-          <w:lang w:val="en-GB" w:eastAsia="fr-FR"/>
-          <w14:ligatures w14:val="none"/>
-        </w:rPr>
-        <w:t xml:space="preserve">    </w:t>
-      </w:r>
-      <w:r>
-        <w:rPr>
-          <w:rFonts w:ascii="Times New Roman" w:eastAsia="Times New Roman" w:hAnsi="Times New Roman" w:cs="Times New Roman"/>
-          <w:kern w:val="0"/>
-          <w:lang w:eastAsia="fr-FR"/>
-          <w14:ligatures w14:val="none"/>
-        </w:rPr>
-        <w:t>// On prépare les constantes 9 et 5</w:t>
+          <w:lang w:eastAsia="fr-FR"/>
+          <w14:ligatures w14:val="none"/>
+        </w:rPr>
+        <w:lastRenderedPageBreak/>
+        <w:t xml:space="preserve">    part1: </w:t>
+      </w:r>
+      <w:proofErr w:type="spellStart"/>
+      <w:r>
+        <w:rPr>
+          <w:rFonts w:ascii="Times New Roman" w:eastAsia="Times New Roman" w:hAnsi="Times New Roman" w:cs="Times New Roman"/>
+          <w:kern w:val="0"/>
+          <w:lang w:eastAsia="fr-FR"/>
+          <w14:ligatures w14:val="none"/>
+        </w:rPr>
+        <w:t>decimal</w:t>
+      </w:r>
+      <w:proofErr w:type="spellEnd"/>
+      <w:r>
+        <w:rPr>
+          <w:rFonts w:ascii="Times New Roman" w:eastAsia="Times New Roman" w:hAnsi="Times New Roman" w:cs="Times New Roman"/>
+          <w:kern w:val="0"/>
+          <w:lang w:eastAsia="fr-FR"/>
+          <w14:ligatures w14:val="none"/>
+        </w:rPr>
+        <w:t xml:space="preserve"> = </w:t>
+      </w:r>
+      <w:proofErr w:type="spellStart"/>
+      <w:r>
+        <w:rPr>
+          <w:rFonts w:ascii="Times New Roman" w:eastAsia="Times New Roman" w:hAnsi="Times New Roman" w:cs="Times New Roman"/>
+          <w:kern w:val="0"/>
+          <w:lang w:eastAsia="fr-FR"/>
+          <w14:ligatures w14:val="none"/>
+        </w:rPr>
+        <w:t>math.mul</w:t>
+      </w:r>
+      <w:proofErr w:type="spellEnd"/>
+      <w:r>
+        <w:rPr>
+          <w:rFonts w:ascii="Times New Roman" w:eastAsia="Times New Roman" w:hAnsi="Times New Roman" w:cs="Times New Roman"/>
+          <w:kern w:val="0"/>
+          <w:lang w:eastAsia="fr-FR"/>
+          <w14:ligatures w14:val="none"/>
+        </w:rPr>
+        <w:t>(</w:t>
+      </w:r>
+      <w:proofErr w:type="spellStart"/>
+      <w:r>
+        <w:rPr>
+          <w:rFonts w:ascii="Times New Roman" w:eastAsia="Times New Roman" w:hAnsi="Times New Roman" w:cs="Times New Roman"/>
+          <w:kern w:val="0"/>
+          <w:lang w:eastAsia="fr-FR"/>
+          <w14:ligatures w14:val="none"/>
+        </w:rPr>
+        <w:t>celsius</w:t>
+      </w:r>
+      <w:proofErr w:type="spellEnd"/>
+      <w:r>
+        <w:rPr>
+          <w:rFonts w:ascii="Times New Roman" w:eastAsia="Times New Roman" w:hAnsi="Times New Roman" w:cs="Times New Roman"/>
+          <w:kern w:val="0"/>
+          <w:lang w:eastAsia="fr-FR"/>
+          <w14:ligatures w14:val="none"/>
+        </w:rPr>
+        <w:t>, ratio)</w:t>
       </w:r>
     </w:p>
     <w:p>
@@ -2434,7 +2975,7 @@
         <w:rPr>
           <w:rFonts w:ascii="Times New Roman" w:eastAsia="Times New Roman" w:hAnsi="Times New Roman" w:cs="Times New Roman"/>
           <w:kern w:val="0"/>
-          <w:lang w:val="en-GB" w:eastAsia="fr-FR"/>
+          <w:lang w:eastAsia="fr-FR"/>
           <w14:ligatures w14:val="none"/>
         </w:rPr>
       </w:pPr>
@@ -2446,15 +2987,6 @@
           <w14:ligatures w14:val="none"/>
         </w:rPr>
         <w:t xml:space="preserve">    </w:t>
-      </w:r>
-      <w:r>
-        <w:rPr>
-          <w:rFonts w:ascii="Times New Roman" w:eastAsia="Times New Roman" w:hAnsi="Times New Roman" w:cs="Times New Roman"/>
-          <w:kern w:val="0"/>
-          <w:lang w:val="en-GB" w:eastAsia="fr-FR"/>
-          <w14:ligatures w14:val="none"/>
-        </w:rPr>
-        <w:t>let nine = decimal 9</w:t>
       </w:r>
     </w:p>
     <w:p>
@@ -2469,18 +3001,38 @@
         <w:rPr>
           <w:rFonts w:ascii="Times New Roman" w:eastAsia="Times New Roman" w:hAnsi="Times New Roman" w:cs="Times New Roman"/>
           <w:kern w:val="0"/>
-          <w:lang w:val="en-GB" w:eastAsia="fr-FR"/>
-          <w14:ligatures w14:val="none"/>
-        </w:rPr>
-      </w:pPr>
-      <w:r>
-        <w:rPr>
-          <w:rFonts w:ascii="Times New Roman" w:eastAsia="Times New Roman" w:hAnsi="Times New Roman" w:cs="Times New Roman"/>
-          <w:kern w:val="0"/>
-          <w:lang w:val="en-GB" w:eastAsia="fr-FR"/>
-          <w14:ligatures w14:val="none"/>
-        </w:rPr>
-        <w:t xml:space="preserve">    let five = decimal 5</w:t>
+          <w:lang w:eastAsia="fr-FR"/>
+          <w14:ligatures w14:val="none"/>
+        </w:rPr>
+      </w:pPr>
+      <w:r>
+        <w:rPr>
+          <w:rFonts w:ascii="Times New Roman" w:eastAsia="Times New Roman" w:hAnsi="Times New Roman" w:cs="Times New Roman"/>
+          <w:kern w:val="0"/>
+          <w:lang w:eastAsia="fr-FR"/>
+          <w14:ligatures w14:val="none"/>
+        </w:rPr>
+        <w:t xml:space="preserve">    </w:t>
+      </w:r>
+      <w:proofErr w:type="spellStart"/>
+      <w:r>
+        <w:rPr>
+          <w:rFonts w:ascii="Times New Roman" w:eastAsia="Times New Roman" w:hAnsi="Times New Roman" w:cs="Times New Roman"/>
+          <w:kern w:val="0"/>
+          <w:lang w:eastAsia="fr-FR"/>
+          <w14:ligatures w14:val="none"/>
+        </w:rPr>
+        <w:t>math.add</w:t>
+      </w:r>
+      <w:proofErr w:type="spellEnd"/>
+      <w:r>
+        <w:rPr>
+          <w:rFonts w:ascii="Times New Roman" w:eastAsia="Times New Roman" w:hAnsi="Times New Roman" w:cs="Times New Roman"/>
+          <w:kern w:val="0"/>
+          <w:lang w:eastAsia="fr-FR"/>
+          <w14:ligatures w14:val="none"/>
+        </w:rPr>
+        <w:t>(part1, 32.0) // La dernière ligne est la valeur de retour</w:t>
       </w:r>
     </w:p>
     <w:p>
@@ -2499,6 +3051,15 @@
           <w14:ligatures w14:val="none"/>
         </w:rPr>
       </w:pPr>
+      <w:r>
+        <w:rPr>
+          <w:rFonts w:ascii="Times New Roman" w:eastAsia="Times New Roman" w:hAnsi="Times New Roman" w:cs="Times New Roman"/>
+          <w:kern w:val="0"/>
+          <w:lang w:val="en-GB" w:eastAsia="fr-FR"/>
+          <w14:ligatures w14:val="none"/>
+        </w:rPr>
+        <w:t>}</w:t>
+      </w:r>
     </w:p>
     <w:p>
       <w:pPr>
@@ -2516,15 +3077,6 @@
           <w14:ligatures w14:val="none"/>
         </w:rPr>
       </w:pPr>
-      <w:r>
-        <w:rPr>
-          <w:rFonts w:ascii="Times New Roman" w:eastAsia="Times New Roman" w:hAnsi="Times New Roman" w:cs="Times New Roman"/>
-          <w:kern w:val="0"/>
-          <w:lang w:val="en-GB" w:eastAsia="fr-FR"/>
-          <w14:ligatures w14:val="none"/>
-        </w:rPr>
-        <w:t xml:space="preserve">    // Calcul du ratio 9/5</w:t>
-      </w:r>
     </w:p>
     <w:p>
       <w:pPr>
@@ -2549,7 +3101,27 @@
           <w:lang w:val="en-GB" w:eastAsia="fr-FR"/>
           <w14:ligatures w14:val="none"/>
         </w:rPr>
-        <w:t xml:space="preserve">    let ratio = math/decimal-div(nine, five)</w:t>
+        <w:t xml:space="preserve">main: </w:t>
+      </w:r>
+      <w:proofErr w:type="spellStart"/>
+      <w:r>
+        <w:rPr>
+          <w:rFonts w:ascii="Times New Roman" w:eastAsia="Times New Roman" w:hAnsi="Times New Roman" w:cs="Times New Roman"/>
+          <w:kern w:val="0"/>
+          <w:lang w:val="en-GB" w:eastAsia="fr-FR"/>
+          <w14:ligatures w14:val="none"/>
+        </w:rPr>
+        <w:t>fn</w:t>
+      </w:r>
+      <w:proofErr w:type="spellEnd"/>
+      <w:r>
+        <w:rPr>
+          <w:rFonts w:ascii="Times New Roman" w:eastAsia="Times New Roman" w:hAnsi="Times New Roman" w:cs="Times New Roman"/>
+          <w:kern w:val="0"/>
+          <w:lang w:val="en-GB" w:eastAsia="fr-FR"/>
+          <w14:ligatures w14:val="none"/>
+        </w:rPr>
+        <w:t>() {</w:t>
       </w:r>
     </w:p>
     <w:p>
@@ -2568,6 +3140,35 @@
           <w14:ligatures w14:val="none"/>
         </w:rPr>
       </w:pPr>
+      <w:r>
+        <w:rPr>
+          <w:rFonts w:ascii="Times New Roman" w:eastAsia="Times New Roman" w:hAnsi="Times New Roman" w:cs="Times New Roman"/>
+          <w:kern w:val="0"/>
+          <w:lang w:val="en-GB" w:eastAsia="fr-FR"/>
+          <w14:ligatures w14:val="none"/>
+        </w:rPr>
+        <w:t xml:space="preserve">    </w:t>
+      </w:r>
+      <w:proofErr w:type="spellStart"/>
+      <w:r>
+        <w:rPr>
+          <w:rFonts w:ascii="Times New Roman" w:eastAsia="Times New Roman" w:hAnsi="Times New Roman" w:cs="Times New Roman"/>
+          <w:kern w:val="0"/>
+          <w:lang w:val="en-GB" w:eastAsia="fr-FR"/>
+          <w14:ligatures w14:val="none"/>
+        </w:rPr>
+        <w:t>temp_c</w:t>
+      </w:r>
+      <w:proofErr w:type="spellEnd"/>
+      <w:r>
+        <w:rPr>
+          <w:rFonts w:ascii="Times New Roman" w:eastAsia="Times New Roman" w:hAnsi="Times New Roman" w:cs="Times New Roman"/>
+          <w:kern w:val="0"/>
+          <w:lang w:val="en-GB" w:eastAsia="fr-FR"/>
+          <w14:ligatures w14:val="none"/>
+        </w:rPr>
+        <w:t>: decimal = 25.0</w:t>
+      </w:r>
     </w:p>
     <w:p>
       <w:pPr>
@@ -2592,7 +3193,67 @@
           <w:lang w:val="en-GB" w:eastAsia="fr-FR"/>
           <w14:ligatures w14:val="none"/>
         </w:rPr>
-        <w:t xml:space="preserve">    // (celsius * ratio) + 32</w:t>
+        <w:t xml:space="preserve">    </w:t>
+      </w:r>
+      <w:proofErr w:type="spellStart"/>
+      <w:r>
+        <w:rPr>
+          <w:rFonts w:ascii="Times New Roman" w:eastAsia="Times New Roman" w:hAnsi="Times New Roman" w:cs="Times New Roman"/>
+          <w:kern w:val="0"/>
+          <w:lang w:val="en-GB" w:eastAsia="fr-FR"/>
+          <w14:ligatures w14:val="none"/>
+        </w:rPr>
+        <w:t>temp_f</w:t>
+      </w:r>
+      <w:proofErr w:type="spellEnd"/>
+      <w:r>
+        <w:rPr>
+          <w:rFonts w:ascii="Times New Roman" w:eastAsia="Times New Roman" w:hAnsi="Times New Roman" w:cs="Times New Roman"/>
+          <w:kern w:val="0"/>
+          <w:lang w:val="en-GB" w:eastAsia="fr-FR"/>
+          <w14:ligatures w14:val="none"/>
+        </w:rPr>
+        <w:t xml:space="preserve">: decimal = </w:t>
+      </w:r>
+      <w:proofErr w:type="spellStart"/>
+      <w:r>
+        <w:rPr>
+          <w:rFonts w:ascii="Times New Roman" w:eastAsia="Times New Roman" w:hAnsi="Times New Roman" w:cs="Times New Roman"/>
+          <w:kern w:val="0"/>
+          <w:lang w:val="en-GB" w:eastAsia="fr-FR"/>
+          <w14:ligatures w14:val="none"/>
+        </w:rPr>
+        <w:t>celsius_to_fahrenheit</w:t>
+      </w:r>
+      <w:proofErr w:type="spellEnd"/>
+      <w:r>
+        <w:rPr>
+          <w:rFonts w:ascii="Times New Roman" w:eastAsia="Times New Roman" w:hAnsi="Times New Roman" w:cs="Times New Roman"/>
+          <w:kern w:val="0"/>
+          <w:lang w:val="en-GB" w:eastAsia="fr-FR"/>
+          <w14:ligatures w14:val="none"/>
+        </w:rPr>
+        <w:t>(</w:t>
+      </w:r>
+      <w:proofErr w:type="spellStart"/>
+      <w:r>
+        <w:rPr>
+          <w:rFonts w:ascii="Times New Roman" w:eastAsia="Times New Roman" w:hAnsi="Times New Roman" w:cs="Times New Roman"/>
+          <w:kern w:val="0"/>
+          <w:lang w:val="en-GB" w:eastAsia="fr-FR"/>
+          <w14:ligatures w14:val="none"/>
+        </w:rPr>
+        <w:t>temp_c</w:t>
+      </w:r>
+      <w:proofErr w:type="spellEnd"/>
+      <w:r>
+        <w:rPr>
+          <w:rFonts w:ascii="Times New Roman" w:eastAsia="Times New Roman" w:hAnsi="Times New Roman" w:cs="Times New Roman"/>
+          <w:kern w:val="0"/>
+          <w:lang w:val="en-GB" w:eastAsia="fr-FR"/>
+          <w14:ligatures w14:val="none"/>
+        </w:rPr>
+        <w:t>)</w:t>
       </w:r>
     </w:p>
     <w:p>
@@ -2611,15 +3272,6 @@
           <w14:ligatures w14:val="none"/>
         </w:rPr>
       </w:pPr>
-      <w:r>
-        <w:rPr>
-          <w:rFonts w:ascii="Times New Roman" w:eastAsia="Times New Roman" w:hAnsi="Times New Roman" w:cs="Times New Roman"/>
-          <w:kern w:val="0"/>
-          <w:lang w:val="en-GB" w:eastAsia="fr-FR"/>
-          <w14:ligatures w14:val="none"/>
-        </w:rPr>
-        <w:t xml:space="preserve">    let part1 = math/decimal-mul(celsius, ratio)</w:t>
-      </w:r>
     </w:p>
     <w:p>
       <w:pPr>
@@ -2644,7 +3296,47 @@
           <w:lang w:val="en-GB" w:eastAsia="fr-FR"/>
           <w14:ligatures w14:val="none"/>
         </w:rPr>
-        <w:t xml:space="preserve">    let result = math/decimal-add(part1, decimal 32)</w:t>
+        <w:t xml:space="preserve">    print(</w:t>
+      </w:r>
+      <w:proofErr w:type="spellStart"/>
+      <w:r>
+        <w:rPr>
+          <w:rFonts w:ascii="Times New Roman" w:eastAsia="Times New Roman" w:hAnsi="Times New Roman" w:cs="Times New Roman"/>
+          <w:kern w:val="0"/>
+          <w:lang w:val="en-GB" w:eastAsia="fr-FR"/>
+          <w14:ligatures w14:val="none"/>
+        </w:rPr>
+        <w:t>string.concat</w:t>
+      </w:r>
+      <w:proofErr w:type="spellEnd"/>
+      <w:r>
+        <w:rPr>
+          <w:rFonts w:ascii="Times New Roman" w:eastAsia="Times New Roman" w:hAnsi="Times New Roman" w:cs="Times New Roman"/>
+          <w:kern w:val="0"/>
+          <w:lang w:val="en-GB" w:eastAsia="fr-FR"/>
+          <w14:ligatures w14:val="none"/>
+        </w:rPr>
+        <w:t>("25°C = ", string(</w:t>
+      </w:r>
+      <w:proofErr w:type="spellStart"/>
+      <w:r>
+        <w:rPr>
+          <w:rFonts w:ascii="Times New Roman" w:eastAsia="Times New Roman" w:hAnsi="Times New Roman" w:cs="Times New Roman"/>
+          <w:kern w:val="0"/>
+          <w:lang w:val="en-GB" w:eastAsia="fr-FR"/>
+          <w14:ligatures w14:val="none"/>
+        </w:rPr>
+        <w:t>temp_f</w:t>
+      </w:r>
+      <w:proofErr w:type="spellEnd"/>
+      <w:r>
+        <w:rPr>
+          <w:rFonts w:ascii="Times New Roman" w:eastAsia="Times New Roman" w:hAnsi="Times New Roman" w:cs="Times New Roman"/>
+          <w:kern w:val="0"/>
+          <w:lang w:val="en-GB" w:eastAsia="fr-FR"/>
+          <w14:ligatures w14:val="none"/>
+        </w:rPr>
+        <w:t>), "°F"))</w:t>
       </w:r>
     </w:p>
     <w:p>
@@ -2659,413 +3351,6 @@
         <w:rPr>
           <w:rFonts w:ascii="Times New Roman" w:eastAsia="Times New Roman" w:hAnsi="Times New Roman" w:cs="Times New Roman"/>
           <w:kern w:val="0"/>
-          <w:lang w:val="en-GB" w:eastAsia="fr-FR"/>
-          <w14:ligatures w14:val="none"/>
-        </w:rPr>
-      </w:pPr>
-    </w:p>
-    <w:p>
-      <w:pPr>
-        <w:pBdr>
-          <w:top w:val="single" w:sz="4" w:space="1" w:color="auto"/>
-          <w:left w:val="single" w:sz="4" w:space="4" w:color="auto"/>
-          <w:bottom w:val="single" w:sz="4" w:space="1" w:color="auto"/>
-          <w:right w:val="single" w:sz="4" w:space="4" w:color="auto"/>
-        </w:pBdr>
-        <w:spacing w:before="100" w:beforeAutospacing="1" w:after="100" w:afterAutospacing="1" w:line="240" w:lineRule="auto"/>
-        <w:rPr>
-          <w:rFonts w:ascii="Times New Roman" w:eastAsia="Times New Roman" w:hAnsi="Times New Roman" w:cs="Times New Roman"/>
-          <w:kern w:val="0"/>
-          <w:lang w:eastAsia="fr-FR"/>
-          <w14:ligatures w14:val="none"/>
-        </w:rPr>
-      </w:pPr>
-      <w:r>
-        <w:rPr>
-          <w:rFonts w:ascii="Times New Roman" w:eastAsia="Times New Roman" w:hAnsi="Times New Roman" w:cs="Times New Roman"/>
-          <w:kern w:val="0"/>
-          <w:lang w:val="en-GB" w:eastAsia="fr-FR"/>
-          <w14:ligatures w14:val="none"/>
-        </w:rPr>
-        <w:t xml:space="preserve">    </w:t>
-      </w:r>
-      <w:r>
-        <w:rPr>
-          <w:rFonts w:ascii="Times New Roman" w:eastAsia="Times New Roman" w:hAnsi="Times New Roman" w:cs="Times New Roman"/>
-          <w:kern w:val="0"/>
-          <w:lang w:eastAsia="fr-FR"/>
-          <w14:ligatures w14:val="none"/>
-        </w:rPr>
-        <w:t>// Résultat final</w:t>
-      </w:r>
-    </w:p>
-    <w:p>
-      <w:pPr>
-        <w:pBdr>
-          <w:top w:val="single" w:sz="4" w:space="1" w:color="auto"/>
-          <w:left w:val="single" w:sz="4" w:space="4" w:color="auto"/>
-          <w:bottom w:val="single" w:sz="4" w:space="1" w:color="auto"/>
-          <w:right w:val="single" w:sz="4" w:space="4" w:color="auto"/>
-        </w:pBdr>
-        <w:spacing w:before="100" w:beforeAutospacing="1" w:after="100" w:afterAutospacing="1" w:line="240" w:lineRule="auto"/>
-        <w:rPr>
-          <w:rFonts w:ascii="Times New Roman" w:eastAsia="Times New Roman" w:hAnsi="Times New Roman" w:cs="Times New Roman"/>
-          <w:kern w:val="0"/>
-          <w:lang w:eastAsia="fr-FR"/>
-          <w14:ligatures w14:val="none"/>
-        </w:rPr>
-      </w:pPr>
-      <w:r>
-        <w:rPr>
-          <w:rFonts w:ascii="Times New Roman" w:eastAsia="Times New Roman" w:hAnsi="Times New Roman" w:cs="Times New Roman"/>
-          <w:kern w:val="0"/>
-          <w:lang w:eastAsia="fr-FR"/>
-          <w14:ligatures w14:val="none"/>
-        </w:rPr>
-        <w:t xml:space="preserve">    result</w:t>
-      </w:r>
-    </w:p>
-    <w:p>
-      <w:pPr>
-        <w:pBdr>
-          <w:top w:val="single" w:sz="4" w:space="1" w:color="auto"/>
-          <w:left w:val="single" w:sz="4" w:space="4" w:color="auto"/>
-          <w:bottom w:val="single" w:sz="4" w:space="1" w:color="auto"/>
-          <w:right w:val="single" w:sz="4" w:space="4" w:color="auto"/>
-        </w:pBdr>
-        <w:spacing w:before="100" w:beforeAutospacing="1" w:after="100" w:afterAutospacing="1" w:line="240" w:lineRule="auto"/>
-        <w:rPr>
-          <w:rFonts w:ascii="Times New Roman" w:eastAsia="Times New Roman" w:hAnsi="Times New Roman" w:cs="Times New Roman"/>
-          <w:kern w:val="0"/>
-          <w:lang w:eastAsia="fr-FR"/>
-          <w14:ligatures w14:val="none"/>
-        </w:rPr>
-      </w:pPr>
-      <w:r>
-        <w:rPr>
-          <w:rFonts w:ascii="Times New Roman" w:eastAsia="Times New Roman" w:hAnsi="Times New Roman" w:cs="Times New Roman"/>
-          <w:kern w:val="0"/>
-          <w:lang w:eastAsia="fr-FR"/>
-          <w14:ligatures w14:val="none"/>
-        </w:rPr>
-        <w:t>}</w:t>
-      </w:r>
-    </w:p>
-    <w:p>
-      <w:pPr>
-        <w:pBdr>
-          <w:top w:val="single" w:sz="4" w:space="1" w:color="auto"/>
-          <w:left w:val="single" w:sz="4" w:space="4" w:color="auto"/>
-          <w:bottom w:val="single" w:sz="4" w:space="1" w:color="auto"/>
-          <w:right w:val="single" w:sz="4" w:space="4" w:color="auto"/>
-        </w:pBdr>
-        <w:spacing w:before="100" w:beforeAutospacing="1" w:after="100" w:afterAutospacing="1" w:line="240" w:lineRule="auto"/>
-        <w:rPr>
-          <w:rFonts w:ascii="Times New Roman" w:eastAsia="Times New Roman" w:hAnsi="Times New Roman" w:cs="Times New Roman"/>
-          <w:kern w:val="0"/>
-          <w:lang w:eastAsia="fr-FR"/>
-          <w14:ligatures w14:val="none"/>
-        </w:rPr>
-      </w:pPr>
-    </w:p>
-    <w:p>
-      <w:pPr>
-        <w:pBdr>
-          <w:top w:val="single" w:sz="4" w:space="1" w:color="auto"/>
-          <w:left w:val="single" w:sz="4" w:space="4" w:color="auto"/>
-          <w:bottom w:val="single" w:sz="4" w:space="1" w:color="auto"/>
-          <w:right w:val="single" w:sz="4" w:space="4" w:color="auto"/>
-        </w:pBdr>
-        <w:spacing w:before="100" w:beforeAutospacing="1" w:after="100" w:afterAutospacing="1" w:line="240" w:lineRule="auto"/>
-        <w:rPr>
-          <w:rFonts w:ascii="Times New Roman" w:eastAsia="Times New Roman" w:hAnsi="Times New Roman" w:cs="Times New Roman"/>
-          <w:kern w:val="0"/>
-          <w:lang w:eastAsia="fr-FR"/>
-          <w14:ligatures w14:val="none"/>
-        </w:rPr>
-      </w:pPr>
-    </w:p>
-    <w:p>
-      <w:pPr>
-        <w:pBdr>
-          <w:top w:val="single" w:sz="4" w:space="1" w:color="auto"/>
-          <w:left w:val="single" w:sz="4" w:space="4" w:color="auto"/>
-          <w:bottom w:val="single" w:sz="4" w:space="1" w:color="auto"/>
-          <w:right w:val="single" w:sz="4" w:space="4" w:color="auto"/>
-        </w:pBdr>
-        <w:spacing w:before="100" w:beforeAutospacing="1" w:after="100" w:afterAutospacing="1" w:line="240" w:lineRule="auto"/>
-        <w:rPr>
-          <w:rFonts w:ascii="Times New Roman" w:eastAsia="Times New Roman" w:hAnsi="Times New Roman" w:cs="Times New Roman"/>
-          <w:kern w:val="0"/>
-          <w:lang w:eastAsia="fr-FR"/>
-          <w14:ligatures w14:val="none"/>
-        </w:rPr>
-      </w:pPr>
-      <w:r>
-        <w:rPr>
-          <w:rFonts w:ascii="Times New Roman" w:eastAsia="Times New Roman" w:hAnsi="Times New Roman" w:cs="Times New Roman"/>
-          <w:kern w:val="0"/>
-          <w:lang w:eastAsia="fr-FR"/>
-          <w14:ligatures w14:val="none"/>
-        </w:rPr>
-        <w:t>// Point d'entrée du programme</w:t>
-      </w:r>
-    </w:p>
-    <w:p>
-      <w:pPr>
-        <w:pBdr>
-          <w:top w:val="single" w:sz="4" w:space="1" w:color="auto"/>
-          <w:left w:val="single" w:sz="4" w:space="4" w:color="auto"/>
-          <w:bottom w:val="single" w:sz="4" w:space="1" w:color="auto"/>
-          <w:right w:val="single" w:sz="4" w:space="4" w:color="auto"/>
-        </w:pBdr>
-        <w:spacing w:before="100" w:beforeAutospacing="1" w:after="100" w:afterAutospacing="1" w:line="240" w:lineRule="auto"/>
-        <w:rPr>
-          <w:rFonts w:ascii="Times New Roman" w:eastAsia="Times New Roman" w:hAnsi="Times New Roman" w:cs="Times New Roman"/>
-          <w:kern w:val="0"/>
-          <w:lang w:val="en-GB" w:eastAsia="fr-FR"/>
-          <w14:ligatures w14:val="none"/>
-        </w:rPr>
-      </w:pPr>
-      <w:r>
-        <w:rPr>
-          <w:rFonts w:ascii="Times New Roman" w:eastAsia="Times New Roman" w:hAnsi="Times New Roman" w:cs="Times New Roman"/>
-          <w:kern w:val="0"/>
-          <w:lang w:val="en-GB" w:eastAsia="fr-FR"/>
-          <w14:ligatures w14:val="none"/>
-        </w:rPr>
-        <w:t>main: fn() {</w:t>
-      </w:r>
-    </w:p>
-    <w:p>
-      <w:pPr>
-        <w:pBdr>
-          <w:top w:val="single" w:sz="4" w:space="1" w:color="auto"/>
-          <w:left w:val="single" w:sz="4" w:space="4" w:color="auto"/>
-          <w:bottom w:val="single" w:sz="4" w:space="1" w:color="auto"/>
-          <w:right w:val="single" w:sz="4" w:space="4" w:color="auto"/>
-        </w:pBdr>
-        <w:spacing w:before="100" w:beforeAutospacing="1" w:after="100" w:afterAutospacing="1" w:line="240" w:lineRule="auto"/>
-        <w:rPr>
-          <w:rFonts w:ascii="Times New Roman" w:eastAsia="Times New Roman" w:hAnsi="Times New Roman" w:cs="Times New Roman"/>
-          <w:kern w:val="0"/>
-          <w:lang w:val="en-GB" w:eastAsia="fr-FR"/>
-          <w14:ligatures w14:val="none"/>
-        </w:rPr>
-      </w:pPr>
-    </w:p>
-    <w:p>
-      <w:pPr>
-        <w:pBdr>
-          <w:top w:val="single" w:sz="4" w:space="1" w:color="auto"/>
-          <w:left w:val="single" w:sz="4" w:space="4" w:color="auto"/>
-          <w:bottom w:val="single" w:sz="4" w:space="1" w:color="auto"/>
-          <w:right w:val="single" w:sz="4" w:space="4" w:color="auto"/>
-        </w:pBdr>
-        <w:spacing w:before="100" w:beforeAutospacing="1" w:after="100" w:afterAutospacing="1" w:line="240" w:lineRule="auto"/>
-        <w:rPr>
-          <w:rFonts w:ascii="Times New Roman" w:eastAsia="Times New Roman" w:hAnsi="Times New Roman" w:cs="Times New Roman"/>
-          <w:kern w:val="0"/>
-          <w:lang w:val="en-GB" w:eastAsia="fr-FR"/>
-          <w14:ligatures w14:val="none"/>
-        </w:rPr>
-      </w:pPr>
-      <w:r>
-        <w:rPr>
-          <w:rFonts w:ascii="Times New Roman" w:eastAsia="Times New Roman" w:hAnsi="Times New Roman" w:cs="Times New Roman"/>
-          <w:kern w:val="0"/>
-          <w:lang w:val="en-GB" w:eastAsia="fr-FR"/>
-          <w14:ligatures w14:val="none"/>
-        </w:rPr>
-        <w:t xml:space="preserve">    // Exemple : 25°C</w:t>
-      </w:r>
-    </w:p>
-    <w:p>
-      <w:pPr>
-        <w:pBdr>
-          <w:top w:val="single" w:sz="4" w:space="1" w:color="auto"/>
-          <w:left w:val="single" w:sz="4" w:space="4" w:color="auto"/>
-          <w:bottom w:val="single" w:sz="4" w:space="1" w:color="auto"/>
-          <w:right w:val="single" w:sz="4" w:space="4" w:color="auto"/>
-        </w:pBdr>
-        <w:spacing w:before="100" w:beforeAutospacing="1" w:after="100" w:afterAutospacing="1" w:line="240" w:lineRule="auto"/>
-        <w:rPr>
-          <w:rFonts w:ascii="Times New Roman" w:eastAsia="Times New Roman" w:hAnsi="Times New Roman" w:cs="Times New Roman"/>
-          <w:kern w:val="0"/>
-          <w:lang w:val="en-GB" w:eastAsia="fr-FR"/>
-          <w14:ligatures w14:val="none"/>
-        </w:rPr>
-      </w:pPr>
-      <w:r>
-        <w:rPr>
-          <w:rFonts w:ascii="Times New Roman" w:eastAsia="Times New Roman" w:hAnsi="Times New Roman" w:cs="Times New Roman"/>
-          <w:kern w:val="0"/>
-          <w:lang w:val="en-GB" w:eastAsia="fr-FR"/>
-          <w14:ligatures w14:val="none"/>
-        </w:rPr>
-        <w:t xml:space="preserve">    let temp_c = decimal 25</w:t>
-      </w:r>
-    </w:p>
-    <w:p>
-      <w:pPr>
-        <w:pBdr>
-          <w:top w:val="single" w:sz="4" w:space="1" w:color="auto"/>
-          <w:left w:val="single" w:sz="4" w:space="4" w:color="auto"/>
-          <w:bottom w:val="single" w:sz="4" w:space="1" w:color="auto"/>
-          <w:right w:val="single" w:sz="4" w:space="4" w:color="auto"/>
-        </w:pBdr>
-        <w:spacing w:before="100" w:beforeAutospacing="1" w:after="100" w:afterAutospacing="1" w:line="240" w:lineRule="auto"/>
-        <w:rPr>
-          <w:rFonts w:ascii="Times New Roman" w:eastAsia="Times New Roman" w:hAnsi="Times New Roman" w:cs="Times New Roman"/>
-          <w:kern w:val="0"/>
-          <w:lang w:val="en-GB" w:eastAsia="fr-FR"/>
-          <w14:ligatures w14:val="none"/>
-        </w:rPr>
-      </w:pPr>
-    </w:p>
-    <w:p>
-      <w:pPr>
-        <w:pBdr>
-          <w:top w:val="single" w:sz="4" w:space="1" w:color="auto"/>
-          <w:left w:val="single" w:sz="4" w:space="4" w:color="auto"/>
-          <w:bottom w:val="single" w:sz="4" w:space="1" w:color="auto"/>
-          <w:right w:val="single" w:sz="4" w:space="4" w:color="auto"/>
-        </w:pBdr>
-        <w:spacing w:before="100" w:beforeAutospacing="1" w:after="100" w:afterAutospacing="1" w:line="240" w:lineRule="auto"/>
-        <w:rPr>
-          <w:rFonts w:ascii="Times New Roman" w:eastAsia="Times New Roman" w:hAnsi="Times New Roman" w:cs="Times New Roman"/>
-          <w:kern w:val="0"/>
-          <w:lang w:val="en-GB" w:eastAsia="fr-FR"/>
-          <w14:ligatures w14:val="none"/>
-        </w:rPr>
-      </w:pPr>
-      <w:r>
-        <w:rPr>
-          <w:rFonts w:ascii="Times New Roman" w:eastAsia="Times New Roman" w:hAnsi="Times New Roman" w:cs="Times New Roman"/>
-          <w:kern w:val="0"/>
-          <w:lang w:val="en-GB" w:eastAsia="fr-FR"/>
-          <w14:ligatures w14:val="none"/>
-        </w:rPr>
-        <w:t xml:space="preserve">    // Conversion</w:t>
-      </w:r>
-    </w:p>
-    <w:p>
-      <w:pPr>
-        <w:pBdr>
-          <w:top w:val="single" w:sz="4" w:space="1" w:color="auto"/>
-          <w:left w:val="single" w:sz="4" w:space="4" w:color="auto"/>
-          <w:bottom w:val="single" w:sz="4" w:space="1" w:color="auto"/>
-          <w:right w:val="single" w:sz="4" w:space="4" w:color="auto"/>
-        </w:pBdr>
-        <w:spacing w:before="100" w:beforeAutospacing="1" w:after="100" w:afterAutospacing="1" w:line="240" w:lineRule="auto"/>
-        <w:rPr>
-          <w:rFonts w:ascii="Times New Roman" w:eastAsia="Times New Roman" w:hAnsi="Times New Roman" w:cs="Times New Roman"/>
-          <w:kern w:val="0"/>
-          <w:lang w:val="en-GB" w:eastAsia="fr-FR"/>
-          <w14:ligatures w14:val="none"/>
-        </w:rPr>
-      </w:pPr>
-      <w:r>
-        <w:rPr>
-          <w:rFonts w:ascii="Times New Roman" w:eastAsia="Times New Roman" w:hAnsi="Times New Roman" w:cs="Times New Roman"/>
-          <w:kern w:val="0"/>
-          <w:lang w:val="en-GB" w:eastAsia="fr-FR"/>
-          <w14:ligatures w14:val="none"/>
-        </w:rPr>
-        <w:lastRenderedPageBreak/>
-        <w:t xml:space="preserve">    let temp_f = celsius_to_fahrenheit(temp_c)</w:t>
-      </w:r>
-    </w:p>
-    <w:p>
-      <w:pPr>
-        <w:pBdr>
-          <w:top w:val="single" w:sz="4" w:space="1" w:color="auto"/>
-          <w:left w:val="single" w:sz="4" w:space="4" w:color="auto"/>
-          <w:bottom w:val="single" w:sz="4" w:space="1" w:color="auto"/>
-          <w:right w:val="single" w:sz="4" w:space="4" w:color="auto"/>
-        </w:pBdr>
-        <w:spacing w:before="100" w:beforeAutospacing="1" w:after="100" w:afterAutospacing="1" w:line="240" w:lineRule="auto"/>
-        <w:rPr>
-          <w:rFonts w:ascii="Times New Roman" w:eastAsia="Times New Roman" w:hAnsi="Times New Roman" w:cs="Times New Roman"/>
-          <w:kern w:val="0"/>
-          <w:lang w:val="en-GB" w:eastAsia="fr-FR"/>
-          <w14:ligatures w14:val="none"/>
-        </w:rPr>
-      </w:pPr>
-    </w:p>
-    <w:p>
-      <w:pPr>
-        <w:pBdr>
-          <w:top w:val="single" w:sz="4" w:space="1" w:color="auto"/>
-          <w:left w:val="single" w:sz="4" w:space="4" w:color="auto"/>
-          <w:bottom w:val="single" w:sz="4" w:space="1" w:color="auto"/>
-          <w:right w:val="single" w:sz="4" w:space="4" w:color="auto"/>
-        </w:pBdr>
-        <w:spacing w:before="100" w:beforeAutospacing="1" w:after="100" w:afterAutospacing="1" w:line="240" w:lineRule="auto"/>
-        <w:rPr>
-          <w:rFonts w:ascii="Times New Roman" w:eastAsia="Times New Roman" w:hAnsi="Times New Roman" w:cs="Times New Roman"/>
-          <w:kern w:val="0"/>
-          <w:lang w:eastAsia="fr-FR"/>
-          <w14:ligatures w14:val="none"/>
-        </w:rPr>
-      </w:pPr>
-      <w:r>
-        <w:rPr>
-          <w:rFonts w:ascii="Times New Roman" w:eastAsia="Times New Roman" w:hAnsi="Times New Roman" w:cs="Times New Roman"/>
-          <w:kern w:val="0"/>
-          <w:lang w:val="en-GB" w:eastAsia="fr-FR"/>
-          <w14:ligatures w14:val="none"/>
-        </w:rPr>
-        <w:t xml:space="preserve">    </w:t>
-      </w:r>
-      <w:r>
-        <w:rPr>
-          <w:rFonts w:ascii="Times New Roman" w:eastAsia="Times New Roman" w:hAnsi="Times New Roman" w:cs="Times New Roman"/>
-          <w:kern w:val="0"/>
-          <w:lang w:eastAsia="fr-FR"/>
-          <w14:ligatures w14:val="none"/>
-        </w:rPr>
-        <w:t>// Affichage du résultat</w:t>
-      </w:r>
-    </w:p>
-    <w:p>
-      <w:pPr>
-        <w:pBdr>
-          <w:top w:val="single" w:sz="4" w:space="1" w:color="auto"/>
-          <w:left w:val="single" w:sz="4" w:space="4" w:color="auto"/>
-          <w:bottom w:val="single" w:sz="4" w:space="1" w:color="auto"/>
-          <w:right w:val="single" w:sz="4" w:space="4" w:color="auto"/>
-        </w:pBdr>
-        <w:spacing w:before="100" w:beforeAutospacing="1" w:after="100" w:afterAutospacing="1" w:line="240" w:lineRule="auto"/>
-        <w:rPr>
-          <w:rFonts w:ascii="Times New Roman" w:eastAsia="Times New Roman" w:hAnsi="Times New Roman" w:cs="Times New Roman"/>
-          <w:kern w:val="0"/>
-          <w:lang w:eastAsia="fr-FR"/>
-          <w14:ligatures w14:val="none"/>
-        </w:rPr>
-      </w:pPr>
-      <w:r>
-        <w:rPr>
-          <w:rFonts w:ascii="Times New Roman" w:eastAsia="Times New Roman" w:hAnsi="Times New Roman" w:cs="Times New Roman"/>
-          <w:kern w:val="0"/>
-          <w:lang w:eastAsia="fr-FR"/>
-          <w14:ligatures w14:val="none"/>
-        </w:rPr>
-        <w:t xml:space="preserve">    print(string/concat("25°C = ", string(temp_f), "°F"))</w:t>
-      </w:r>
-    </w:p>
-    <w:p>
-      <w:pPr>
-        <w:pBdr>
-          <w:top w:val="single" w:sz="4" w:space="1" w:color="auto"/>
-          <w:left w:val="single" w:sz="4" w:space="4" w:color="auto"/>
-          <w:bottom w:val="single" w:sz="4" w:space="1" w:color="auto"/>
-          <w:right w:val="single" w:sz="4" w:space="4" w:color="auto"/>
-        </w:pBdr>
-        <w:spacing w:before="100" w:beforeAutospacing="1" w:after="100" w:afterAutospacing="1" w:line="240" w:lineRule="auto"/>
-        <w:rPr>
-          <w:rFonts w:ascii="Times New Roman" w:eastAsia="Times New Roman" w:hAnsi="Times New Roman" w:cs="Times New Roman"/>
-          <w:kern w:val="0"/>
           <w:lang w:eastAsia="fr-FR"/>
           <w14:ligatures w14:val="none"/>
         </w:rPr>
@@ -3123,7 +3408,7 @@
           <w:lang w:eastAsia="fr-FR"/>
           <w14:ligatures w14:val="none"/>
         </w:rPr>
-        <w:t>// Vérifie si un mot de passe est valide selon trois règles :</w:t>
+        <w:t>// Vérifie si un mot de passe respecte les critères de sécurité</w:t>
       </w:r>
     </w:p>
     <w:p>
@@ -3138,18 +3423,49 @@
         <w:rPr>
           <w:rFonts w:ascii="Times New Roman" w:eastAsia="Times New Roman" w:hAnsi="Times New Roman" w:cs="Times New Roman"/>
           <w:kern w:val="0"/>
-          <w:lang w:eastAsia="fr-FR"/>
-          <w14:ligatures w14:val="none"/>
-        </w:rPr>
-      </w:pPr>
-      <w:r>
-        <w:rPr>
-          <w:rFonts w:ascii="Times New Roman" w:eastAsia="Times New Roman" w:hAnsi="Times New Roman" w:cs="Times New Roman"/>
-          <w:kern w:val="0"/>
-          <w:lang w:eastAsia="fr-FR"/>
-          <w14:ligatures w14:val="none"/>
-        </w:rPr>
-        <w:t>// 1. Longueur minimale de 8 caractères</w:t>
+          <w:lang w:val="en-GB" w:eastAsia="fr-FR"/>
+          <w14:ligatures w14:val="none"/>
+        </w:rPr>
+      </w:pPr>
+      <w:proofErr w:type="spellStart"/>
+      <w:r>
+        <w:rPr>
+          <w:rFonts w:ascii="Times New Roman" w:eastAsia="Times New Roman" w:hAnsi="Times New Roman" w:cs="Times New Roman"/>
+          <w:kern w:val="0"/>
+          <w:lang w:val="en-GB" w:eastAsia="fr-FR"/>
+          <w14:ligatures w14:val="none"/>
+        </w:rPr>
+        <w:t>validate_password</w:t>
+      </w:r>
+      <w:proofErr w:type="spellEnd"/>
+      <w:r>
+        <w:rPr>
+          <w:rFonts w:ascii="Times New Roman" w:eastAsia="Times New Roman" w:hAnsi="Times New Roman" w:cs="Times New Roman"/>
+          <w:kern w:val="0"/>
+          <w:lang w:val="en-GB" w:eastAsia="fr-FR"/>
+          <w14:ligatures w14:val="none"/>
+        </w:rPr>
+        <w:t xml:space="preserve">: </w:t>
+      </w:r>
+      <w:proofErr w:type="spellStart"/>
+      <w:r>
+        <w:rPr>
+          <w:rFonts w:ascii="Times New Roman" w:eastAsia="Times New Roman" w:hAnsi="Times New Roman" w:cs="Times New Roman"/>
+          <w:kern w:val="0"/>
+          <w:lang w:val="en-GB" w:eastAsia="fr-FR"/>
+          <w14:ligatures w14:val="none"/>
+        </w:rPr>
+        <w:t>fn</w:t>
+      </w:r>
+      <w:proofErr w:type="spellEnd"/>
+      <w:r>
+        <w:rPr>
+          <w:rFonts w:ascii="Times New Roman" w:eastAsia="Times New Roman" w:hAnsi="Times New Roman" w:cs="Times New Roman"/>
+          <w:kern w:val="0"/>
+          <w:lang w:val="en-GB" w:eastAsia="fr-FR"/>
+          <w14:ligatures w14:val="none"/>
+        </w:rPr>
+        <w:t>(password: string) -&gt; bool {</w:t>
       </w:r>
     </w:p>
     <w:p>
@@ -3164,19 +3480,50 @@
         <w:rPr>
           <w:rFonts w:ascii="Times New Roman" w:eastAsia="Times New Roman" w:hAnsi="Times New Roman" w:cs="Times New Roman"/>
           <w:kern w:val="0"/>
-          <w:lang w:eastAsia="fr-FR"/>
-          <w14:ligatures w14:val="none"/>
-        </w:rPr>
-      </w:pPr>
-      <w:r>
-        <w:rPr>
-          <w:rFonts w:ascii="Times New Roman" w:eastAsia="Times New Roman" w:hAnsi="Times New Roman" w:cs="Times New Roman"/>
-          <w:kern w:val="0"/>
-          <w:lang w:eastAsia="fr-FR"/>
-          <w14:ligatures w14:val="none"/>
-        </w:rPr>
-        <w:t>// 2. Doit contenir au moins un chiffre</w:t>
-      </w:r>
+          <w:lang w:val="en-GB" w:eastAsia="fr-FR"/>
+          <w14:ligatures w14:val="none"/>
+        </w:rPr>
+      </w:pPr>
+      <w:r>
+        <w:rPr>
+          <w:rFonts w:ascii="Times New Roman" w:eastAsia="Times New Roman" w:hAnsi="Times New Roman" w:cs="Times New Roman"/>
+          <w:kern w:val="0"/>
+          <w:lang w:val="en-GB" w:eastAsia="fr-FR"/>
+          <w14:ligatures w14:val="none"/>
+        </w:rPr>
+        <w:t xml:space="preserve">    // </w:t>
+      </w:r>
+      <w:proofErr w:type="spellStart"/>
+      <w:r>
+        <w:rPr>
+          <w:rFonts w:ascii="Times New Roman" w:eastAsia="Times New Roman" w:hAnsi="Times New Roman" w:cs="Times New Roman"/>
+          <w:kern w:val="0"/>
+          <w:lang w:val="en-GB" w:eastAsia="fr-FR"/>
+          <w14:ligatures w14:val="none"/>
+        </w:rPr>
+        <w:t>Règle</w:t>
+      </w:r>
+      <w:proofErr w:type="spellEnd"/>
+      <w:r>
+        <w:rPr>
+          <w:rFonts w:ascii="Times New Roman" w:eastAsia="Times New Roman" w:hAnsi="Times New Roman" w:cs="Times New Roman"/>
+          <w:kern w:val="0"/>
+          <w:lang w:val="en-GB" w:eastAsia="fr-FR"/>
+          <w14:ligatures w14:val="none"/>
+        </w:rPr>
+        <w:t xml:space="preserve"> 1 : Longueur </w:t>
+      </w:r>
+      <w:proofErr w:type="spellStart"/>
+      <w:r>
+        <w:rPr>
+          <w:rFonts w:ascii="Times New Roman" w:eastAsia="Times New Roman" w:hAnsi="Times New Roman" w:cs="Times New Roman"/>
+          <w:kern w:val="0"/>
+          <w:lang w:val="en-GB" w:eastAsia="fr-FR"/>
+          <w14:ligatures w14:val="none"/>
+        </w:rPr>
+        <w:t>minimale</w:t>
+      </w:r>
+      <w:proofErr w:type="spellEnd"/>
     </w:p>
     <w:p>
       <w:pPr>
@@ -3190,18 +3537,58 @@
         <w:rPr>
           <w:rFonts w:ascii="Times New Roman" w:eastAsia="Times New Roman" w:hAnsi="Times New Roman" w:cs="Times New Roman"/>
           <w:kern w:val="0"/>
-          <w:lang w:eastAsia="fr-FR"/>
-          <w14:ligatures w14:val="none"/>
-        </w:rPr>
-      </w:pPr>
-      <w:r>
-        <w:rPr>
-          <w:rFonts w:ascii="Times New Roman" w:eastAsia="Times New Roman" w:hAnsi="Times New Roman" w:cs="Times New Roman"/>
-          <w:kern w:val="0"/>
-          <w:lang w:eastAsia="fr-FR"/>
-          <w14:ligatures w14:val="none"/>
-        </w:rPr>
-        <w:t>// 3. Doit contenir au moins une majuscule</w:t>
+          <w:lang w:val="en-GB" w:eastAsia="fr-FR"/>
+          <w14:ligatures w14:val="none"/>
+        </w:rPr>
+      </w:pPr>
+      <w:r>
+        <w:rPr>
+          <w:rFonts w:ascii="Times New Roman" w:eastAsia="Times New Roman" w:hAnsi="Times New Roman" w:cs="Times New Roman"/>
+          <w:kern w:val="0"/>
+          <w:lang w:val="en-GB" w:eastAsia="fr-FR"/>
+          <w14:ligatures w14:val="none"/>
+        </w:rPr>
+        <w:t xml:space="preserve">    </w:t>
+      </w:r>
+      <w:proofErr w:type="spellStart"/>
+      <w:r>
+        <w:rPr>
+          <w:rFonts w:ascii="Times New Roman" w:eastAsia="Times New Roman" w:hAnsi="Times New Roman" w:cs="Times New Roman"/>
+          <w:kern w:val="0"/>
+          <w:lang w:val="en-GB" w:eastAsia="fr-FR"/>
+          <w14:ligatures w14:val="none"/>
+        </w:rPr>
+        <w:t>is_long_enough</w:t>
+      </w:r>
+      <w:proofErr w:type="spellEnd"/>
+      <w:r>
+        <w:rPr>
+          <w:rFonts w:ascii="Times New Roman" w:eastAsia="Times New Roman" w:hAnsi="Times New Roman" w:cs="Times New Roman"/>
+          <w:kern w:val="0"/>
+          <w:lang w:val="en-GB" w:eastAsia="fr-FR"/>
+          <w14:ligatures w14:val="none"/>
+        </w:rPr>
+        <w:t xml:space="preserve">: bool = </w:t>
+      </w:r>
+      <w:proofErr w:type="spellStart"/>
+      <w:r>
+        <w:rPr>
+          <w:rFonts w:ascii="Times New Roman" w:eastAsia="Times New Roman" w:hAnsi="Times New Roman" w:cs="Times New Roman"/>
+          <w:kern w:val="0"/>
+          <w:lang w:val="en-GB" w:eastAsia="fr-FR"/>
+          <w14:ligatures w14:val="none"/>
+        </w:rPr>
+        <w:t>string.length</w:t>
+      </w:r>
+      <w:proofErr w:type="spellEnd"/>
+      <w:r>
+        <w:rPr>
+          <w:rFonts w:ascii="Times New Roman" w:eastAsia="Times New Roman" w:hAnsi="Times New Roman" w:cs="Times New Roman"/>
+          <w:kern w:val="0"/>
+          <w:lang w:val="en-GB" w:eastAsia="fr-FR"/>
+          <w14:ligatures w14:val="none"/>
+        </w:rPr>
+        <w:t>(password) &gt;= 8</w:t>
       </w:r>
     </w:p>
     <w:p>
@@ -3220,15 +3607,6 @@
           <w14:ligatures w14:val="none"/>
         </w:rPr>
       </w:pPr>
-      <w:r>
-        <w:rPr>
-          <w:rFonts w:ascii="Times New Roman" w:eastAsia="Times New Roman" w:hAnsi="Times New Roman" w:cs="Times New Roman"/>
-          <w:kern w:val="0"/>
-          <w:lang w:val="en-GB" w:eastAsia="fr-FR"/>
-          <w14:ligatures w14:val="none"/>
-        </w:rPr>
-        <w:t>validate_password: fn(password: string) -&gt; bool {</w:t>
-      </w:r>
     </w:p>
     <w:p>
       <w:pPr>
@@ -3242,10 +3620,28 @@
         <w:rPr>
           <w:rFonts w:ascii="Times New Roman" w:eastAsia="Times New Roman" w:hAnsi="Times New Roman" w:cs="Times New Roman"/>
           <w:kern w:val="0"/>
-          <w:lang w:val="en-GB" w:eastAsia="fr-FR"/>
-          <w14:ligatures w14:val="none"/>
-        </w:rPr>
-      </w:pPr>
+          <w:lang w:eastAsia="fr-FR"/>
+          <w14:ligatures w14:val="none"/>
+        </w:rPr>
+      </w:pPr>
+      <w:r>
+        <w:rPr>
+          <w:rFonts w:ascii="Times New Roman" w:eastAsia="Times New Roman" w:hAnsi="Times New Roman" w:cs="Times New Roman"/>
+          <w:kern w:val="0"/>
+          <w:lang w:val="en-GB" w:eastAsia="fr-FR"/>
+          <w14:ligatures w14:val="none"/>
+        </w:rPr>
+        <w:t xml:space="preserve">    </w:t>
+      </w:r>
+      <w:r>
+        <w:rPr>
+          <w:rFonts w:ascii="Times New Roman" w:eastAsia="Times New Roman" w:hAnsi="Times New Roman" w:cs="Times New Roman"/>
+          <w:kern w:val="0"/>
+          <w:lang w:eastAsia="fr-FR"/>
+          <w14:ligatures w14:val="none"/>
+        </w:rPr>
+        <w:t>// Règle 2 : Recherche de chiffres (Version narrative)</w:t>
+      </w:r>
     </w:p>
     <w:p>
       <w:pPr>
@@ -3259,18 +3655,38 @@
         <w:rPr>
           <w:rFonts w:ascii="Times New Roman" w:eastAsia="Times New Roman" w:hAnsi="Times New Roman" w:cs="Times New Roman"/>
           <w:kern w:val="0"/>
-          <w:lang w:val="en-GB" w:eastAsia="fr-FR"/>
-          <w14:ligatures w14:val="none"/>
-        </w:rPr>
-      </w:pPr>
-      <w:r>
-        <w:rPr>
-          <w:rFonts w:ascii="Times New Roman" w:eastAsia="Times New Roman" w:hAnsi="Times New Roman" w:cs="Times New Roman"/>
-          <w:kern w:val="0"/>
-          <w:lang w:val="en-GB" w:eastAsia="fr-FR"/>
-          <w14:ligatures w14:val="none"/>
-        </w:rPr>
-        <w:t xml:space="preserve">    // Règle 1 : longueur minimale</w:t>
+          <w:lang w:eastAsia="fr-FR"/>
+          <w14:ligatures w14:val="none"/>
+        </w:rPr>
+      </w:pPr>
+      <w:r>
+        <w:rPr>
+          <w:rFonts w:ascii="Times New Roman" w:eastAsia="Times New Roman" w:hAnsi="Times New Roman" w:cs="Times New Roman"/>
+          <w:kern w:val="0"/>
+          <w:lang w:eastAsia="fr-FR"/>
+          <w14:ligatures w14:val="none"/>
+        </w:rPr>
+        <w:t xml:space="preserve">    // On utilise mut car 'i' et '</w:t>
+      </w:r>
+      <w:proofErr w:type="spellStart"/>
+      <w:r>
+        <w:rPr>
+          <w:rFonts w:ascii="Times New Roman" w:eastAsia="Times New Roman" w:hAnsi="Times New Roman" w:cs="Times New Roman"/>
+          <w:kern w:val="0"/>
+          <w:lang w:eastAsia="fr-FR"/>
+          <w14:ligatures w14:val="none"/>
+        </w:rPr>
+        <w:t>found</w:t>
+      </w:r>
+      <w:proofErr w:type="spellEnd"/>
+      <w:r>
+        <w:rPr>
+          <w:rFonts w:ascii="Times New Roman" w:eastAsia="Times New Roman" w:hAnsi="Times New Roman" w:cs="Times New Roman"/>
+          <w:kern w:val="0"/>
+          <w:lang w:eastAsia="fr-FR"/>
+          <w14:ligatures w14:val="none"/>
+        </w:rPr>
+        <w:t>' vont évoluer</w:t>
       </w:r>
     </w:p>
     <w:p>
@@ -3293,10 +3709,39 @@
         <w:rPr>
           <w:rFonts w:ascii="Times New Roman" w:eastAsia="Times New Roman" w:hAnsi="Times New Roman" w:cs="Times New Roman"/>
           <w:kern w:val="0"/>
-          <w:lang w:val="en-GB" w:eastAsia="fr-FR"/>
-          <w14:ligatures w14:val="none"/>
-        </w:rPr>
-        <w:t xml:space="preserve">    let length = string/length(password)</w:t>
+          <w:lang w:eastAsia="fr-FR"/>
+          <w14:ligatures w14:val="none"/>
+        </w:rPr>
+        <w:t xml:space="preserve">    </w:t>
+      </w:r>
+      <w:r>
+        <w:rPr>
+          <w:rFonts w:ascii="Times New Roman" w:eastAsia="Times New Roman" w:hAnsi="Times New Roman" w:cs="Times New Roman"/>
+          <w:kern w:val="0"/>
+          <w:lang w:val="en-GB" w:eastAsia="fr-FR"/>
+          <w14:ligatures w14:val="none"/>
+        </w:rPr>
+        <w:t xml:space="preserve">mut </w:t>
+      </w:r>
+      <w:proofErr w:type="spellStart"/>
+      <w:r>
+        <w:rPr>
+          <w:rFonts w:ascii="Times New Roman" w:eastAsia="Times New Roman" w:hAnsi="Times New Roman" w:cs="Times New Roman"/>
+          <w:kern w:val="0"/>
+          <w:lang w:val="en-GB" w:eastAsia="fr-FR"/>
+          <w14:ligatures w14:val="none"/>
+        </w:rPr>
+        <w:t>has_digit</w:t>
+      </w:r>
+      <w:proofErr w:type="spellEnd"/>
+      <w:r>
+        <w:rPr>
+          <w:rFonts w:ascii="Times New Roman" w:eastAsia="Times New Roman" w:hAnsi="Times New Roman" w:cs="Times New Roman"/>
+          <w:kern w:val="0"/>
+          <w:lang w:val="en-GB" w:eastAsia="fr-FR"/>
+          <w14:ligatures w14:val="none"/>
+        </w:rPr>
+        <w:t>: bool = false</w:t>
       </w:r>
     </w:p>
     <w:p>
@@ -3322,7 +3767,7 @@
           <w:lang w:val="en-GB" w:eastAsia="fr-FR"/>
           <w14:ligatures w14:val="none"/>
         </w:rPr>
-        <w:t xml:space="preserve">    if math/less(length, int 8) {</w:t>
+        <w:t xml:space="preserve">    mut i: int = 0</w:t>
       </w:r>
     </w:p>
     <w:p>
@@ -3337,27 +3782,38 @@
         <w:rPr>
           <w:rFonts w:ascii="Times New Roman" w:eastAsia="Times New Roman" w:hAnsi="Times New Roman" w:cs="Times New Roman"/>
           <w:kern w:val="0"/>
-          <w:lang w:eastAsia="fr-FR"/>
-          <w14:ligatures w14:val="none"/>
-        </w:rPr>
-      </w:pPr>
-      <w:r>
-        <w:rPr>
-          <w:rFonts w:ascii="Times New Roman" w:eastAsia="Times New Roman" w:hAnsi="Times New Roman" w:cs="Times New Roman"/>
-          <w:kern w:val="0"/>
-          <w:lang w:val="en-GB" w:eastAsia="fr-FR"/>
-          <w14:ligatures w14:val="none"/>
-        </w:rPr>
-        <w:t xml:space="preserve">        </w:t>
-      </w:r>
-      <w:r>
-        <w:rPr>
-          <w:rFonts w:ascii="Times New Roman" w:eastAsia="Times New Roman" w:hAnsi="Times New Roman" w:cs="Times New Roman"/>
-          <w:kern w:val="0"/>
-          <w:lang w:eastAsia="fr-FR"/>
-          <w14:ligatures w14:val="none"/>
-        </w:rPr>
-        <w:t>return false</w:t>
+          <w:lang w:val="en-GB" w:eastAsia="fr-FR"/>
+          <w14:ligatures w14:val="none"/>
+        </w:rPr>
+      </w:pPr>
+      <w:r>
+        <w:rPr>
+          <w:rFonts w:ascii="Times New Roman" w:eastAsia="Times New Roman" w:hAnsi="Times New Roman" w:cs="Times New Roman"/>
+          <w:kern w:val="0"/>
+          <w:lang w:val="en-GB" w:eastAsia="fr-FR"/>
+          <w14:ligatures w14:val="none"/>
+        </w:rPr>
+        <w:t xml:space="preserve">    limit: int = </w:t>
+      </w:r>
+      <w:proofErr w:type="spellStart"/>
+      <w:r>
+        <w:rPr>
+          <w:rFonts w:ascii="Times New Roman" w:eastAsia="Times New Roman" w:hAnsi="Times New Roman" w:cs="Times New Roman"/>
+          <w:kern w:val="0"/>
+          <w:lang w:val="en-GB" w:eastAsia="fr-FR"/>
+          <w14:ligatures w14:val="none"/>
+        </w:rPr>
+        <w:t>string.length</w:t>
+      </w:r>
+      <w:proofErr w:type="spellEnd"/>
+      <w:r>
+        <w:rPr>
+          <w:rFonts w:ascii="Times New Roman" w:eastAsia="Times New Roman" w:hAnsi="Times New Roman" w:cs="Times New Roman"/>
+          <w:kern w:val="0"/>
+          <w:lang w:val="en-GB" w:eastAsia="fr-FR"/>
+          <w14:ligatures w14:val="none"/>
+        </w:rPr>
+        <w:t>(password)</w:t>
       </w:r>
     </w:p>
     <w:p>
@@ -3372,19 +3828,10 @@
         <w:rPr>
           <w:rFonts w:ascii="Times New Roman" w:eastAsia="Times New Roman" w:hAnsi="Times New Roman" w:cs="Times New Roman"/>
           <w:kern w:val="0"/>
-          <w:lang w:eastAsia="fr-FR"/>
-          <w14:ligatures w14:val="none"/>
-        </w:rPr>
-      </w:pPr>
-      <w:r>
-        <w:rPr>
-          <w:rFonts w:ascii="Times New Roman" w:eastAsia="Times New Roman" w:hAnsi="Times New Roman" w:cs="Times New Roman"/>
-          <w:kern w:val="0"/>
-          <w:lang w:eastAsia="fr-FR"/>
-          <w14:ligatures w14:val="none"/>
-        </w:rPr>
-        <w:t xml:space="preserve">    }</w:t>
-      </w:r>
+          <w:lang w:val="en-GB" w:eastAsia="fr-FR"/>
+          <w14:ligatures w14:val="none"/>
+        </w:rPr>
+      </w:pPr>
     </w:p>
     <w:p>
       <w:pPr>
@@ -3398,10 +3845,59 @@
         <w:rPr>
           <w:rFonts w:ascii="Times New Roman" w:eastAsia="Times New Roman" w:hAnsi="Times New Roman" w:cs="Times New Roman"/>
           <w:kern w:val="0"/>
-          <w:lang w:eastAsia="fr-FR"/>
-          <w14:ligatures w14:val="none"/>
-        </w:rPr>
-      </w:pPr>
+          <w:lang w:val="en-GB" w:eastAsia="fr-FR"/>
+          <w14:ligatures w14:val="none"/>
+        </w:rPr>
+      </w:pPr>
+      <w:r>
+        <w:rPr>
+          <w:rFonts w:ascii="Times New Roman" w:eastAsia="Times New Roman" w:hAnsi="Times New Roman" w:cs="Times New Roman"/>
+          <w:kern w:val="0"/>
+          <w:lang w:val="en-GB" w:eastAsia="fr-FR"/>
+          <w14:ligatures w14:val="none"/>
+        </w:rPr>
+        <w:t xml:space="preserve">    while (</w:t>
+      </w:r>
+      <w:proofErr w:type="spellStart"/>
+      <w:r>
+        <w:rPr>
+          <w:rFonts w:ascii="Times New Roman" w:eastAsia="Times New Roman" w:hAnsi="Times New Roman" w:cs="Times New Roman"/>
+          <w:kern w:val="0"/>
+          <w:lang w:val="en-GB" w:eastAsia="fr-FR"/>
+          <w14:ligatures w14:val="none"/>
+        </w:rPr>
+        <w:t>i</w:t>
+      </w:r>
+      <w:proofErr w:type="spellEnd"/>
+      <w:r>
+        <w:rPr>
+          <w:rFonts w:ascii="Times New Roman" w:eastAsia="Times New Roman" w:hAnsi="Times New Roman" w:cs="Times New Roman"/>
+          <w:kern w:val="0"/>
+          <w:lang w:val="en-GB" w:eastAsia="fr-FR"/>
+          <w14:ligatures w14:val="none"/>
+        </w:rPr>
+        <w:t xml:space="preserve"> &lt; limit) and (not </w:t>
+      </w:r>
+      <w:proofErr w:type="spellStart"/>
+      <w:r>
+        <w:rPr>
+          <w:rFonts w:ascii="Times New Roman" w:eastAsia="Times New Roman" w:hAnsi="Times New Roman" w:cs="Times New Roman"/>
+          <w:kern w:val="0"/>
+          <w:lang w:val="en-GB" w:eastAsia="fr-FR"/>
+          <w14:ligatures w14:val="none"/>
+        </w:rPr>
+        <w:t>has_digit</w:t>
+      </w:r>
+      <w:proofErr w:type="spellEnd"/>
+      <w:r>
+        <w:rPr>
+          <w:rFonts w:ascii="Times New Roman" w:eastAsia="Times New Roman" w:hAnsi="Times New Roman" w:cs="Times New Roman"/>
+          <w:kern w:val="0"/>
+          <w:lang w:val="en-GB" w:eastAsia="fr-FR"/>
+          <w14:ligatures w14:val="none"/>
+        </w:rPr>
+        <w:t>) {</w:t>
+      </w:r>
     </w:p>
     <w:p>
       <w:pPr>
@@ -3415,18 +3911,78 @@
         <w:rPr>
           <w:rFonts w:ascii="Times New Roman" w:eastAsia="Times New Roman" w:hAnsi="Times New Roman" w:cs="Times New Roman"/>
           <w:kern w:val="0"/>
-          <w:lang w:eastAsia="fr-FR"/>
-          <w14:ligatures w14:val="none"/>
-        </w:rPr>
-      </w:pPr>
-      <w:r>
-        <w:rPr>
-          <w:rFonts w:ascii="Times New Roman" w:eastAsia="Times New Roman" w:hAnsi="Times New Roman" w:cs="Times New Roman"/>
-          <w:kern w:val="0"/>
-          <w:lang w:eastAsia="fr-FR"/>
-          <w14:ligatures w14:val="none"/>
-        </w:rPr>
-        <w:t xml:space="preserve">    // Règle 2 : contient un chiffre ?</w:t>
+          <w:lang w:val="en-GB" w:eastAsia="fr-FR"/>
+          <w14:ligatures w14:val="none"/>
+        </w:rPr>
+      </w:pPr>
+      <w:r>
+        <w:rPr>
+          <w:rFonts w:ascii="Times New Roman" w:eastAsia="Times New Roman" w:hAnsi="Times New Roman" w:cs="Times New Roman"/>
+          <w:kern w:val="0"/>
+          <w:lang w:val="en-GB" w:eastAsia="fr-FR"/>
+          <w14:ligatures w14:val="none"/>
+        </w:rPr>
+        <w:t xml:space="preserve">        </w:t>
+      </w:r>
+      <w:proofErr w:type="spellStart"/>
+      <w:r>
+        <w:rPr>
+          <w:rFonts w:ascii="Times New Roman" w:eastAsia="Times New Roman" w:hAnsi="Times New Roman" w:cs="Times New Roman"/>
+          <w:kern w:val="0"/>
+          <w:lang w:val="en-GB" w:eastAsia="fr-FR"/>
+          <w14:ligatures w14:val="none"/>
+        </w:rPr>
+        <w:t>char</w:t>
+      </w:r>
+      <w:proofErr w:type="spellEnd"/>
+      <w:r>
+        <w:rPr>
+          <w:rFonts w:ascii="Times New Roman" w:eastAsia="Times New Roman" w:hAnsi="Times New Roman" w:cs="Times New Roman"/>
+          <w:kern w:val="0"/>
+          <w:lang w:val="en-GB" w:eastAsia="fr-FR"/>
+          <w14:ligatures w14:val="none"/>
+        </w:rPr>
+        <w:t xml:space="preserve">: string = </w:t>
+      </w:r>
+      <w:proofErr w:type="spellStart"/>
+      <w:r>
+        <w:rPr>
+          <w:rFonts w:ascii="Times New Roman" w:eastAsia="Times New Roman" w:hAnsi="Times New Roman" w:cs="Times New Roman"/>
+          <w:kern w:val="0"/>
+          <w:lang w:val="en-GB" w:eastAsia="fr-FR"/>
+          <w14:ligatures w14:val="none"/>
+        </w:rPr>
+        <w:t>string.char_at</w:t>
+      </w:r>
+      <w:proofErr w:type="spellEnd"/>
+      <w:r>
+        <w:rPr>
+          <w:rFonts w:ascii="Times New Roman" w:eastAsia="Times New Roman" w:hAnsi="Times New Roman" w:cs="Times New Roman"/>
+          <w:kern w:val="0"/>
+          <w:lang w:val="en-GB" w:eastAsia="fr-FR"/>
+          <w14:ligatures w14:val="none"/>
+        </w:rPr>
+        <w:t xml:space="preserve">(password, </w:t>
+      </w:r>
+      <w:proofErr w:type="spellStart"/>
+      <w:r>
+        <w:rPr>
+          <w:rFonts w:ascii="Times New Roman" w:eastAsia="Times New Roman" w:hAnsi="Times New Roman" w:cs="Times New Roman"/>
+          <w:kern w:val="0"/>
+          <w:lang w:val="en-GB" w:eastAsia="fr-FR"/>
+          <w14:ligatures w14:val="none"/>
+        </w:rPr>
+        <w:t>i</w:t>
+      </w:r>
+      <w:proofErr w:type="spellEnd"/>
+      <w:r>
+        <w:rPr>
+          <w:rFonts w:ascii="Times New Roman" w:eastAsia="Times New Roman" w:hAnsi="Times New Roman" w:cs="Times New Roman"/>
+          <w:kern w:val="0"/>
+          <w:lang w:val="en-GB" w:eastAsia="fr-FR"/>
+          <w14:ligatures w14:val="none"/>
+        </w:rPr>
+        <w:t>)</w:t>
       </w:r>
     </w:p>
     <w:p>
@@ -3449,19 +4005,31 @@
         <w:rPr>
           <w:rFonts w:ascii="Times New Roman" w:eastAsia="Times New Roman" w:hAnsi="Times New Roman" w:cs="Times New Roman"/>
           <w:kern w:val="0"/>
-          <w:lang w:eastAsia="fr-FR"/>
-          <w14:ligatures w14:val="none"/>
-        </w:rPr>
-        <w:t xml:space="preserve">    </w:t>
-      </w:r>
-      <w:r>
-        <w:rPr>
-          <w:rFonts w:ascii="Times New Roman" w:eastAsia="Times New Roman" w:hAnsi="Times New Roman" w:cs="Times New Roman"/>
-          <w:kern w:val="0"/>
-          <w:lang w:val="en-GB" w:eastAsia="fr-FR"/>
-          <w14:ligatures w14:val="none"/>
-        </w:rPr>
-        <w:t>let has_digit = false</w:t>
+          <w:lang w:val="en-GB" w:eastAsia="fr-FR"/>
+          <w14:ligatures w14:val="none"/>
+        </w:rPr>
+        <w:lastRenderedPageBreak/>
+        <w:t xml:space="preserve">        if </w:t>
+      </w:r>
+      <w:proofErr w:type="spellStart"/>
+      <w:r>
+        <w:rPr>
+          <w:rFonts w:ascii="Times New Roman" w:eastAsia="Times New Roman" w:hAnsi="Times New Roman" w:cs="Times New Roman"/>
+          <w:kern w:val="0"/>
+          <w:lang w:val="en-GB" w:eastAsia="fr-FR"/>
+          <w14:ligatures w14:val="none"/>
+        </w:rPr>
+        <w:t>string.is_digit</w:t>
+      </w:r>
+      <w:proofErr w:type="spellEnd"/>
+      <w:r>
+        <w:rPr>
+          <w:rFonts w:ascii="Times New Roman" w:eastAsia="Times New Roman" w:hAnsi="Times New Roman" w:cs="Times New Roman"/>
+          <w:kern w:val="0"/>
+          <w:lang w:val="en-GB" w:eastAsia="fr-FR"/>
+          <w14:ligatures w14:val="none"/>
+        </w:rPr>
+        <w:t>(char) {</w:t>
       </w:r>
     </w:p>
     <w:p>
@@ -3487,7 +4055,27 @@
           <w:lang w:val="en-GB" w:eastAsia="fr-FR"/>
           <w14:ligatures w14:val="none"/>
         </w:rPr>
-        <w:t xml:space="preserve">    block {</w:t>
+        <w:t xml:space="preserve">            </w:t>
+      </w:r>
+      <w:proofErr w:type="spellStart"/>
+      <w:r>
+        <w:rPr>
+          <w:rFonts w:ascii="Times New Roman" w:eastAsia="Times New Roman" w:hAnsi="Times New Roman" w:cs="Times New Roman"/>
+          <w:kern w:val="0"/>
+          <w:lang w:val="en-GB" w:eastAsia="fr-FR"/>
+          <w14:ligatures w14:val="none"/>
+        </w:rPr>
+        <w:t>has_digit</w:t>
+      </w:r>
+      <w:proofErr w:type="spellEnd"/>
+      <w:r>
+        <w:rPr>
+          <w:rFonts w:ascii="Times New Roman" w:eastAsia="Times New Roman" w:hAnsi="Times New Roman" w:cs="Times New Roman"/>
+          <w:kern w:val="0"/>
+          <w:lang w:val="en-GB" w:eastAsia="fr-FR"/>
+          <w14:ligatures w14:val="none"/>
+        </w:rPr>
+        <w:t xml:space="preserve"> = true</w:t>
       </w:r>
     </w:p>
     <w:p>
@@ -3513,7 +4101,7 @@
           <w:lang w:val="en-GB" w:eastAsia="fr-FR"/>
           <w14:ligatures w14:val="none"/>
         </w:rPr>
-        <w:t xml:space="preserve">        let i = int 0</w:t>
+        <w:t xml:space="preserve">        }</w:t>
       </w:r>
     </w:p>
     <w:p>
@@ -3539,7 +4127,47 @@
           <w:lang w:val="en-GB" w:eastAsia="fr-FR"/>
           <w14:ligatures w14:val="none"/>
         </w:rPr>
-        <w:t xml:space="preserve">        let max = string/length(password)</w:t>
+        <w:t xml:space="preserve">        </w:t>
+      </w:r>
+      <w:proofErr w:type="spellStart"/>
+      <w:r>
+        <w:rPr>
+          <w:rFonts w:ascii="Times New Roman" w:eastAsia="Times New Roman" w:hAnsi="Times New Roman" w:cs="Times New Roman"/>
+          <w:kern w:val="0"/>
+          <w:lang w:val="en-GB" w:eastAsia="fr-FR"/>
+          <w14:ligatures w14:val="none"/>
+        </w:rPr>
+        <w:t>i</w:t>
+      </w:r>
+      <w:proofErr w:type="spellEnd"/>
+      <w:r>
+        <w:rPr>
+          <w:rFonts w:ascii="Times New Roman" w:eastAsia="Times New Roman" w:hAnsi="Times New Roman" w:cs="Times New Roman"/>
+          <w:kern w:val="0"/>
+          <w:lang w:val="en-GB" w:eastAsia="fr-FR"/>
+          <w14:ligatures w14:val="none"/>
+        </w:rPr>
+        <w:t xml:space="preserve"> = </w:t>
+      </w:r>
+      <w:proofErr w:type="spellStart"/>
+      <w:r>
+        <w:rPr>
+          <w:rFonts w:ascii="Times New Roman" w:eastAsia="Times New Roman" w:hAnsi="Times New Roman" w:cs="Times New Roman"/>
+          <w:kern w:val="0"/>
+          <w:lang w:val="en-GB" w:eastAsia="fr-FR"/>
+          <w14:ligatures w14:val="none"/>
+        </w:rPr>
+        <w:t>i</w:t>
+      </w:r>
+      <w:proofErr w:type="spellEnd"/>
+      <w:r>
+        <w:rPr>
+          <w:rFonts w:ascii="Times New Roman" w:eastAsia="Times New Roman" w:hAnsi="Times New Roman" w:cs="Times New Roman"/>
+          <w:kern w:val="0"/>
+          <w:lang w:val="en-GB" w:eastAsia="fr-FR"/>
+          <w14:ligatures w14:val="none"/>
+        </w:rPr>
+        <w:t xml:space="preserve"> + 1</w:t>
       </w:r>
     </w:p>
     <w:p>
@@ -3558,6 +4186,15 @@
           <w14:ligatures w14:val="none"/>
         </w:rPr>
       </w:pPr>
+      <w:r>
+        <w:rPr>
+          <w:rFonts w:ascii="Times New Roman" w:eastAsia="Times New Roman" w:hAnsi="Times New Roman" w:cs="Times New Roman"/>
+          <w:kern w:val="0"/>
+          <w:lang w:val="en-GB" w:eastAsia="fr-FR"/>
+          <w14:ligatures w14:val="none"/>
+        </w:rPr>
+        <w:t xml:space="preserve">    }</w:t>
+      </w:r>
     </w:p>
     <w:p>
       <w:pPr>
@@ -3575,15 +4212,6 @@
           <w14:ligatures w14:val="none"/>
         </w:rPr>
       </w:pPr>
-      <w:r>
-        <w:rPr>
-          <w:rFonts w:ascii="Times New Roman" w:eastAsia="Times New Roman" w:hAnsi="Times New Roman" w:cs="Times New Roman"/>
-          <w:kern w:val="0"/>
-          <w:lang w:val="en-GB" w:eastAsia="fr-FR"/>
-          <w14:ligatures w14:val="none"/>
-        </w:rPr>
-        <w:t xml:space="preserve">        while math/less(i, max) {</w:t>
-      </w:r>
     </w:p>
     <w:p>
       <w:pPr>
@@ -3608,9 +4236,39 @@
           <w:lang w:val="en-GB" w:eastAsia="fr-FR"/>
           <w14:ligatures w14:val="none"/>
         </w:rPr>
-        <w:lastRenderedPageBreak/>
-        <w:t xml:space="preserve">            let ch = string/char-at(password, i)</w:t>
-      </w:r>
+        <w:t xml:space="preserve">    </w:t>
+      </w:r>
+      <w:proofErr w:type="spellStart"/>
+      <w:r>
+        <w:rPr>
+          <w:rFonts w:ascii="Times New Roman" w:eastAsia="Times New Roman" w:hAnsi="Times New Roman" w:cs="Times New Roman"/>
+          <w:kern w:val="0"/>
+          <w:lang w:val="en-GB" w:eastAsia="fr-FR"/>
+          <w14:ligatures w14:val="none"/>
+        </w:rPr>
+        <w:t>is_long_enough</w:t>
+      </w:r>
+      <w:proofErr w:type="spellEnd"/>
+      <w:r>
+        <w:rPr>
+          <w:rFonts w:ascii="Times New Roman" w:eastAsia="Times New Roman" w:hAnsi="Times New Roman" w:cs="Times New Roman"/>
+          <w:kern w:val="0"/>
+          <w:lang w:val="en-GB" w:eastAsia="fr-FR"/>
+          <w14:ligatures w14:val="none"/>
+        </w:rPr>
+        <w:t xml:space="preserve"> and </w:t>
+      </w:r>
+      <w:proofErr w:type="spellStart"/>
+      <w:r>
+        <w:rPr>
+          <w:rFonts w:ascii="Times New Roman" w:eastAsia="Times New Roman" w:hAnsi="Times New Roman" w:cs="Times New Roman"/>
+          <w:kern w:val="0"/>
+          <w:lang w:val="en-GB" w:eastAsia="fr-FR"/>
+          <w14:ligatures w14:val="none"/>
+        </w:rPr>
+        <w:t>has_digit</w:t>
+      </w:r>
+      <w:proofErr w:type="spellEnd"/>
     </w:p>
     <w:p>
       <w:pPr>
@@ -3628,6 +4286,15 @@
           <w14:ligatures w14:val="none"/>
         </w:rPr>
       </w:pPr>
+      <w:r>
+        <w:rPr>
+          <w:rFonts w:ascii="Times New Roman" w:eastAsia="Times New Roman" w:hAnsi="Times New Roman" w:cs="Times New Roman"/>
+          <w:kern w:val="0"/>
+          <w:lang w:val="en-GB" w:eastAsia="fr-FR"/>
+          <w14:ligatures w14:val="none"/>
+        </w:rPr>
+        <w:t>}</w:t>
+      </w:r>
     </w:p>
     <w:p>
       <w:pPr>
@@ -3641,28 +4308,10 @@
         <w:rPr>
           <w:rFonts w:ascii="Times New Roman" w:eastAsia="Times New Roman" w:hAnsi="Times New Roman" w:cs="Times New Roman"/>
           <w:kern w:val="0"/>
-          <w:lang w:eastAsia="fr-FR"/>
-          <w14:ligatures w14:val="none"/>
-        </w:rPr>
-      </w:pPr>
-      <w:r>
-        <w:rPr>
-          <w:rFonts w:ascii="Times New Roman" w:eastAsia="Times New Roman" w:hAnsi="Times New Roman" w:cs="Times New Roman"/>
-          <w:kern w:val="0"/>
-          <w:lang w:val="en-GB" w:eastAsia="fr-FR"/>
-          <w14:ligatures w14:val="none"/>
-        </w:rPr>
-        <w:t xml:space="preserve">            </w:t>
-      </w:r>
-      <w:r>
-        <w:rPr>
-          <w:rFonts w:ascii="Times New Roman" w:eastAsia="Times New Roman" w:hAnsi="Times New Roman" w:cs="Times New Roman"/>
-          <w:kern w:val="0"/>
-          <w:lang w:eastAsia="fr-FR"/>
-          <w14:ligatures w14:val="none"/>
-        </w:rPr>
-        <w:t>// Vérifie si le caractère est entre '0' et '9'</w:t>
-      </w:r>
+          <w:lang w:val="en-GB" w:eastAsia="fr-FR"/>
+          <w14:ligatures w14:val="none"/>
+        </w:rPr>
+      </w:pPr>
     </w:p>
     <w:p>
       <w:pPr>
@@ -3684,19 +4333,30 @@
         <w:rPr>
           <w:rFonts w:ascii="Times New Roman" w:eastAsia="Times New Roman" w:hAnsi="Times New Roman" w:cs="Times New Roman"/>
           <w:kern w:val="0"/>
-          <w:lang w:eastAsia="fr-FR"/>
-          <w14:ligatures w14:val="none"/>
-        </w:rPr>
-        <w:t xml:space="preserve">            </w:t>
-      </w:r>
-      <w:r>
-        <w:rPr>
-          <w:rFonts w:ascii="Times New Roman" w:eastAsia="Times New Roman" w:hAnsi="Times New Roman" w:cs="Times New Roman"/>
-          <w:kern w:val="0"/>
-          <w:lang w:val="en-GB" w:eastAsia="fr-FR"/>
-          <w14:ligatures w14:val="none"/>
-        </w:rPr>
-        <w:t>if string/equals(ch, "0") or</w:t>
+          <w:lang w:val="en-GB" w:eastAsia="fr-FR"/>
+          <w14:ligatures w14:val="none"/>
+        </w:rPr>
+        <w:t xml:space="preserve">main: </w:t>
+      </w:r>
+      <w:proofErr w:type="spellStart"/>
+      <w:r>
+        <w:rPr>
+          <w:rFonts w:ascii="Times New Roman" w:eastAsia="Times New Roman" w:hAnsi="Times New Roman" w:cs="Times New Roman"/>
+          <w:kern w:val="0"/>
+          <w:lang w:val="en-GB" w:eastAsia="fr-FR"/>
+          <w14:ligatures w14:val="none"/>
+        </w:rPr>
+        <w:t>fn</w:t>
+      </w:r>
+      <w:proofErr w:type="spellEnd"/>
+      <w:r>
+        <w:rPr>
+          <w:rFonts w:ascii="Times New Roman" w:eastAsia="Times New Roman" w:hAnsi="Times New Roman" w:cs="Times New Roman"/>
+          <w:kern w:val="0"/>
+          <w:lang w:val="en-GB" w:eastAsia="fr-FR"/>
+          <w14:ligatures w14:val="none"/>
+        </w:rPr>
+        <w:t>() {</w:t>
       </w:r>
     </w:p>
     <w:p>
@@ -3722,7 +4382,27 @@
           <w:lang w:val="en-GB" w:eastAsia="fr-FR"/>
           <w14:ligatures w14:val="none"/>
         </w:rPr>
-        <w:t xml:space="preserve">               string/equals(ch, "1") or</w:t>
+        <w:t xml:space="preserve">    </w:t>
+      </w:r>
+      <w:proofErr w:type="spellStart"/>
+      <w:r>
+        <w:rPr>
+          <w:rFonts w:ascii="Times New Roman" w:eastAsia="Times New Roman" w:hAnsi="Times New Roman" w:cs="Times New Roman"/>
+          <w:kern w:val="0"/>
+          <w:lang w:val="en-GB" w:eastAsia="fr-FR"/>
+          <w14:ligatures w14:val="none"/>
+        </w:rPr>
+        <w:t>pwd</w:t>
+      </w:r>
+      <w:proofErr w:type="spellEnd"/>
+      <w:r>
+        <w:rPr>
+          <w:rFonts w:ascii="Times New Roman" w:eastAsia="Times New Roman" w:hAnsi="Times New Roman" w:cs="Times New Roman"/>
+          <w:kern w:val="0"/>
+          <w:lang w:val="en-GB" w:eastAsia="fr-FR"/>
+          <w14:ligatures w14:val="none"/>
+        </w:rPr>
+        <w:t>: string = "Abcdef12"</w:t>
       </w:r>
     </w:p>
     <w:p>
@@ -3737,18 +4417,67 @@
         <w:rPr>
           <w:rFonts w:ascii="Times New Roman" w:eastAsia="Times New Roman" w:hAnsi="Times New Roman" w:cs="Times New Roman"/>
           <w:kern w:val="0"/>
-          <w:lang w:val="en-GB" w:eastAsia="fr-FR"/>
-          <w14:ligatures w14:val="none"/>
-        </w:rPr>
-      </w:pPr>
-      <w:r>
-        <w:rPr>
-          <w:rFonts w:ascii="Times New Roman" w:eastAsia="Times New Roman" w:hAnsi="Times New Roman" w:cs="Times New Roman"/>
-          <w:kern w:val="0"/>
-          <w:lang w:val="en-GB" w:eastAsia="fr-FR"/>
-          <w14:ligatures w14:val="none"/>
-        </w:rPr>
-        <w:t xml:space="preserve">               string/equals(ch, "2") or</w:t>
+          <w:lang w:eastAsia="fr-FR"/>
+          <w14:ligatures w14:val="none"/>
+        </w:rPr>
+      </w:pPr>
+      <w:r>
+        <w:rPr>
+          <w:rFonts w:ascii="Times New Roman" w:eastAsia="Times New Roman" w:hAnsi="Times New Roman" w:cs="Times New Roman"/>
+          <w:kern w:val="0"/>
+          <w:lang w:val="en-GB" w:eastAsia="fr-FR"/>
+          <w14:ligatures w14:val="none"/>
+        </w:rPr>
+        <w:t xml:space="preserve">    </w:t>
+      </w:r>
+      <w:r>
+        <w:rPr>
+          <w:rFonts w:ascii="Times New Roman" w:eastAsia="Times New Roman" w:hAnsi="Times New Roman" w:cs="Times New Roman"/>
+          <w:kern w:val="0"/>
+          <w:lang w:eastAsia="fr-FR"/>
+          <w14:ligatures w14:val="none"/>
+        </w:rPr>
+        <w:t xml:space="preserve">if </w:t>
+      </w:r>
+      <w:proofErr w:type="spellStart"/>
+      <w:r>
+        <w:rPr>
+          <w:rFonts w:ascii="Times New Roman" w:eastAsia="Times New Roman" w:hAnsi="Times New Roman" w:cs="Times New Roman"/>
+          <w:kern w:val="0"/>
+          <w:lang w:eastAsia="fr-FR"/>
+          <w14:ligatures w14:val="none"/>
+        </w:rPr>
+        <w:t>validate_password</w:t>
+      </w:r>
+      <w:proofErr w:type="spellEnd"/>
+      <w:r>
+        <w:rPr>
+          <w:rFonts w:ascii="Times New Roman" w:eastAsia="Times New Roman" w:hAnsi="Times New Roman" w:cs="Times New Roman"/>
+          <w:kern w:val="0"/>
+          <w:lang w:eastAsia="fr-FR"/>
+          <w14:ligatures w14:val="none"/>
+        </w:rPr>
+        <w:t>(</w:t>
+      </w:r>
+      <w:proofErr w:type="spellStart"/>
+      <w:r>
+        <w:rPr>
+          <w:rFonts w:ascii="Times New Roman" w:eastAsia="Times New Roman" w:hAnsi="Times New Roman" w:cs="Times New Roman"/>
+          <w:kern w:val="0"/>
+          <w:lang w:eastAsia="fr-FR"/>
+          <w14:ligatures w14:val="none"/>
+        </w:rPr>
+        <w:t>pwd</w:t>
+      </w:r>
+      <w:proofErr w:type="spellEnd"/>
+      <w:r>
+        <w:rPr>
+          <w:rFonts w:ascii="Times New Roman" w:eastAsia="Times New Roman" w:hAnsi="Times New Roman" w:cs="Times New Roman"/>
+          <w:kern w:val="0"/>
+          <w:lang w:eastAsia="fr-FR"/>
+          <w14:ligatures w14:val="none"/>
+        </w:rPr>
+        <w:t>) {</w:t>
       </w:r>
     </w:p>
     <w:p>
@@ -3763,18 +4492,38 @@
         <w:rPr>
           <w:rFonts w:ascii="Times New Roman" w:eastAsia="Times New Roman" w:hAnsi="Times New Roman" w:cs="Times New Roman"/>
           <w:kern w:val="0"/>
-          <w:lang w:val="en-GB" w:eastAsia="fr-FR"/>
-          <w14:ligatures w14:val="none"/>
-        </w:rPr>
-      </w:pPr>
-      <w:r>
-        <w:rPr>
-          <w:rFonts w:ascii="Times New Roman" w:eastAsia="Times New Roman" w:hAnsi="Times New Roman" w:cs="Times New Roman"/>
-          <w:kern w:val="0"/>
-          <w:lang w:val="en-GB" w:eastAsia="fr-FR"/>
-          <w14:ligatures w14:val="none"/>
-        </w:rPr>
-        <w:t xml:space="preserve">               string/equals(ch, "3") or</w:t>
+          <w:lang w:eastAsia="fr-FR"/>
+          <w14:ligatures w14:val="none"/>
+        </w:rPr>
+      </w:pPr>
+      <w:r>
+        <w:rPr>
+          <w:rFonts w:ascii="Times New Roman" w:eastAsia="Times New Roman" w:hAnsi="Times New Roman" w:cs="Times New Roman"/>
+          <w:kern w:val="0"/>
+          <w:lang w:eastAsia="fr-FR"/>
+          <w14:ligatures w14:val="none"/>
+        </w:rPr>
+        <w:t xml:space="preserve">        </w:t>
+      </w:r>
+      <w:proofErr w:type="spellStart"/>
+      <w:r>
+        <w:rPr>
+          <w:rFonts w:ascii="Times New Roman" w:eastAsia="Times New Roman" w:hAnsi="Times New Roman" w:cs="Times New Roman"/>
+          <w:kern w:val="0"/>
+          <w:lang w:eastAsia="fr-FR"/>
+          <w14:ligatures w14:val="none"/>
+        </w:rPr>
+        <w:t>print</w:t>
+      </w:r>
+      <w:proofErr w:type="spellEnd"/>
+      <w:r>
+        <w:rPr>
+          <w:rFonts w:ascii="Times New Roman" w:eastAsia="Times New Roman" w:hAnsi="Times New Roman" w:cs="Times New Roman"/>
+          <w:kern w:val="0"/>
+          <w:lang w:eastAsia="fr-FR"/>
+          <w14:ligatures w14:val="none"/>
+        </w:rPr>
+        <w:t>("Mot de passe sécurisé.")</w:t>
       </w:r>
     </w:p>
     <w:p>
@@ -3789,18 +4538,38 @@
         <w:rPr>
           <w:rFonts w:ascii="Times New Roman" w:eastAsia="Times New Roman" w:hAnsi="Times New Roman" w:cs="Times New Roman"/>
           <w:kern w:val="0"/>
-          <w:lang w:val="en-GB" w:eastAsia="fr-FR"/>
-          <w14:ligatures w14:val="none"/>
-        </w:rPr>
-      </w:pPr>
-      <w:r>
-        <w:rPr>
-          <w:rFonts w:ascii="Times New Roman" w:eastAsia="Times New Roman" w:hAnsi="Times New Roman" w:cs="Times New Roman"/>
-          <w:kern w:val="0"/>
-          <w:lang w:val="en-GB" w:eastAsia="fr-FR"/>
-          <w14:ligatures w14:val="none"/>
-        </w:rPr>
-        <w:t xml:space="preserve">               string/equals(ch, "4") or</w:t>
+          <w:lang w:eastAsia="fr-FR"/>
+          <w14:ligatures w14:val="none"/>
+        </w:rPr>
+      </w:pPr>
+      <w:r>
+        <w:rPr>
+          <w:rFonts w:ascii="Times New Roman" w:eastAsia="Times New Roman" w:hAnsi="Times New Roman" w:cs="Times New Roman"/>
+          <w:kern w:val="0"/>
+          <w:lang w:eastAsia="fr-FR"/>
+          <w14:ligatures w14:val="none"/>
+        </w:rPr>
+        <w:t xml:space="preserve">    } </w:t>
+      </w:r>
+      <w:proofErr w:type="spellStart"/>
+      <w:r>
+        <w:rPr>
+          <w:rFonts w:ascii="Times New Roman" w:eastAsia="Times New Roman" w:hAnsi="Times New Roman" w:cs="Times New Roman"/>
+          <w:kern w:val="0"/>
+          <w:lang w:eastAsia="fr-FR"/>
+          <w14:ligatures w14:val="none"/>
+        </w:rPr>
+        <w:t>else</w:t>
+      </w:r>
+      <w:proofErr w:type="spellEnd"/>
+      <w:r>
+        <w:rPr>
+          <w:rFonts w:ascii="Times New Roman" w:eastAsia="Times New Roman" w:hAnsi="Times New Roman" w:cs="Times New Roman"/>
+          <w:kern w:val="0"/>
+          <w:lang w:eastAsia="fr-FR"/>
+          <w14:ligatures w14:val="none"/>
+        </w:rPr>
+        <w:t xml:space="preserve"> {</w:t>
       </w:r>
     </w:p>
     <w:p>
@@ -3815,18 +4584,38 @@
         <w:rPr>
           <w:rFonts w:ascii="Times New Roman" w:eastAsia="Times New Roman" w:hAnsi="Times New Roman" w:cs="Times New Roman"/>
           <w:kern w:val="0"/>
-          <w:lang w:val="en-GB" w:eastAsia="fr-FR"/>
-          <w14:ligatures w14:val="none"/>
-        </w:rPr>
-      </w:pPr>
-      <w:r>
-        <w:rPr>
-          <w:rFonts w:ascii="Times New Roman" w:eastAsia="Times New Roman" w:hAnsi="Times New Roman" w:cs="Times New Roman"/>
-          <w:kern w:val="0"/>
-          <w:lang w:val="en-GB" w:eastAsia="fr-FR"/>
-          <w14:ligatures w14:val="none"/>
-        </w:rPr>
-        <w:t xml:space="preserve">               string/equals(ch, "5") or</w:t>
+          <w:lang w:eastAsia="fr-FR"/>
+          <w14:ligatures w14:val="none"/>
+        </w:rPr>
+      </w:pPr>
+      <w:r>
+        <w:rPr>
+          <w:rFonts w:ascii="Times New Roman" w:eastAsia="Times New Roman" w:hAnsi="Times New Roman" w:cs="Times New Roman"/>
+          <w:kern w:val="0"/>
+          <w:lang w:eastAsia="fr-FR"/>
+          <w14:ligatures w14:val="none"/>
+        </w:rPr>
+        <w:t xml:space="preserve">        </w:t>
+      </w:r>
+      <w:proofErr w:type="spellStart"/>
+      <w:r>
+        <w:rPr>
+          <w:rFonts w:ascii="Times New Roman" w:eastAsia="Times New Roman" w:hAnsi="Times New Roman" w:cs="Times New Roman"/>
+          <w:kern w:val="0"/>
+          <w:lang w:eastAsia="fr-FR"/>
+          <w14:ligatures w14:val="none"/>
+        </w:rPr>
+        <w:t>print</w:t>
+      </w:r>
+      <w:proofErr w:type="spellEnd"/>
+      <w:r>
+        <w:rPr>
+          <w:rFonts w:ascii="Times New Roman" w:eastAsia="Times New Roman" w:hAnsi="Times New Roman" w:cs="Times New Roman"/>
+          <w:kern w:val="0"/>
+          <w:lang w:eastAsia="fr-FR"/>
+          <w14:ligatures w14:val="none"/>
+        </w:rPr>
+        <w:t>("Sécurité insuffisante.")</w:t>
       </w:r>
     </w:p>
     <w:p>
@@ -3841,18 +4630,18 @@
         <w:rPr>
           <w:rFonts w:ascii="Times New Roman" w:eastAsia="Times New Roman" w:hAnsi="Times New Roman" w:cs="Times New Roman"/>
           <w:kern w:val="0"/>
-          <w:lang w:val="en-GB" w:eastAsia="fr-FR"/>
-          <w14:ligatures w14:val="none"/>
-        </w:rPr>
-      </w:pPr>
-      <w:r>
-        <w:rPr>
-          <w:rFonts w:ascii="Times New Roman" w:eastAsia="Times New Roman" w:hAnsi="Times New Roman" w:cs="Times New Roman"/>
-          <w:kern w:val="0"/>
-          <w:lang w:val="en-GB" w:eastAsia="fr-FR"/>
-          <w14:ligatures w14:val="none"/>
-        </w:rPr>
-        <w:t xml:space="preserve">               string/equals(ch, "6") or</w:t>
+          <w:lang w:eastAsia="fr-FR"/>
+          <w14:ligatures w14:val="none"/>
+        </w:rPr>
+      </w:pPr>
+      <w:r>
+        <w:rPr>
+          <w:rFonts w:ascii="Times New Roman" w:eastAsia="Times New Roman" w:hAnsi="Times New Roman" w:cs="Times New Roman"/>
+          <w:kern w:val="0"/>
+          <w:lang w:eastAsia="fr-FR"/>
+          <w14:ligatures w14:val="none"/>
+        </w:rPr>
+        <w:t xml:space="preserve">    }</w:t>
       </w:r>
     </w:p>
     <w:p>
@@ -3867,1588 +4656,10 @@
         <w:rPr>
           <w:rFonts w:ascii="Times New Roman" w:eastAsia="Times New Roman" w:hAnsi="Times New Roman" w:cs="Times New Roman"/>
           <w:kern w:val="0"/>
-          <w:lang w:val="en-GB" w:eastAsia="fr-FR"/>
-          <w14:ligatures w14:val="none"/>
-        </w:rPr>
-      </w:pPr>
-      <w:r>
-        <w:rPr>
-          <w:rFonts w:ascii="Times New Roman" w:eastAsia="Times New Roman" w:hAnsi="Times New Roman" w:cs="Times New Roman"/>
-          <w:kern w:val="0"/>
-          <w:lang w:val="en-GB" w:eastAsia="fr-FR"/>
-          <w14:ligatures w14:val="none"/>
-        </w:rPr>
-        <w:t xml:space="preserve">               string/equals(ch, "7") or</w:t>
-      </w:r>
-    </w:p>
-    <w:p>
-      <w:pPr>
-        <w:pBdr>
-          <w:top w:val="single" w:sz="4" w:space="1" w:color="auto"/>
-          <w:left w:val="single" w:sz="4" w:space="1" w:color="auto"/>
-          <w:bottom w:val="single" w:sz="4" w:space="1" w:color="auto"/>
-          <w:right w:val="single" w:sz="4" w:space="1" w:color="auto"/>
-        </w:pBdr>
-        <w:spacing w:before="100" w:beforeAutospacing="1" w:after="100" w:afterAutospacing="1" w:line="240" w:lineRule="auto"/>
-        <w:rPr>
-          <w:rFonts w:ascii="Times New Roman" w:eastAsia="Times New Roman" w:hAnsi="Times New Roman" w:cs="Times New Roman"/>
-          <w:kern w:val="0"/>
-          <w:lang w:val="en-GB" w:eastAsia="fr-FR"/>
-          <w14:ligatures w14:val="none"/>
-        </w:rPr>
-      </w:pPr>
-      <w:r>
-        <w:rPr>
-          <w:rFonts w:ascii="Times New Roman" w:eastAsia="Times New Roman" w:hAnsi="Times New Roman" w:cs="Times New Roman"/>
-          <w:kern w:val="0"/>
-          <w:lang w:val="en-GB" w:eastAsia="fr-FR"/>
-          <w14:ligatures w14:val="none"/>
-        </w:rPr>
-        <w:t xml:space="preserve">               string/equals(ch, "8") or</w:t>
-      </w:r>
-    </w:p>
-    <w:p>
-      <w:pPr>
-        <w:pBdr>
-          <w:top w:val="single" w:sz="4" w:space="1" w:color="auto"/>
-          <w:left w:val="single" w:sz="4" w:space="1" w:color="auto"/>
-          <w:bottom w:val="single" w:sz="4" w:space="1" w:color="auto"/>
-          <w:right w:val="single" w:sz="4" w:space="1" w:color="auto"/>
-        </w:pBdr>
-        <w:spacing w:before="100" w:beforeAutospacing="1" w:after="100" w:afterAutospacing="1" w:line="240" w:lineRule="auto"/>
-        <w:rPr>
-          <w:rFonts w:ascii="Times New Roman" w:eastAsia="Times New Roman" w:hAnsi="Times New Roman" w:cs="Times New Roman"/>
-          <w:kern w:val="0"/>
-          <w:lang w:val="en-GB" w:eastAsia="fr-FR"/>
-          <w14:ligatures w14:val="none"/>
-        </w:rPr>
-      </w:pPr>
-      <w:r>
-        <w:rPr>
-          <w:rFonts w:ascii="Times New Roman" w:eastAsia="Times New Roman" w:hAnsi="Times New Roman" w:cs="Times New Roman"/>
-          <w:kern w:val="0"/>
-          <w:lang w:val="en-GB" w:eastAsia="fr-FR"/>
-          <w14:ligatures w14:val="none"/>
-        </w:rPr>
-        <w:t xml:space="preserve">               string/equals(ch, "9") {</w:t>
-      </w:r>
-    </w:p>
-    <w:p>
-      <w:pPr>
-        <w:pBdr>
-          <w:top w:val="single" w:sz="4" w:space="1" w:color="auto"/>
-          <w:left w:val="single" w:sz="4" w:space="1" w:color="auto"/>
-          <w:bottom w:val="single" w:sz="4" w:space="1" w:color="auto"/>
-          <w:right w:val="single" w:sz="4" w:space="1" w:color="auto"/>
-        </w:pBdr>
-        <w:spacing w:before="100" w:beforeAutospacing="1" w:after="100" w:afterAutospacing="1" w:line="240" w:lineRule="auto"/>
-        <w:rPr>
-          <w:rFonts w:ascii="Times New Roman" w:eastAsia="Times New Roman" w:hAnsi="Times New Roman" w:cs="Times New Roman"/>
-          <w:kern w:val="0"/>
-          <w:lang w:val="en-GB" w:eastAsia="fr-FR"/>
-          <w14:ligatures w14:val="none"/>
-        </w:rPr>
-      </w:pPr>
-      <w:r>
-        <w:rPr>
-          <w:rFonts w:ascii="Times New Roman" w:eastAsia="Times New Roman" w:hAnsi="Times New Roman" w:cs="Times New Roman"/>
-          <w:kern w:val="0"/>
-          <w:lang w:val="en-GB" w:eastAsia="fr-FR"/>
-          <w14:ligatures w14:val="none"/>
-        </w:rPr>
-        <w:t xml:space="preserve">                has_digit = true</w:t>
-      </w:r>
-    </w:p>
-    <w:p>
-      <w:pPr>
-        <w:pBdr>
-          <w:top w:val="single" w:sz="4" w:space="1" w:color="auto"/>
-          <w:left w:val="single" w:sz="4" w:space="1" w:color="auto"/>
-          <w:bottom w:val="single" w:sz="4" w:space="1" w:color="auto"/>
-          <w:right w:val="single" w:sz="4" w:space="1" w:color="auto"/>
-        </w:pBdr>
-        <w:spacing w:before="100" w:beforeAutospacing="1" w:after="100" w:afterAutospacing="1" w:line="240" w:lineRule="auto"/>
-        <w:rPr>
-          <w:rFonts w:ascii="Times New Roman" w:eastAsia="Times New Roman" w:hAnsi="Times New Roman" w:cs="Times New Roman"/>
-          <w:kern w:val="0"/>
-          <w:lang w:val="en-GB" w:eastAsia="fr-FR"/>
-          <w14:ligatures w14:val="none"/>
-        </w:rPr>
-      </w:pPr>
-      <w:r>
-        <w:rPr>
-          <w:rFonts w:ascii="Times New Roman" w:eastAsia="Times New Roman" w:hAnsi="Times New Roman" w:cs="Times New Roman"/>
-          <w:kern w:val="0"/>
-          <w:lang w:val="en-GB" w:eastAsia="fr-FR"/>
-          <w14:ligatures w14:val="none"/>
-        </w:rPr>
-        <w:t xml:space="preserve">                break</w:t>
-      </w:r>
-    </w:p>
-    <w:p>
-      <w:pPr>
-        <w:pBdr>
-          <w:top w:val="single" w:sz="4" w:space="1" w:color="auto"/>
-          <w:left w:val="single" w:sz="4" w:space="1" w:color="auto"/>
-          <w:bottom w:val="single" w:sz="4" w:space="1" w:color="auto"/>
-          <w:right w:val="single" w:sz="4" w:space="1" w:color="auto"/>
-        </w:pBdr>
-        <w:spacing w:before="100" w:beforeAutospacing="1" w:after="100" w:afterAutospacing="1" w:line="240" w:lineRule="auto"/>
-        <w:rPr>
-          <w:rFonts w:ascii="Times New Roman" w:eastAsia="Times New Roman" w:hAnsi="Times New Roman" w:cs="Times New Roman"/>
-          <w:kern w:val="0"/>
-          <w:lang w:val="en-GB" w:eastAsia="fr-FR"/>
-          <w14:ligatures w14:val="none"/>
-        </w:rPr>
-      </w:pPr>
-      <w:r>
-        <w:rPr>
-          <w:rFonts w:ascii="Times New Roman" w:eastAsia="Times New Roman" w:hAnsi="Times New Roman" w:cs="Times New Roman"/>
-          <w:kern w:val="0"/>
-          <w:lang w:val="en-GB" w:eastAsia="fr-FR"/>
-          <w14:ligatures w14:val="none"/>
-        </w:rPr>
-        <w:t xml:space="preserve">            }</w:t>
-      </w:r>
-    </w:p>
-    <w:p>
-      <w:pPr>
-        <w:pBdr>
-          <w:top w:val="single" w:sz="4" w:space="1" w:color="auto"/>
-          <w:left w:val="single" w:sz="4" w:space="1" w:color="auto"/>
-          <w:bottom w:val="single" w:sz="4" w:space="1" w:color="auto"/>
-          <w:right w:val="single" w:sz="4" w:space="1" w:color="auto"/>
-        </w:pBdr>
-        <w:spacing w:before="100" w:beforeAutospacing="1" w:after="100" w:afterAutospacing="1" w:line="240" w:lineRule="auto"/>
-        <w:rPr>
-          <w:rFonts w:ascii="Times New Roman" w:eastAsia="Times New Roman" w:hAnsi="Times New Roman" w:cs="Times New Roman"/>
-          <w:kern w:val="0"/>
-          <w:lang w:val="en-GB" w:eastAsia="fr-FR"/>
-          <w14:ligatures w14:val="none"/>
-        </w:rPr>
-      </w:pPr>
-    </w:p>
-    <w:p>
-      <w:pPr>
-        <w:pBdr>
-          <w:top w:val="single" w:sz="4" w:space="1" w:color="auto"/>
-          <w:left w:val="single" w:sz="4" w:space="1" w:color="auto"/>
-          <w:bottom w:val="single" w:sz="4" w:space="1" w:color="auto"/>
-          <w:right w:val="single" w:sz="4" w:space="1" w:color="auto"/>
-        </w:pBdr>
-        <w:spacing w:before="100" w:beforeAutospacing="1" w:after="100" w:afterAutospacing="1" w:line="240" w:lineRule="auto"/>
-        <w:rPr>
-          <w:rFonts w:ascii="Times New Roman" w:eastAsia="Times New Roman" w:hAnsi="Times New Roman" w:cs="Times New Roman"/>
-          <w:kern w:val="0"/>
-          <w:lang w:val="en-GB" w:eastAsia="fr-FR"/>
-          <w14:ligatures w14:val="none"/>
-        </w:rPr>
-      </w:pPr>
-      <w:r>
-        <w:rPr>
-          <w:rFonts w:ascii="Times New Roman" w:eastAsia="Times New Roman" w:hAnsi="Times New Roman" w:cs="Times New Roman"/>
-          <w:kern w:val="0"/>
-          <w:lang w:val="en-GB" w:eastAsia="fr-FR"/>
-          <w14:ligatures w14:val="none"/>
-        </w:rPr>
-        <w:t xml:space="preserve">            i = math/add(i, int 1)</w:t>
-      </w:r>
-    </w:p>
-    <w:p>
-      <w:pPr>
-        <w:pBdr>
-          <w:top w:val="single" w:sz="4" w:space="1" w:color="auto"/>
-          <w:left w:val="single" w:sz="4" w:space="1" w:color="auto"/>
-          <w:bottom w:val="single" w:sz="4" w:space="1" w:color="auto"/>
-          <w:right w:val="single" w:sz="4" w:space="1" w:color="auto"/>
-        </w:pBdr>
-        <w:spacing w:before="100" w:beforeAutospacing="1" w:after="100" w:afterAutospacing="1" w:line="240" w:lineRule="auto"/>
-        <w:rPr>
-          <w:rFonts w:ascii="Times New Roman" w:eastAsia="Times New Roman" w:hAnsi="Times New Roman" w:cs="Times New Roman"/>
-          <w:kern w:val="0"/>
-          <w:lang w:val="en-GB" w:eastAsia="fr-FR"/>
-          <w14:ligatures w14:val="none"/>
-        </w:rPr>
-      </w:pPr>
-      <w:r>
-        <w:rPr>
-          <w:rFonts w:ascii="Times New Roman" w:eastAsia="Times New Roman" w:hAnsi="Times New Roman" w:cs="Times New Roman"/>
-          <w:kern w:val="0"/>
-          <w:lang w:val="en-GB" w:eastAsia="fr-FR"/>
-          <w14:ligatures w14:val="none"/>
-        </w:rPr>
-        <w:t xml:space="preserve">        }</w:t>
-      </w:r>
-    </w:p>
-    <w:p>
-      <w:pPr>
-        <w:pBdr>
-          <w:top w:val="single" w:sz="4" w:space="1" w:color="auto"/>
-          <w:left w:val="single" w:sz="4" w:space="1" w:color="auto"/>
-          <w:bottom w:val="single" w:sz="4" w:space="1" w:color="auto"/>
-          <w:right w:val="single" w:sz="4" w:space="1" w:color="auto"/>
-        </w:pBdr>
-        <w:spacing w:before="100" w:beforeAutospacing="1" w:after="100" w:afterAutospacing="1" w:line="240" w:lineRule="auto"/>
-        <w:rPr>
-          <w:rFonts w:ascii="Times New Roman" w:eastAsia="Times New Roman" w:hAnsi="Times New Roman" w:cs="Times New Roman"/>
-          <w:kern w:val="0"/>
-          <w:lang w:val="en-GB" w:eastAsia="fr-FR"/>
-          <w14:ligatures w14:val="none"/>
-        </w:rPr>
-      </w:pPr>
-      <w:r>
-        <w:rPr>
-          <w:rFonts w:ascii="Times New Roman" w:eastAsia="Times New Roman" w:hAnsi="Times New Roman" w:cs="Times New Roman"/>
-          <w:kern w:val="0"/>
-          <w:lang w:val="en-GB" w:eastAsia="fr-FR"/>
-          <w14:ligatures w14:val="none"/>
-        </w:rPr>
-        <w:t xml:space="preserve">    }</w:t>
-      </w:r>
-    </w:p>
-    <w:p>
-      <w:pPr>
-        <w:pBdr>
-          <w:top w:val="single" w:sz="4" w:space="1" w:color="auto"/>
-          <w:left w:val="single" w:sz="4" w:space="1" w:color="auto"/>
-          <w:bottom w:val="single" w:sz="4" w:space="1" w:color="auto"/>
-          <w:right w:val="single" w:sz="4" w:space="1" w:color="auto"/>
-        </w:pBdr>
-        <w:spacing w:before="100" w:beforeAutospacing="1" w:after="100" w:afterAutospacing="1" w:line="240" w:lineRule="auto"/>
-        <w:rPr>
-          <w:rFonts w:ascii="Times New Roman" w:eastAsia="Times New Roman" w:hAnsi="Times New Roman" w:cs="Times New Roman"/>
-          <w:kern w:val="0"/>
-          <w:lang w:val="en-GB" w:eastAsia="fr-FR"/>
-          <w14:ligatures w14:val="none"/>
-        </w:rPr>
-      </w:pPr>
-    </w:p>
-    <w:p>
-      <w:pPr>
-        <w:pBdr>
-          <w:top w:val="single" w:sz="4" w:space="1" w:color="auto"/>
-          <w:left w:val="single" w:sz="4" w:space="1" w:color="auto"/>
-          <w:bottom w:val="single" w:sz="4" w:space="1" w:color="auto"/>
-          <w:right w:val="single" w:sz="4" w:space="1" w:color="auto"/>
-        </w:pBdr>
-        <w:spacing w:before="100" w:beforeAutospacing="1" w:after="100" w:afterAutospacing="1" w:line="240" w:lineRule="auto"/>
-        <w:rPr>
-          <w:rFonts w:ascii="Times New Roman" w:eastAsia="Times New Roman" w:hAnsi="Times New Roman" w:cs="Times New Roman"/>
-          <w:kern w:val="0"/>
-          <w:lang w:val="en-GB" w:eastAsia="fr-FR"/>
-          <w14:ligatures w14:val="none"/>
-        </w:rPr>
-      </w:pPr>
-      <w:r>
-        <w:rPr>
-          <w:rFonts w:ascii="Times New Roman" w:eastAsia="Times New Roman" w:hAnsi="Times New Roman" w:cs="Times New Roman"/>
-          <w:kern w:val="0"/>
-          <w:lang w:val="en-GB" w:eastAsia="fr-FR"/>
-          <w14:ligatures w14:val="none"/>
-        </w:rPr>
-        <w:t xml:space="preserve">    if not has_digit {</w:t>
-      </w:r>
-    </w:p>
-    <w:p>
-      <w:pPr>
-        <w:pBdr>
-          <w:top w:val="single" w:sz="4" w:space="1" w:color="auto"/>
-          <w:left w:val="single" w:sz="4" w:space="1" w:color="auto"/>
-          <w:bottom w:val="single" w:sz="4" w:space="1" w:color="auto"/>
-          <w:right w:val="single" w:sz="4" w:space="1" w:color="auto"/>
-        </w:pBdr>
-        <w:spacing w:before="100" w:beforeAutospacing="1" w:after="100" w:afterAutospacing="1" w:line="240" w:lineRule="auto"/>
-        <w:rPr>
-          <w:rFonts w:ascii="Times New Roman" w:eastAsia="Times New Roman" w:hAnsi="Times New Roman" w:cs="Times New Roman"/>
-          <w:kern w:val="0"/>
-          <w:lang w:val="en-GB" w:eastAsia="fr-FR"/>
-          <w14:ligatures w14:val="none"/>
-        </w:rPr>
-      </w:pPr>
-      <w:r>
-        <w:rPr>
-          <w:rFonts w:ascii="Times New Roman" w:eastAsia="Times New Roman" w:hAnsi="Times New Roman" w:cs="Times New Roman"/>
-          <w:kern w:val="0"/>
-          <w:lang w:val="en-GB" w:eastAsia="fr-FR"/>
-          <w14:ligatures w14:val="none"/>
-        </w:rPr>
-        <w:t xml:space="preserve">        return false</w:t>
-      </w:r>
-    </w:p>
-    <w:p>
-      <w:pPr>
-        <w:pBdr>
-          <w:top w:val="single" w:sz="4" w:space="1" w:color="auto"/>
-          <w:left w:val="single" w:sz="4" w:space="1" w:color="auto"/>
-          <w:bottom w:val="single" w:sz="4" w:space="1" w:color="auto"/>
-          <w:right w:val="single" w:sz="4" w:space="1" w:color="auto"/>
-        </w:pBdr>
-        <w:spacing w:before="100" w:beforeAutospacing="1" w:after="100" w:afterAutospacing="1" w:line="240" w:lineRule="auto"/>
-        <w:rPr>
-          <w:rFonts w:ascii="Times New Roman" w:eastAsia="Times New Roman" w:hAnsi="Times New Roman" w:cs="Times New Roman"/>
-          <w:kern w:val="0"/>
-          <w:lang w:val="en-GB" w:eastAsia="fr-FR"/>
-          <w14:ligatures w14:val="none"/>
-        </w:rPr>
-      </w:pPr>
-      <w:r>
-        <w:rPr>
-          <w:rFonts w:ascii="Times New Roman" w:eastAsia="Times New Roman" w:hAnsi="Times New Roman" w:cs="Times New Roman"/>
-          <w:kern w:val="0"/>
-          <w:lang w:val="en-GB" w:eastAsia="fr-FR"/>
-          <w14:ligatures w14:val="none"/>
-        </w:rPr>
-        <w:t xml:space="preserve">    }</w:t>
-      </w:r>
-    </w:p>
-    <w:p>
-      <w:pPr>
-        <w:pBdr>
-          <w:top w:val="single" w:sz="4" w:space="1" w:color="auto"/>
-          <w:left w:val="single" w:sz="4" w:space="1" w:color="auto"/>
-          <w:bottom w:val="single" w:sz="4" w:space="1" w:color="auto"/>
-          <w:right w:val="single" w:sz="4" w:space="1" w:color="auto"/>
-        </w:pBdr>
-        <w:spacing w:before="100" w:beforeAutospacing="1" w:after="100" w:afterAutospacing="1" w:line="240" w:lineRule="auto"/>
-        <w:rPr>
-          <w:rFonts w:ascii="Times New Roman" w:eastAsia="Times New Roman" w:hAnsi="Times New Roman" w:cs="Times New Roman"/>
-          <w:kern w:val="0"/>
-          <w:lang w:val="en-GB" w:eastAsia="fr-FR"/>
-          <w14:ligatures w14:val="none"/>
-        </w:rPr>
-      </w:pPr>
-    </w:p>
-    <w:p>
-      <w:pPr>
-        <w:pBdr>
-          <w:top w:val="single" w:sz="4" w:space="1" w:color="auto"/>
-          <w:left w:val="single" w:sz="4" w:space="1" w:color="auto"/>
-          <w:bottom w:val="single" w:sz="4" w:space="1" w:color="auto"/>
-          <w:right w:val="single" w:sz="4" w:space="1" w:color="auto"/>
-        </w:pBdr>
-        <w:spacing w:before="100" w:beforeAutospacing="1" w:after="100" w:afterAutospacing="1" w:line="240" w:lineRule="auto"/>
-        <w:rPr>
-          <w:rFonts w:ascii="Times New Roman" w:eastAsia="Times New Roman" w:hAnsi="Times New Roman" w:cs="Times New Roman"/>
-          <w:kern w:val="0"/>
-          <w:lang w:val="en-GB" w:eastAsia="fr-FR"/>
-          <w14:ligatures w14:val="none"/>
-        </w:rPr>
-      </w:pPr>
-      <w:r>
-        <w:rPr>
-          <w:rFonts w:ascii="Times New Roman" w:eastAsia="Times New Roman" w:hAnsi="Times New Roman" w:cs="Times New Roman"/>
-          <w:kern w:val="0"/>
-          <w:lang w:val="en-GB" w:eastAsia="fr-FR"/>
-          <w14:ligatures w14:val="none"/>
-        </w:rPr>
-        <w:lastRenderedPageBreak/>
-        <w:t xml:space="preserve">    // Règle 3 : contient une majuscule ?</w:t>
-      </w:r>
-    </w:p>
-    <w:p>
-      <w:pPr>
-        <w:pBdr>
-          <w:top w:val="single" w:sz="4" w:space="1" w:color="auto"/>
-          <w:left w:val="single" w:sz="4" w:space="1" w:color="auto"/>
-          <w:bottom w:val="single" w:sz="4" w:space="1" w:color="auto"/>
-          <w:right w:val="single" w:sz="4" w:space="1" w:color="auto"/>
-        </w:pBdr>
-        <w:spacing w:before="100" w:beforeAutospacing="1" w:after="100" w:afterAutospacing="1" w:line="240" w:lineRule="auto"/>
-        <w:rPr>
-          <w:rFonts w:ascii="Times New Roman" w:eastAsia="Times New Roman" w:hAnsi="Times New Roman" w:cs="Times New Roman"/>
-          <w:kern w:val="0"/>
-          <w:lang w:val="en-GB" w:eastAsia="fr-FR"/>
-          <w14:ligatures w14:val="none"/>
-        </w:rPr>
-      </w:pPr>
-      <w:r>
-        <w:rPr>
-          <w:rFonts w:ascii="Times New Roman" w:eastAsia="Times New Roman" w:hAnsi="Times New Roman" w:cs="Times New Roman"/>
-          <w:kern w:val="0"/>
-          <w:lang w:val="en-GB" w:eastAsia="fr-FR"/>
-          <w14:ligatures w14:val="none"/>
-        </w:rPr>
-        <w:t xml:space="preserve">    let has_upper = false</w:t>
-      </w:r>
-    </w:p>
-    <w:p>
-      <w:pPr>
-        <w:pBdr>
-          <w:top w:val="single" w:sz="4" w:space="1" w:color="auto"/>
-          <w:left w:val="single" w:sz="4" w:space="1" w:color="auto"/>
-          <w:bottom w:val="single" w:sz="4" w:space="1" w:color="auto"/>
-          <w:right w:val="single" w:sz="4" w:space="1" w:color="auto"/>
-        </w:pBdr>
-        <w:spacing w:before="100" w:beforeAutospacing="1" w:after="100" w:afterAutospacing="1" w:line="240" w:lineRule="auto"/>
-        <w:rPr>
-          <w:rFonts w:ascii="Times New Roman" w:eastAsia="Times New Roman" w:hAnsi="Times New Roman" w:cs="Times New Roman"/>
-          <w:kern w:val="0"/>
-          <w:lang w:val="en-GB" w:eastAsia="fr-FR"/>
-          <w14:ligatures w14:val="none"/>
-        </w:rPr>
-      </w:pPr>
-      <w:r>
-        <w:rPr>
-          <w:rFonts w:ascii="Times New Roman" w:eastAsia="Times New Roman" w:hAnsi="Times New Roman" w:cs="Times New Roman"/>
-          <w:kern w:val="0"/>
-          <w:lang w:val="en-GB" w:eastAsia="fr-FR"/>
-          <w14:ligatures w14:val="none"/>
-        </w:rPr>
-        <w:t xml:space="preserve">    block {</w:t>
-      </w:r>
-    </w:p>
-    <w:p>
-      <w:pPr>
-        <w:pBdr>
-          <w:top w:val="single" w:sz="4" w:space="1" w:color="auto"/>
-          <w:left w:val="single" w:sz="4" w:space="1" w:color="auto"/>
-          <w:bottom w:val="single" w:sz="4" w:space="1" w:color="auto"/>
-          <w:right w:val="single" w:sz="4" w:space="1" w:color="auto"/>
-        </w:pBdr>
-        <w:spacing w:before="100" w:beforeAutospacing="1" w:after="100" w:afterAutospacing="1" w:line="240" w:lineRule="auto"/>
-        <w:rPr>
-          <w:rFonts w:ascii="Times New Roman" w:eastAsia="Times New Roman" w:hAnsi="Times New Roman" w:cs="Times New Roman"/>
-          <w:kern w:val="0"/>
-          <w:lang w:val="en-GB" w:eastAsia="fr-FR"/>
-          <w14:ligatures w14:val="none"/>
-        </w:rPr>
-      </w:pPr>
-      <w:r>
-        <w:rPr>
-          <w:rFonts w:ascii="Times New Roman" w:eastAsia="Times New Roman" w:hAnsi="Times New Roman" w:cs="Times New Roman"/>
-          <w:kern w:val="0"/>
-          <w:lang w:val="en-GB" w:eastAsia="fr-FR"/>
-          <w14:ligatures w14:val="none"/>
-        </w:rPr>
-        <w:t xml:space="preserve">        let i = int 0</w:t>
-      </w:r>
-    </w:p>
-    <w:p>
-      <w:pPr>
-        <w:pBdr>
-          <w:top w:val="single" w:sz="4" w:space="1" w:color="auto"/>
-          <w:left w:val="single" w:sz="4" w:space="1" w:color="auto"/>
-          <w:bottom w:val="single" w:sz="4" w:space="1" w:color="auto"/>
-          <w:right w:val="single" w:sz="4" w:space="1" w:color="auto"/>
-        </w:pBdr>
-        <w:spacing w:before="100" w:beforeAutospacing="1" w:after="100" w:afterAutospacing="1" w:line="240" w:lineRule="auto"/>
-        <w:rPr>
-          <w:rFonts w:ascii="Times New Roman" w:eastAsia="Times New Roman" w:hAnsi="Times New Roman" w:cs="Times New Roman"/>
-          <w:kern w:val="0"/>
-          <w:lang w:val="en-GB" w:eastAsia="fr-FR"/>
-          <w14:ligatures w14:val="none"/>
-        </w:rPr>
-      </w:pPr>
-      <w:r>
-        <w:rPr>
-          <w:rFonts w:ascii="Times New Roman" w:eastAsia="Times New Roman" w:hAnsi="Times New Roman" w:cs="Times New Roman"/>
-          <w:kern w:val="0"/>
-          <w:lang w:val="en-GB" w:eastAsia="fr-FR"/>
-          <w14:ligatures w14:val="none"/>
-        </w:rPr>
-        <w:t xml:space="preserve">        let max = string/length(password)</w:t>
-      </w:r>
-    </w:p>
-    <w:p>
-      <w:pPr>
-        <w:pBdr>
-          <w:top w:val="single" w:sz="4" w:space="1" w:color="auto"/>
-          <w:left w:val="single" w:sz="4" w:space="1" w:color="auto"/>
-          <w:bottom w:val="single" w:sz="4" w:space="1" w:color="auto"/>
-          <w:right w:val="single" w:sz="4" w:space="1" w:color="auto"/>
-        </w:pBdr>
-        <w:spacing w:before="100" w:beforeAutospacing="1" w:after="100" w:afterAutospacing="1" w:line="240" w:lineRule="auto"/>
-        <w:rPr>
-          <w:rFonts w:ascii="Times New Roman" w:eastAsia="Times New Roman" w:hAnsi="Times New Roman" w:cs="Times New Roman"/>
-          <w:kern w:val="0"/>
-          <w:lang w:val="en-GB" w:eastAsia="fr-FR"/>
-          <w14:ligatures w14:val="none"/>
-        </w:rPr>
-      </w:pPr>
-    </w:p>
-    <w:p>
-      <w:pPr>
-        <w:pBdr>
-          <w:top w:val="single" w:sz="4" w:space="1" w:color="auto"/>
-          <w:left w:val="single" w:sz="4" w:space="1" w:color="auto"/>
-          <w:bottom w:val="single" w:sz="4" w:space="1" w:color="auto"/>
-          <w:right w:val="single" w:sz="4" w:space="1" w:color="auto"/>
-        </w:pBdr>
-        <w:spacing w:before="100" w:beforeAutospacing="1" w:after="100" w:afterAutospacing="1" w:line="240" w:lineRule="auto"/>
-        <w:rPr>
-          <w:rFonts w:ascii="Times New Roman" w:eastAsia="Times New Roman" w:hAnsi="Times New Roman" w:cs="Times New Roman"/>
-          <w:kern w:val="0"/>
-          <w:lang w:val="en-GB" w:eastAsia="fr-FR"/>
-          <w14:ligatures w14:val="none"/>
-        </w:rPr>
-      </w:pPr>
-      <w:r>
-        <w:rPr>
-          <w:rFonts w:ascii="Times New Roman" w:eastAsia="Times New Roman" w:hAnsi="Times New Roman" w:cs="Times New Roman"/>
-          <w:kern w:val="0"/>
-          <w:lang w:val="en-GB" w:eastAsia="fr-FR"/>
-          <w14:ligatures w14:val="none"/>
-        </w:rPr>
-        <w:t xml:space="preserve">        while math/less(i, max) {</w:t>
-      </w:r>
-    </w:p>
-    <w:p>
-      <w:pPr>
-        <w:pBdr>
-          <w:top w:val="single" w:sz="4" w:space="1" w:color="auto"/>
-          <w:left w:val="single" w:sz="4" w:space="1" w:color="auto"/>
-          <w:bottom w:val="single" w:sz="4" w:space="1" w:color="auto"/>
-          <w:right w:val="single" w:sz="4" w:space="1" w:color="auto"/>
-        </w:pBdr>
-        <w:spacing w:before="100" w:beforeAutospacing="1" w:after="100" w:afterAutospacing="1" w:line="240" w:lineRule="auto"/>
-        <w:rPr>
-          <w:rFonts w:ascii="Times New Roman" w:eastAsia="Times New Roman" w:hAnsi="Times New Roman" w:cs="Times New Roman"/>
-          <w:kern w:val="0"/>
-          <w:lang w:val="en-GB" w:eastAsia="fr-FR"/>
-          <w14:ligatures w14:val="none"/>
-        </w:rPr>
-      </w:pPr>
-      <w:r>
-        <w:rPr>
-          <w:rFonts w:ascii="Times New Roman" w:eastAsia="Times New Roman" w:hAnsi="Times New Roman" w:cs="Times New Roman"/>
-          <w:kern w:val="0"/>
-          <w:lang w:val="en-GB" w:eastAsia="fr-FR"/>
-          <w14:ligatures w14:val="none"/>
-        </w:rPr>
-        <w:t xml:space="preserve">            let ch = string/char-at(password, i)</w:t>
-      </w:r>
-    </w:p>
-    <w:p>
-      <w:pPr>
-        <w:pBdr>
-          <w:top w:val="single" w:sz="4" w:space="1" w:color="auto"/>
-          <w:left w:val="single" w:sz="4" w:space="1" w:color="auto"/>
-          <w:bottom w:val="single" w:sz="4" w:space="1" w:color="auto"/>
-          <w:right w:val="single" w:sz="4" w:space="1" w:color="auto"/>
-        </w:pBdr>
-        <w:spacing w:before="100" w:beforeAutospacing="1" w:after="100" w:afterAutospacing="1" w:line="240" w:lineRule="auto"/>
-        <w:rPr>
-          <w:rFonts w:ascii="Times New Roman" w:eastAsia="Times New Roman" w:hAnsi="Times New Roman" w:cs="Times New Roman"/>
-          <w:kern w:val="0"/>
-          <w:lang w:val="en-GB" w:eastAsia="fr-FR"/>
-          <w14:ligatures w14:val="none"/>
-        </w:rPr>
-      </w:pPr>
-    </w:p>
-    <w:p>
-      <w:pPr>
-        <w:pBdr>
-          <w:top w:val="single" w:sz="4" w:space="1" w:color="auto"/>
-          <w:left w:val="single" w:sz="4" w:space="1" w:color="auto"/>
-          <w:bottom w:val="single" w:sz="4" w:space="1" w:color="auto"/>
-          <w:right w:val="single" w:sz="4" w:space="1" w:color="auto"/>
-        </w:pBdr>
-        <w:spacing w:before="100" w:beforeAutospacing="1" w:after="100" w:afterAutospacing="1" w:line="240" w:lineRule="auto"/>
-        <w:rPr>
-          <w:rFonts w:ascii="Times New Roman" w:eastAsia="Times New Roman" w:hAnsi="Times New Roman" w:cs="Times New Roman"/>
-          <w:kern w:val="0"/>
-          <w:lang w:eastAsia="fr-FR"/>
-          <w14:ligatures w14:val="none"/>
-        </w:rPr>
-      </w:pPr>
-      <w:r>
-        <w:rPr>
-          <w:rFonts w:ascii="Times New Roman" w:eastAsia="Times New Roman" w:hAnsi="Times New Roman" w:cs="Times New Roman"/>
-          <w:kern w:val="0"/>
-          <w:lang w:val="en-GB" w:eastAsia="fr-FR"/>
-          <w14:ligatures w14:val="none"/>
-        </w:rPr>
-        <w:t xml:space="preserve">            </w:t>
-      </w:r>
-      <w:r>
-        <w:rPr>
-          <w:rFonts w:ascii="Times New Roman" w:eastAsia="Times New Roman" w:hAnsi="Times New Roman" w:cs="Times New Roman"/>
-          <w:kern w:val="0"/>
-          <w:lang w:eastAsia="fr-FR"/>
-          <w14:ligatures w14:val="none"/>
-        </w:rPr>
-        <w:t>// Vérifie si le caractère est une majuscule simple</w:t>
-      </w:r>
-    </w:p>
-    <w:p>
-      <w:pPr>
-        <w:pBdr>
-          <w:top w:val="single" w:sz="4" w:space="1" w:color="auto"/>
-          <w:left w:val="single" w:sz="4" w:space="1" w:color="auto"/>
-          <w:bottom w:val="single" w:sz="4" w:space="1" w:color="auto"/>
-          <w:right w:val="single" w:sz="4" w:space="1" w:color="auto"/>
-        </w:pBdr>
-        <w:spacing w:before="100" w:beforeAutospacing="1" w:after="100" w:afterAutospacing="1" w:line="240" w:lineRule="auto"/>
-        <w:rPr>
-          <w:rFonts w:ascii="Times New Roman" w:eastAsia="Times New Roman" w:hAnsi="Times New Roman" w:cs="Times New Roman"/>
-          <w:kern w:val="0"/>
-          <w:lang w:val="en-GB" w:eastAsia="fr-FR"/>
-          <w14:ligatures w14:val="none"/>
-        </w:rPr>
-      </w:pPr>
-      <w:r>
-        <w:rPr>
-          <w:rFonts w:ascii="Times New Roman" w:eastAsia="Times New Roman" w:hAnsi="Times New Roman" w:cs="Times New Roman"/>
-          <w:kern w:val="0"/>
-          <w:lang w:eastAsia="fr-FR"/>
-          <w14:ligatures w14:val="none"/>
-        </w:rPr>
-        <w:t xml:space="preserve">            </w:t>
-      </w:r>
-      <w:r>
-        <w:rPr>
-          <w:rFonts w:ascii="Times New Roman" w:eastAsia="Times New Roman" w:hAnsi="Times New Roman" w:cs="Times New Roman"/>
-          <w:kern w:val="0"/>
-          <w:lang w:val="en-GB" w:eastAsia="fr-FR"/>
-          <w14:ligatures w14:val="none"/>
-        </w:rPr>
-        <w:t>// (A, B, C, ... Z)</w:t>
-      </w:r>
-    </w:p>
-    <w:p>
-      <w:pPr>
-        <w:pBdr>
-          <w:top w:val="single" w:sz="4" w:space="1" w:color="auto"/>
-          <w:left w:val="single" w:sz="4" w:space="1" w:color="auto"/>
-          <w:bottom w:val="single" w:sz="4" w:space="1" w:color="auto"/>
-          <w:right w:val="single" w:sz="4" w:space="1" w:color="auto"/>
-        </w:pBdr>
-        <w:spacing w:before="100" w:beforeAutospacing="1" w:after="100" w:afterAutospacing="1" w:line="240" w:lineRule="auto"/>
-        <w:rPr>
-          <w:rFonts w:ascii="Times New Roman" w:eastAsia="Times New Roman" w:hAnsi="Times New Roman" w:cs="Times New Roman"/>
-          <w:kern w:val="0"/>
-          <w:lang w:val="en-GB" w:eastAsia="fr-FR"/>
-          <w14:ligatures w14:val="none"/>
-        </w:rPr>
-      </w:pPr>
-      <w:r>
-        <w:rPr>
-          <w:rFonts w:ascii="Times New Roman" w:eastAsia="Times New Roman" w:hAnsi="Times New Roman" w:cs="Times New Roman"/>
-          <w:kern w:val="0"/>
-          <w:lang w:val="en-GB" w:eastAsia="fr-FR"/>
-          <w14:ligatures w14:val="none"/>
-        </w:rPr>
-        <w:t xml:space="preserve">            if string/equals(ch, "A") or</w:t>
-      </w:r>
-    </w:p>
-    <w:p>
-      <w:pPr>
-        <w:pBdr>
-          <w:top w:val="single" w:sz="4" w:space="1" w:color="auto"/>
-          <w:left w:val="single" w:sz="4" w:space="1" w:color="auto"/>
-          <w:bottom w:val="single" w:sz="4" w:space="1" w:color="auto"/>
-          <w:right w:val="single" w:sz="4" w:space="1" w:color="auto"/>
-        </w:pBdr>
-        <w:spacing w:before="100" w:beforeAutospacing="1" w:after="100" w:afterAutospacing="1" w:line="240" w:lineRule="auto"/>
-        <w:rPr>
-          <w:rFonts w:ascii="Times New Roman" w:eastAsia="Times New Roman" w:hAnsi="Times New Roman" w:cs="Times New Roman"/>
-          <w:kern w:val="0"/>
-          <w:lang w:val="en-GB" w:eastAsia="fr-FR"/>
-          <w14:ligatures w14:val="none"/>
-        </w:rPr>
-      </w:pPr>
-      <w:r>
-        <w:rPr>
-          <w:rFonts w:ascii="Times New Roman" w:eastAsia="Times New Roman" w:hAnsi="Times New Roman" w:cs="Times New Roman"/>
-          <w:kern w:val="0"/>
-          <w:lang w:val="en-GB" w:eastAsia="fr-FR"/>
-          <w14:ligatures w14:val="none"/>
-        </w:rPr>
-        <w:t xml:space="preserve">               string/equals(ch, "B") or</w:t>
-      </w:r>
-    </w:p>
-    <w:p>
-      <w:pPr>
-        <w:pBdr>
-          <w:top w:val="single" w:sz="4" w:space="1" w:color="auto"/>
-          <w:left w:val="single" w:sz="4" w:space="1" w:color="auto"/>
-          <w:bottom w:val="single" w:sz="4" w:space="1" w:color="auto"/>
-          <w:right w:val="single" w:sz="4" w:space="1" w:color="auto"/>
-        </w:pBdr>
-        <w:spacing w:before="100" w:beforeAutospacing="1" w:after="100" w:afterAutospacing="1" w:line="240" w:lineRule="auto"/>
-        <w:rPr>
-          <w:rFonts w:ascii="Times New Roman" w:eastAsia="Times New Roman" w:hAnsi="Times New Roman" w:cs="Times New Roman"/>
-          <w:kern w:val="0"/>
-          <w:lang w:val="en-GB" w:eastAsia="fr-FR"/>
-          <w14:ligatures w14:val="none"/>
-        </w:rPr>
-      </w:pPr>
-      <w:r>
-        <w:rPr>
-          <w:rFonts w:ascii="Times New Roman" w:eastAsia="Times New Roman" w:hAnsi="Times New Roman" w:cs="Times New Roman"/>
-          <w:kern w:val="0"/>
-          <w:lang w:val="en-GB" w:eastAsia="fr-FR"/>
-          <w14:ligatures w14:val="none"/>
-        </w:rPr>
-        <w:t xml:space="preserve">               string/equals(ch, "C") or</w:t>
-      </w:r>
-    </w:p>
-    <w:p>
-      <w:pPr>
-        <w:pBdr>
-          <w:top w:val="single" w:sz="4" w:space="1" w:color="auto"/>
-          <w:left w:val="single" w:sz="4" w:space="1" w:color="auto"/>
-          <w:bottom w:val="single" w:sz="4" w:space="1" w:color="auto"/>
-          <w:right w:val="single" w:sz="4" w:space="1" w:color="auto"/>
-        </w:pBdr>
-        <w:spacing w:before="100" w:beforeAutospacing="1" w:after="100" w:afterAutospacing="1" w:line="240" w:lineRule="auto"/>
-        <w:rPr>
-          <w:rFonts w:ascii="Times New Roman" w:eastAsia="Times New Roman" w:hAnsi="Times New Roman" w:cs="Times New Roman"/>
-          <w:kern w:val="0"/>
-          <w:lang w:val="en-GB" w:eastAsia="fr-FR"/>
-          <w14:ligatures w14:val="none"/>
-        </w:rPr>
-      </w:pPr>
-      <w:r>
-        <w:rPr>
-          <w:rFonts w:ascii="Times New Roman" w:eastAsia="Times New Roman" w:hAnsi="Times New Roman" w:cs="Times New Roman"/>
-          <w:kern w:val="0"/>
-          <w:lang w:val="en-GB" w:eastAsia="fr-FR"/>
-          <w14:ligatures w14:val="none"/>
-        </w:rPr>
-        <w:t xml:space="preserve">               string/equals(ch, "D") or</w:t>
-      </w:r>
-    </w:p>
-    <w:p>
-      <w:pPr>
-        <w:pBdr>
-          <w:top w:val="single" w:sz="4" w:space="1" w:color="auto"/>
-          <w:left w:val="single" w:sz="4" w:space="1" w:color="auto"/>
-          <w:bottom w:val="single" w:sz="4" w:space="1" w:color="auto"/>
-          <w:right w:val="single" w:sz="4" w:space="1" w:color="auto"/>
-        </w:pBdr>
-        <w:spacing w:before="100" w:beforeAutospacing="1" w:after="100" w:afterAutospacing="1" w:line="240" w:lineRule="auto"/>
-        <w:rPr>
-          <w:rFonts w:ascii="Times New Roman" w:eastAsia="Times New Roman" w:hAnsi="Times New Roman" w:cs="Times New Roman"/>
-          <w:kern w:val="0"/>
-          <w:lang w:val="en-GB" w:eastAsia="fr-FR"/>
-          <w14:ligatures w14:val="none"/>
-        </w:rPr>
-      </w:pPr>
-      <w:r>
-        <w:rPr>
-          <w:rFonts w:ascii="Times New Roman" w:eastAsia="Times New Roman" w:hAnsi="Times New Roman" w:cs="Times New Roman"/>
-          <w:kern w:val="0"/>
-          <w:lang w:val="en-GB" w:eastAsia="fr-FR"/>
-          <w14:ligatures w14:val="none"/>
-        </w:rPr>
-        <w:t xml:space="preserve">               string/equals(ch, "E") or</w:t>
-      </w:r>
-    </w:p>
-    <w:p>
-      <w:pPr>
-        <w:pBdr>
-          <w:top w:val="single" w:sz="4" w:space="1" w:color="auto"/>
-          <w:left w:val="single" w:sz="4" w:space="1" w:color="auto"/>
-          <w:bottom w:val="single" w:sz="4" w:space="1" w:color="auto"/>
-          <w:right w:val="single" w:sz="4" w:space="1" w:color="auto"/>
-        </w:pBdr>
-        <w:spacing w:before="100" w:beforeAutospacing="1" w:after="100" w:afterAutospacing="1" w:line="240" w:lineRule="auto"/>
-        <w:rPr>
-          <w:rFonts w:ascii="Times New Roman" w:eastAsia="Times New Roman" w:hAnsi="Times New Roman" w:cs="Times New Roman"/>
-          <w:kern w:val="0"/>
-          <w:lang w:val="en-GB" w:eastAsia="fr-FR"/>
-          <w14:ligatures w14:val="none"/>
-        </w:rPr>
-      </w:pPr>
-      <w:r>
-        <w:rPr>
-          <w:rFonts w:ascii="Times New Roman" w:eastAsia="Times New Roman" w:hAnsi="Times New Roman" w:cs="Times New Roman"/>
-          <w:kern w:val="0"/>
-          <w:lang w:val="en-GB" w:eastAsia="fr-FR"/>
-          <w14:ligatures w14:val="none"/>
-        </w:rPr>
-        <w:t xml:space="preserve">               string/equals(ch, "F") or</w:t>
-      </w:r>
-    </w:p>
-    <w:p>
-      <w:pPr>
-        <w:pBdr>
-          <w:top w:val="single" w:sz="4" w:space="1" w:color="auto"/>
-          <w:left w:val="single" w:sz="4" w:space="1" w:color="auto"/>
-          <w:bottom w:val="single" w:sz="4" w:space="1" w:color="auto"/>
-          <w:right w:val="single" w:sz="4" w:space="1" w:color="auto"/>
-        </w:pBdr>
-        <w:spacing w:before="100" w:beforeAutospacing="1" w:after="100" w:afterAutospacing="1" w:line="240" w:lineRule="auto"/>
-        <w:rPr>
-          <w:rFonts w:ascii="Times New Roman" w:eastAsia="Times New Roman" w:hAnsi="Times New Roman" w:cs="Times New Roman"/>
-          <w:kern w:val="0"/>
-          <w:lang w:val="en-GB" w:eastAsia="fr-FR"/>
-          <w14:ligatures w14:val="none"/>
-        </w:rPr>
-      </w:pPr>
-      <w:r>
-        <w:rPr>
-          <w:rFonts w:ascii="Times New Roman" w:eastAsia="Times New Roman" w:hAnsi="Times New Roman" w:cs="Times New Roman"/>
-          <w:kern w:val="0"/>
-          <w:lang w:val="en-GB" w:eastAsia="fr-FR"/>
-          <w14:ligatures w14:val="none"/>
-        </w:rPr>
-        <w:t xml:space="preserve">               string/equals(ch, "G") or</w:t>
-      </w:r>
-    </w:p>
-    <w:p>
-      <w:pPr>
-        <w:pBdr>
-          <w:top w:val="single" w:sz="4" w:space="1" w:color="auto"/>
-          <w:left w:val="single" w:sz="4" w:space="1" w:color="auto"/>
-          <w:bottom w:val="single" w:sz="4" w:space="1" w:color="auto"/>
-          <w:right w:val="single" w:sz="4" w:space="1" w:color="auto"/>
-        </w:pBdr>
-        <w:spacing w:before="100" w:beforeAutospacing="1" w:after="100" w:afterAutospacing="1" w:line="240" w:lineRule="auto"/>
-        <w:rPr>
-          <w:rFonts w:ascii="Times New Roman" w:eastAsia="Times New Roman" w:hAnsi="Times New Roman" w:cs="Times New Roman"/>
-          <w:kern w:val="0"/>
-          <w:lang w:val="en-GB" w:eastAsia="fr-FR"/>
-          <w14:ligatures w14:val="none"/>
-        </w:rPr>
-      </w:pPr>
-      <w:r>
-        <w:rPr>
-          <w:rFonts w:ascii="Times New Roman" w:eastAsia="Times New Roman" w:hAnsi="Times New Roman" w:cs="Times New Roman"/>
-          <w:kern w:val="0"/>
-          <w:lang w:val="en-GB" w:eastAsia="fr-FR"/>
-          <w14:ligatures w14:val="none"/>
-        </w:rPr>
-        <w:t xml:space="preserve">               string/equals(ch, "H") or</w:t>
-      </w:r>
-    </w:p>
-    <w:p>
-      <w:pPr>
-        <w:pBdr>
-          <w:top w:val="single" w:sz="4" w:space="1" w:color="auto"/>
-          <w:left w:val="single" w:sz="4" w:space="1" w:color="auto"/>
-          <w:bottom w:val="single" w:sz="4" w:space="1" w:color="auto"/>
-          <w:right w:val="single" w:sz="4" w:space="1" w:color="auto"/>
-        </w:pBdr>
-        <w:spacing w:before="100" w:beforeAutospacing="1" w:after="100" w:afterAutospacing="1" w:line="240" w:lineRule="auto"/>
-        <w:rPr>
-          <w:rFonts w:ascii="Times New Roman" w:eastAsia="Times New Roman" w:hAnsi="Times New Roman" w:cs="Times New Roman"/>
-          <w:kern w:val="0"/>
-          <w:lang w:val="en-GB" w:eastAsia="fr-FR"/>
-          <w14:ligatures w14:val="none"/>
-        </w:rPr>
-      </w:pPr>
-      <w:r>
-        <w:rPr>
-          <w:rFonts w:ascii="Times New Roman" w:eastAsia="Times New Roman" w:hAnsi="Times New Roman" w:cs="Times New Roman"/>
-          <w:kern w:val="0"/>
-          <w:lang w:val="en-GB" w:eastAsia="fr-FR"/>
-          <w14:ligatures w14:val="none"/>
-        </w:rPr>
-        <w:t xml:space="preserve">               string/equals(ch, "I") or</w:t>
-      </w:r>
-    </w:p>
-    <w:p>
-      <w:pPr>
-        <w:pBdr>
-          <w:top w:val="single" w:sz="4" w:space="1" w:color="auto"/>
-          <w:left w:val="single" w:sz="4" w:space="1" w:color="auto"/>
-          <w:bottom w:val="single" w:sz="4" w:space="1" w:color="auto"/>
-          <w:right w:val="single" w:sz="4" w:space="1" w:color="auto"/>
-        </w:pBdr>
-        <w:spacing w:before="100" w:beforeAutospacing="1" w:after="100" w:afterAutospacing="1" w:line="240" w:lineRule="auto"/>
-        <w:rPr>
-          <w:rFonts w:ascii="Times New Roman" w:eastAsia="Times New Roman" w:hAnsi="Times New Roman" w:cs="Times New Roman"/>
-          <w:kern w:val="0"/>
-          <w:lang w:val="en-GB" w:eastAsia="fr-FR"/>
-          <w14:ligatures w14:val="none"/>
-        </w:rPr>
-      </w:pPr>
-      <w:r>
-        <w:rPr>
-          <w:rFonts w:ascii="Times New Roman" w:eastAsia="Times New Roman" w:hAnsi="Times New Roman" w:cs="Times New Roman"/>
-          <w:kern w:val="0"/>
-          <w:lang w:val="en-GB" w:eastAsia="fr-FR"/>
-          <w14:ligatures w14:val="none"/>
-        </w:rPr>
-        <w:t xml:space="preserve">               string/equals(ch, "J") or</w:t>
-      </w:r>
-    </w:p>
-    <w:p>
-      <w:pPr>
-        <w:pBdr>
-          <w:top w:val="single" w:sz="4" w:space="1" w:color="auto"/>
-          <w:left w:val="single" w:sz="4" w:space="1" w:color="auto"/>
-          <w:bottom w:val="single" w:sz="4" w:space="1" w:color="auto"/>
-          <w:right w:val="single" w:sz="4" w:space="1" w:color="auto"/>
-        </w:pBdr>
-        <w:spacing w:before="100" w:beforeAutospacing="1" w:after="100" w:afterAutospacing="1" w:line="240" w:lineRule="auto"/>
-        <w:rPr>
-          <w:rFonts w:ascii="Times New Roman" w:eastAsia="Times New Roman" w:hAnsi="Times New Roman" w:cs="Times New Roman"/>
-          <w:kern w:val="0"/>
-          <w:lang w:val="en-GB" w:eastAsia="fr-FR"/>
-          <w14:ligatures w14:val="none"/>
-        </w:rPr>
-      </w:pPr>
-      <w:r>
-        <w:rPr>
-          <w:rFonts w:ascii="Times New Roman" w:eastAsia="Times New Roman" w:hAnsi="Times New Roman" w:cs="Times New Roman"/>
-          <w:kern w:val="0"/>
-          <w:lang w:val="en-GB" w:eastAsia="fr-FR"/>
-          <w14:ligatures w14:val="none"/>
-        </w:rPr>
-        <w:t xml:space="preserve">               string/equals(ch, "K") or</w:t>
-      </w:r>
-    </w:p>
-    <w:p>
-      <w:pPr>
-        <w:pBdr>
-          <w:top w:val="single" w:sz="4" w:space="1" w:color="auto"/>
-          <w:left w:val="single" w:sz="4" w:space="1" w:color="auto"/>
-          <w:bottom w:val="single" w:sz="4" w:space="1" w:color="auto"/>
-          <w:right w:val="single" w:sz="4" w:space="1" w:color="auto"/>
-        </w:pBdr>
-        <w:spacing w:before="100" w:beforeAutospacing="1" w:after="100" w:afterAutospacing="1" w:line="240" w:lineRule="auto"/>
-        <w:rPr>
-          <w:rFonts w:ascii="Times New Roman" w:eastAsia="Times New Roman" w:hAnsi="Times New Roman" w:cs="Times New Roman"/>
-          <w:kern w:val="0"/>
-          <w:lang w:val="en-GB" w:eastAsia="fr-FR"/>
-          <w14:ligatures w14:val="none"/>
-        </w:rPr>
-      </w:pPr>
-      <w:r>
-        <w:rPr>
-          <w:rFonts w:ascii="Times New Roman" w:eastAsia="Times New Roman" w:hAnsi="Times New Roman" w:cs="Times New Roman"/>
-          <w:kern w:val="0"/>
-          <w:lang w:val="en-GB" w:eastAsia="fr-FR"/>
-          <w14:ligatures w14:val="none"/>
-        </w:rPr>
-        <w:t xml:space="preserve">               string/equals(ch, "L") or</w:t>
-      </w:r>
-    </w:p>
-    <w:p>
-      <w:pPr>
-        <w:pBdr>
-          <w:top w:val="single" w:sz="4" w:space="1" w:color="auto"/>
-          <w:left w:val="single" w:sz="4" w:space="1" w:color="auto"/>
-          <w:bottom w:val="single" w:sz="4" w:space="1" w:color="auto"/>
-          <w:right w:val="single" w:sz="4" w:space="1" w:color="auto"/>
-        </w:pBdr>
-        <w:spacing w:before="100" w:beforeAutospacing="1" w:after="100" w:afterAutospacing="1" w:line="240" w:lineRule="auto"/>
-        <w:rPr>
-          <w:rFonts w:ascii="Times New Roman" w:eastAsia="Times New Roman" w:hAnsi="Times New Roman" w:cs="Times New Roman"/>
-          <w:kern w:val="0"/>
-          <w:lang w:val="en-GB" w:eastAsia="fr-FR"/>
-          <w14:ligatures w14:val="none"/>
-        </w:rPr>
-      </w:pPr>
-      <w:r>
-        <w:rPr>
-          <w:rFonts w:ascii="Times New Roman" w:eastAsia="Times New Roman" w:hAnsi="Times New Roman" w:cs="Times New Roman"/>
-          <w:kern w:val="0"/>
-          <w:lang w:val="en-GB" w:eastAsia="fr-FR"/>
-          <w14:ligatures w14:val="none"/>
-        </w:rPr>
-        <w:t xml:space="preserve">               string/equals(ch, "M") or</w:t>
-      </w:r>
-    </w:p>
-    <w:p>
-      <w:pPr>
-        <w:pBdr>
-          <w:top w:val="single" w:sz="4" w:space="1" w:color="auto"/>
-          <w:left w:val="single" w:sz="4" w:space="1" w:color="auto"/>
-          <w:bottom w:val="single" w:sz="4" w:space="1" w:color="auto"/>
-          <w:right w:val="single" w:sz="4" w:space="1" w:color="auto"/>
-        </w:pBdr>
-        <w:spacing w:before="100" w:beforeAutospacing="1" w:after="100" w:afterAutospacing="1" w:line="240" w:lineRule="auto"/>
-        <w:rPr>
-          <w:rFonts w:ascii="Times New Roman" w:eastAsia="Times New Roman" w:hAnsi="Times New Roman" w:cs="Times New Roman"/>
-          <w:kern w:val="0"/>
-          <w:lang w:val="en-GB" w:eastAsia="fr-FR"/>
-          <w14:ligatures w14:val="none"/>
-        </w:rPr>
-      </w:pPr>
-      <w:r>
-        <w:rPr>
-          <w:rFonts w:ascii="Times New Roman" w:eastAsia="Times New Roman" w:hAnsi="Times New Roman" w:cs="Times New Roman"/>
-          <w:kern w:val="0"/>
-          <w:lang w:val="en-GB" w:eastAsia="fr-FR"/>
-          <w14:ligatures w14:val="none"/>
-        </w:rPr>
-        <w:t xml:space="preserve">               string/equals(ch, "N") or</w:t>
-      </w:r>
-    </w:p>
-    <w:p>
-      <w:pPr>
-        <w:pBdr>
-          <w:top w:val="single" w:sz="4" w:space="1" w:color="auto"/>
-          <w:left w:val="single" w:sz="4" w:space="1" w:color="auto"/>
-          <w:bottom w:val="single" w:sz="4" w:space="1" w:color="auto"/>
-          <w:right w:val="single" w:sz="4" w:space="1" w:color="auto"/>
-        </w:pBdr>
-        <w:spacing w:before="100" w:beforeAutospacing="1" w:after="100" w:afterAutospacing="1" w:line="240" w:lineRule="auto"/>
-        <w:rPr>
-          <w:rFonts w:ascii="Times New Roman" w:eastAsia="Times New Roman" w:hAnsi="Times New Roman" w:cs="Times New Roman"/>
-          <w:kern w:val="0"/>
-          <w:lang w:val="en-GB" w:eastAsia="fr-FR"/>
-          <w14:ligatures w14:val="none"/>
-        </w:rPr>
-      </w:pPr>
-      <w:r>
-        <w:rPr>
-          <w:rFonts w:ascii="Times New Roman" w:eastAsia="Times New Roman" w:hAnsi="Times New Roman" w:cs="Times New Roman"/>
-          <w:kern w:val="0"/>
-          <w:lang w:val="en-GB" w:eastAsia="fr-FR"/>
-          <w14:ligatures w14:val="none"/>
-        </w:rPr>
-        <w:lastRenderedPageBreak/>
-        <w:t xml:space="preserve">               string/equals(ch, "O") or</w:t>
-      </w:r>
-    </w:p>
-    <w:p>
-      <w:pPr>
-        <w:pBdr>
-          <w:top w:val="single" w:sz="4" w:space="1" w:color="auto"/>
-          <w:left w:val="single" w:sz="4" w:space="1" w:color="auto"/>
-          <w:bottom w:val="single" w:sz="4" w:space="1" w:color="auto"/>
-          <w:right w:val="single" w:sz="4" w:space="1" w:color="auto"/>
-        </w:pBdr>
-        <w:spacing w:before="100" w:beforeAutospacing="1" w:after="100" w:afterAutospacing="1" w:line="240" w:lineRule="auto"/>
-        <w:rPr>
-          <w:rFonts w:ascii="Times New Roman" w:eastAsia="Times New Roman" w:hAnsi="Times New Roman" w:cs="Times New Roman"/>
-          <w:kern w:val="0"/>
-          <w:lang w:val="en-GB" w:eastAsia="fr-FR"/>
-          <w14:ligatures w14:val="none"/>
-        </w:rPr>
-      </w:pPr>
-      <w:r>
-        <w:rPr>
-          <w:rFonts w:ascii="Times New Roman" w:eastAsia="Times New Roman" w:hAnsi="Times New Roman" w:cs="Times New Roman"/>
-          <w:kern w:val="0"/>
-          <w:lang w:val="en-GB" w:eastAsia="fr-FR"/>
-          <w14:ligatures w14:val="none"/>
-        </w:rPr>
-        <w:t xml:space="preserve">               string/equals(ch, "P") or</w:t>
-      </w:r>
-    </w:p>
-    <w:p>
-      <w:pPr>
-        <w:pBdr>
-          <w:top w:val="single" w:sz="4" w:space="1" w:color="auto"/>
-          <w:left w:val="single" w:sz="4" w:space="1" w:color="auto"/>
-          <w:bottom w:val="single" w:sz="4" w:space="1" w:color="auto"/>
-          <w:right w:val="single" w:sz="4" w:space="1" w:color="auto"/>
-        </w:pBdr>
-        <w:spacing w:before="100" w:beforeAutospacing="1" w:after="100" w:afterAutospacing="1" w:line="240" w:lineRule="auto"/>
-        <w:rPr>
-          <w:rFonts w:ascii="Times New Roman" w:eastAsia="Times New Roman" w:hAnsi="Times New Roman" w:cs="Times New Roman"/>
-          <w:kern w:val="0"/>
-          <w:lang w:val="en-GB" w:eastAsia="fr-FR"/>
-          <w14:ligatures w14:val="none"/>
-        </w:rPr>
-      </w:pPr>
-      <w:r>
-        <w:rPr>
-          <w:rFonts w:ascii="Times New Roman" w:eastAsia="Times New Roman" w:hAnsi="Times New Roman" w:cs="Times New Roman"/>
-          <w:kern w:val="0"/>
-          <w:lang w:val="en-GB" w:eastAsia="fr-FR"/>
-          <w14:ligatures w14:val="none"/>
-        </w:rPr>
-        <w:t xml:space="preserve">               string/equals(ch, "Q") or</w:t>
-      </w:r>
-    </w:p>
-    <w:p>
-      <w:pPr>
-        <w:pBdr>
-          <w:top w:val="single" w:sz="4" w:space="1" w:color="auto"/>
-          <w:left w:val="single" w:sz="4" w:space="1" w:color="auto"/>
-          <w:bottom w:val="single" w:sz="4" w:space="1" w:color="auto"/>
-          <w:right w:val="single" w:sz="4" w:space="1" w:color="auto"/>
-        </w:pBdr>
-        <w:spacing w:before="100" w:beforeAutospacing="1" w:after="100" w:afterAutospacing="1" w:line="240" w:lineRule="auto"/>
-        <w:rPr>
-          <w:rFonts w:ascii="Times New Roman" w:eastAsia="Times New Roman" w:hAnsi="Times New Roman" w:cs="Times New Roman"/>
-          <w:kern w:val="0"/>
-          <w:lang w:val="en-GB" w:eastAsia="fr-FR"/>
-          <w14:ligatures w14:val="none"/>
-        </w:rPr>
-      </w:pPr>
-      <w:r>
-        <w:rPr>
-          <w:rFonts w:ascii="Times New Roman" w:eastAsia="Times New Roman" w:hAnsi="Times New Roman" w:cs="Times New Roman"/>
-          <w:kern w:val="0"/>
-          <w:lang w:val="en-GB" w:eastAsia="fr-FR"/>
-          <w14:ligatures w14:val="none"/>
-        </w:rPr>
-        <w:t xml:space="preserve">               string/equals(ch, "R") or</w:t>
-      </w:r>
-    </w:p>
-    <w:p>
-      <w:pPr>
-        <w:pBdr>
-          <w:top w:val="single" w:sz="4" w:space="1" w:color="auto"/>
-          <w:left w:val="single" w:sz="4" w:space="1" w:color="auto"/>
-          <w:bottom w:val="single" w:sz="4" w:space="1" w:color="auto"/>
-          <w:right w:val="single" w:sz="4" w:space="1" w:color="auto"/>
-        </w:pBdr>
-        <w:spacing w:before="100" w:beforeAutospacing="1" w:after="100" w:afterAutospacing="1" w:line="240" w:lineRule="auto"/>
-        <w:rPr>
-          <w:rFonts w:ascii="Times New Roman" w:eastAsia="Times New Roman" w:hAnsi="Times New Roman" w:cs="Times New Roman"/>
-          <w:kern w:val="0"/>
-          <w:lang w:val="en-GB" w:eastAsia="fr-FR"/>
-          <w14:ligatures w14:val="none"/>
-        </w:rPr>
-      </w:pPr>
-      <w:r>
-        <w:rPr>
-          <w:rFonts w:ascii="Times New Roman" w:eastAsia="Times New Roman" w:hAnsi="Times New Roman" w:cs="Times New Roman"/>
-          <w:kern w:val="0"/>
-          <w:lang w:val="en-GB" w:eastAsia="fr-FR"/>
-          <w14:ligatures w14:val="none"/>
-        </w:rPr>
-        <w:t xml:space="preserve">               string/equals(ch, "S") or</w:t>
-      </w:r>
-    </w:p>
-    <w:p>
-      <w:pPr>
-        <w:pBdr>
-          <w:top w:val="single" w:sz="4" w:space="1" w:color="auto"/>
-          <w:left w:val="single" w:sz="4" w:space="1" w:color="auto"/>
-          <w:bottom w:val="single" w:sz="4" w:space="1" w:color="auto"/>
-          <w:right w:val="single" w:sz="4" w:space="1" w:color="auto"/>
-        </w:pBdr>
-        <w:spacing w:before="100" w:beforeAutospacing="1" w:after="100" w:afterAutospacing="1" w:line="240" w:lineRule="auto"/>
-        <w:rPr>
-          <w:rFonts w:ascii="Times New Roman" w:eastAsia="Times New Roman" w:hAnsi="Times New Roman" w:cs="Times New Roman"/>
-          <w:kern w:val="0"/>
-          <w:lang w:val="en-GB" w:eastAsia="fr-FR"/>
-          <w14:ligatures w14:val="none"/>
-        </w:rPr>
-      </w:pPr>
-      <w:r>
-        <w:rPr>
-          <w:rFonts w:ascii="Times New Roman" w:eastAsia="Times New Roman" w:hAnsi="Times New Roman" w:cs="Times New Roman"/>
-          <w:kern w:val="0"/>
-          <w:lang w:val="en-GB" w:eastAsia="fr-FR"/>
-          <w14:ligatures w14:val="none"/>
-        </w:rPr>
-        <w:t xml:space="preserve">               string/equals(ch, "T") or</w:t>
-      </w:r>
-    </w:p>
-    <w:p>
-      <w:pPr>
-        <w:pBdr>
-          <w:top w:val="single" w:sz="4" w:space="1" w:color="auto"/>
-          <w:left w:val="single" w:sz="4" w:space="1" w:color="auto"/>
-          <w:bottom w:val="single" w:sz="4" w:space="1" w:color="auto"/>
-          <w:right w:val="single" w:sz="4" w:space="1" w:color="auto"/>
-        </w:pBdr>
-        <w:spacing w:before="100" w:beforeAutospacing="1" w:after="100" w:afterAutospacing="1" w:line="240" w:lineRule="auto"/>
-        <w:rPr>
-          <w:rFonts w:ascii="Times New Roman" w:eastAsia="Times New Roman" w:hAnsi="Times New Roman" w:cs="Times New Roman"/>
-          <w:kern w:val="0"/>
-          <w:lang w:val="en-GB" w:eastAsia="fr-FR"/>
-          <w14:ligatures w14:val="none"/>
-        </w:rPr>
-      </w:pPr>
-      <w:r>
-        <w:rPr>
-          <w:rFonts w:ascii="Times New Roman" w:eastAsia="Times New Roman" w:hAnsi="Times New Roman" w:cs="Times New Roman"/>
-          <w:kern w:val="0"/>
-          <w:lang w:val="en-GB" w:eastAsia="fr-FR"/>
-          <w14:ligatures w14:val="none"/>
-        </w:rPr>
-        <w:t xml:space="preserve">               string/equals(ch, "U") or</w:t>
-      </w:r>
-    </w:p>
-    <w:p>
-      <w:pPr>
-        <w:pBdr>
-          <w:top w:val="single" w:sz="4" w:space="1" w:color="auto"/>
-          <w:left w:val="single" w:sz="4" w:space="1" w:color="auto"/>
-          <w:bottom w:val="single" w:sz="4" w:space="1" w:color="auto"/>
-          <w:right w:val="single" w:sz="4" w:space="1" w:color="auto"/>
-        </w:pBdr>
-        <w:spacing w:before="100" w:beforeAutospacing="1" w:after="100" w:afterAutospacing="1" w:line="240" w:lineRule="auto"/>
-        <w:rPr>
-          <w:rFonts w:ascii="Times New Roman" w:eastAsia="Times New Roman" w:hAnsi="Times New Roman" w:cs="Times New Roman"/>
-          <w:kern w:val="0"/>
-          <w:lang w:val="en-GB" w:eastAsia="fr-FR"/>
-          <w14:ligatures w14:val="none"/>
-        </w:rPr>
-      </w:pPr>
-      <w:r>
-        <w:rPr>
-          <w:rFonts w:ascii="Times New Roman" w:eastAsia="Times New Roman" w:hAnsi="Times New Roman" w:cs="Times New Roman"/>
-          <w:kern w:val="0"/>
-          <w:lang w:val="en-GB" w:eastAsia="fr-FR"/>
-          <w14:ligatures w14:val="none"/>
-        </w:rPr>
-        <w:t xml:space="preserve">               string/equals(ch, "V") or</w:t>
-      </w:r>
-    </w:p>
-    <w:p>
-      <w:pPr>
-        <w:pBdr>
-          <w:top w:val="single" w:sz="4" w:space="1" w:color="auto"/>
-          <w:left w:val="single" w:sz="4" w:space="1" w:color="auto"/>
-          <w:bottom w:val="single" w:sz="4" w:space="1" w:color="auto"/>
-          <w:right w:val="single" w:sz="4" w:space="1" w:color="auto"/>
-        </w:pBdr>
-        <w:spacing w:before="100" w:beforeAutospacing="1" w:after="100" w:afterAutospacing="1" w:line="240" w:lineRule="auto"/>
-        <w:rPr>
-          <w:rFonts w:ascii="Times New Roman" w:eastAsia="Times New Roman" w:hAnsi="Times New Roman" w:cs="Times New Roman"/>
-          <w:kern w:val="0"/>
-          <w:lang w:val="en-GB" w:eastAsia="fr-FR"/>
-          <w14:ligatures w14:val="none"/>
-        </w:rPr>
-      </w:pPr>
-      <w:r>
-        <w:rPr>
-          <w:rFonts w:ascii="Times New Roman" w:eastAsia="Times New Roman" w:hAnsi="Times New Roman" w:cs="Times New Roman"/>
-          <w:kern w:val="0"/>
-          <w:lang w:val="en-GB" w:eastAsia="fr-FR"/>
-          <w14:ligatures w14:val="none"/>
-        </w:rPr>
-        <w:t xml:space="preserve">               string/equals(ch, "W") or</w:t>
-      </w:r>
-    </w:p>
-    <w:p>
-      <w:pPr>
-        <w:pBdr>
-          <w:top w:val="single" w:sz="4" w:space="1" w:color="auto"/>
-          <w:left w:val="single" w:sz="4" w:space="1" w:color="auto"/>
-          <w:bottom w:val="single" w:sz="4" w:space="1" w:color="auto"/>
-          <w:right w:val="single" w:sz="4" w:space="1" w:color="auto"/>
-        </w:pBdr>
-        <w:spacing w:before="100" w:beforeAutospacing="1" w:after="100" w:afterAutospacing="1" w:line="240" w:lineRule="auto"/>
-        <w:rPr>
-          <w:rFonts w:ascii="Times New Roman" w:eastAsia="Times New Roman" w:hAnsi="Times New Roman" w:cs="Times New Roman"/>
-          <w:kern w:val="0"/>
-          <w:lang w:val="en-GB" w:eastAsia="fr-FR"/>
-          <w14:ligatures w14:val="none"/>
-        </w:rPr>
-      </w:pPr>
-      <w:r>
-        <w:rPr>
-          <w:rFonts w:ascii="Times New Roman" w:eastAsia="Times New Roman" w:hAnsi="Times New Roman" w:cs="Times New Roman"/>
-          <w:kern w:val="0"/>
-          <w:lang w:val="en-GB" w:eastAsia="fr-FR"/>
-          <w14:ligatures w14:val="none"/>
-        </w:rPr>
-        <w:t xml:space="preserve">               string/equals(ch, "X") or</w:t>
-      </w:r>
-    </w:p>
-    <w:p>
-      <w:pPr>
-        <w:pBdr>
-          <w:top w:val="single" w:sz="4" w:space="1" w:color="auto"/>
-          <w:left w:val="single" w:sz="4" w:space="1" w:color="auto"/>
-          <w:bottom w:val="single" w:sz="4" w:space="1" w:color="auto"/>
-          <w:right w:val="single" w:sz="4" w:space="1" w:color="auto"/>
-        </w:pBdr>
-        <w:spacing w:before="100" w:beforeAutospacing="1" w:after="100" w:afterAutospacing="1" w:line="240" w:lineRule="auto"/>
-        <w:rPr>
-          <w:rFonts w:ascii="Times New Roman" w:eastAsia="Times New Roman" w:hAnsi="Times New Roman" w:cs="Times New Roman"/>
-          <w:kern w:val="0"/>
-          <w:lang w:val="en-GB" w:eastAsia="fr-FR"/>
-          <w14:ligatures w14:val="none"/>
-        </w:rPr>
-      </w:pPr>
-      <w:r>
-        <w:rPr>
-          <w:rFonts w:ascii="Times New Roman" w:eastAsia="Times New Roman" w:hAnsi="Times New Roman" w:cs="Times New Roman"/>
-          <w:kern w:val="0"/>
-          <w:lang w:val="en-GB" w:eastAsia="fr-FR"/>
-          <w14:ligatures w14:val="none"/>
-        </w:rPr>
-        <w:t xml:space="preserve">               string/equals(ch, "Y") or</w:t>
-      </w:r>
-    </w:p>
-    <w:p>
-      <w:pPr>
-        <w:pBdr>
-          <w:top w:val="single" w:sz="4" w:space="1" w:color="auto"/>
-          <w:left w:val="single" w:sz="4" w:space="1" w:color="auto"/>
-          <w:bottom w:val="single" w:sz="4" w:space="1" w:color="auto"/>
-          <w:right w:val="single" w:sz="4" w:space="1" w:color="auto"/>
-        </w:pBdr>
-        <w:spacing w:before="100" w:beforeAutospacing="1" w:after="100" w:afterAutospacing="1" w:line="240" w:lineRule="auto"/>
-        <w:rPr>
-          <w:rFonts w:ascii="Times New Roman" w:eastAsia="Times New Roman" w:hAnsi="Times New Roman" w:cs="Times New Roman"/>
-          <w:kern w:val="0"/>
-          <w:lang w:val="en-GB" w:eastAsia="fr-FR"/>
-          <w14:ligatures w14:val="none"/>
-        </w:rPr>
-      </w:pPr>
-      <w:r>
-        <w:rPr>
-          <w:rFonts w:ascii="Times New Roman" w:eastAsia="Times New Roman" w:hAnsi="Times New Roman" w:cs="Times New Roman"/>
-          <w:kern w:val="0"/>
-          <w:lang w:val="en-GB" w:eastAsia="fr-FR"/>
-          <w14:ligatures w14:val="none"/>
-        </w:rPr>
-        <w:t xml:space="preserve">               string/equals(ch, "Z") {</w:t>
-      </w:r>
-    </w:p>
-    <w:p>
-      <w:pPr>
-        <w:pBdr>
-          <w:top w:val="single" w:sz="4" w:space="1" w:color="auto"/>
-          <w:left w:val="single" w:sz="4" w:space="1" w:color="auto"/>
-          <w:bottom w:val="single" w:sz="4" w:space="1" w:color="auto"/>
-          <w:right w:val="single" w:sz="4" w:space="1" w:color="auto"/>
-        </w:pBdr>
-        <w:spacing w:before="100" w:beforeAutospacing="1" w:after="100" w:afterAutospacing="1" w:line="240" w:lineRule="auto"/>
-        <w:rPr>
-          <w:rFonts w:ascii="Times New Roman" w:eastAsia="Times New Roman" w:hAnsi="Times New Roman" w:cs="Times New Roman"/>
-          <w:kern w:val="0"/>
-          <w:lang w:val="en-GB" w:eastAsia="fr-FR"/>
-          <w14:ligatures w14:val="none"/>
-        </w:rPr>
-      </w:pPr>
-      <w:r>
-        <w:rPr>
-          <w:rFonts w:ascii="Times New Roman" w:eastAsia="Times New Roman" w:hAnsi="Times New Roman" w:cs="Times New Roman"/>
-          <w:kern w:val="0"/>
-          <w:lang w:val="en-GB" w:eastAsia="fr-FR"/>
-          <w14:ligatures w14:val="none"/>
-        </w:rPr>
-        <w:t xml:space="preserve">                has_upper = true</w:t>
-      </w:r>
-    </w:p>
-    <w:p>
-      <w:pPr>
-        <w:pBdr>
-          <w:top w:val="single" w:sz="4" w:space="1" w:color="auto"/>
-          <w:left w:val="single" w:sz="4" w:space="1" w:color="auto"/>
-          <w:bottom w:val="single" w:sz="4" w:space="1" w:color="auto"/>
-          <w:right w:val="single" w:sz="4" w:space="1" w:color="auto"/>
-        </w:pBdr>
-        <w:spacing w:before="100" w:beforeAutospacing="1" w:after="100" w:afterAutospacing="1" w:line="240" w:lineRule="auto"/>
-        <w:rPr>
-          <w:rFonts w:ascii="Times New Roman" w:eastAsia="Times New Roman" w:hAnsi="Times New Roman" w:cs="Times New Roman"/>
-          <w:kern w:val="0"/>
-          <w:lang w:val="en-GB" w:eastAsia="fr-FR"/>
-          <w14:ligatures w14:val="none"/>
-        </w:rPr>
-      </w:pPr>
-      <w:r>
-        <w:rPr>
-          <w:rFonts w:ascii="Times New Roman" w:eastAsia="Times New Roman" w:hAnsi="Times New Roman" w:cs="Times New Roman"/>
-          <w:kern w:val="0"/>
-          <w:lang w:val="en-GB" w:eastAsia="fr-FR"/>
-          <w14:ligatures w14:val="none"/>
-        </w:rPr>
-        <w:t xml:space="preserve">                break</w:t>
-      </w:r>
-    </w:p>
-    <w:p>
-      <w:pPr>
-        <w:pBdr>
-          <w:top w:val="single" w:sz="4" w:space="1" w:color="auto"/>
-          <w:left w:val="single" w:sz="4" w:space="1" w:color="auto"/>
-          <w:bottom w:val="single" w:sz="4" w:space="1" w:color="auto"/>
-          <w:right w:val="single" w:sz="4" w:space="1" w:color="auto"/>
-        </w:pBdr>
-        <w:spacing w:before="100" w:beforeAutospacing="1" w:after="100" w:afterAutospacing="1" w:line="240" w:lineRule="auto"/>
-        <w:rPr>
-          <w:rFonts w:ascii="Times New Roman" w:eastAsia="Times New Roman" w:hAnsi="Times New Roman" w:cs="Times New Roman"/>
-          <w:kern w:val="0"/>
-          <w:lang w:val="en-GB" w:eastAsia="fr-FR"/>
-          <w14:ligatures w14:val="none"/>
-        </w:rPr>
-      </w:pPr>
-      <w:r>
-        <w:rPr>
-          <w:rFonts w:ascii="Times New Roman" w:eastAsia="Times New Roman" w:hAnsi="Times New Roman" w:cs="Times New Roman"/>
-          <w:kern w:val="0"/>
-          <w:lang w:val="en-GB" w:eastAsia="fr-FR"/>
-          <w14:ligatures w14:val="none"/>
-        </w:rPr>
-        <w:t xml:space="preserve">            }</w:t>
-      </w:r>
-    </w:p>
-    <w:p>
-      <w:pPr>
-        <w:pBdr>
-          <w:top w:val="single" w:sz="4" w:space="1" w:color="auto"/>
-          <w:left w:val="single" w:sz="4" w:space="1" w:color="auto"/>
-          <w:bottom w:val="single" w:sz="4" w:space="1" w:color="auto"/>
-          <w:right w:val="single" w:sz="4" w:space="1" w:color="auto"/>
-        </w:pBdr>
-        <w:spacing w:before="100" w:beforeAutospacing="1" w:after="100" w:afterAutospacing="1" w:line="240" w:lineRule="auto"/>
-        <w:rPr>
-          <w:rFonts w:ascii="Times New Roman" w:eastAsia="Times New Roman" w:hAnsi="Times New Roman" w:cs="Times New Roman"/>
-          <w:kern w:val="0"/>
-          <w:lang w:val="en-GB" w:eastAsia="fr-FR"/>
-          <w14:ligatures w14:val="none"/>
-        </w:rPr>
-      </w:pPr>
-    </w:p>
-    <w:p>
-      <w:pPr>
-        <w:pBdr>
-          <w:top w:val="single" w:sz="4" w:space="1" w:color="auto"/>
-          <w:left w:val="single" w:sz="4" w:space="1" w:color="auto"/>
-          <w:bottom w:val="single" w:sz="4" w:space="1" w:color="auto"/>
-          <w:right w:val="single" w:sz="4" w:space="1" w:color="auto"/>
-        </w:pBdr>
-        <w:spacing w:before="100" w:beforeAutospacing="1" w:after="100" w:afterAutospacing="1" w:line="240" w:lineRule="auto"/>
-        <w:rPr>
-          <w:rFonts w:ascii="Times New Roman" w:eastAsia="Times New Roman" w:hAnsi="Times New Roman" w:cs="Times New Roman"/>
-          <w:kern w:val="0"/>
-          <w:lang w:val="en-GB" w:eastAsia="fr-FR"/>
-          <w14:ligatures w14:val="none"/>
-        </w:rPr>
-      </w:pPr>
-      <w:r>
-        <w:rPr>
-          <w:rFonts w:ascii="Times New Roman" w:eastAsia="Times New Roman" w:hAnsi="Times New Roman" w:cs="Times New Roman"/>
-          <w:kern w:val="0"/>
-          <w:lang w:val="en-GB" w:eastAsia="fr-FR"/>
-          <w14:ligatures w14:val="none"/>
-        </w:rPr>
-        <w:t xml:space="preserve">            i = math/add(i, int 1)</w:t>
-      </w:r>
-    </w:p>
-    <w:p>
-      <w:pPr>
-        <w:pBdr>
-          <w:top w:val="single" w:sz="4" w:space="1" w:color="auto"/>
-          <w:left w:val="single" w:sz="4" w:space="1" w:color="auto"/>
-          <w:bottom w:val="single" w:sz="4" w:space="1" w:color="auto"/>
-          <w:right w:val="single" w:sz="4" w:space="1" w:color="auto"/>
-        </w:pBdr>
-        <w:spacing w:before="100" w:beforeAutospacing="1" w:after="100" w:afterAutospacing="1" w:line="240" w:lineRule="auto"/>
-        <w:rPr>
-          <w:rFonts w:ascii="Times New Roman" w:eastAsia="Times New Roman" w:hAnsi="Times New Roman" w:cs="Times New Roman"/>
-          <w:kern w:val="0"/>
-          <w:lang w:val="en-GB" w:eastAsia="fr-FR"/>
-          <w14:ligatures w14:val="none"/>
-        </w:rPr>
-      </w:pPr>
-      <w:r>
-        <w:rPr>
-          <w:rFonts w:ascii="Times New Roman" w:eastAsia="Times New Roman" w:hAnsi="Times New Roman" w:cs="Times New Roman"/>
-          <w:kern w:val="0"/>
-          <w:lang w:val="en-GB" w:eastAsia="fr-FR"/>
-          <w14:ligatures w14:val="none"/>
-        </w:rPr>
-        <w:t xml:space="preserve">        }</w:t>
-      </w:r>
-    </w:p>
-    <w:p>
-      <w:pPr>
-        <w:pBdr>
-          <w:top w:val="single" w:sz="4" w:space="1" w:color="auto"/>
-          <w:left w:val="single" w:sz="4" w:space="1" w:color="auto"/>
-          <w:bottom w:val="single" w:sz="4" w:space="1" w:color="auto"/>
-          <w:right w:val="single" w:sz="4" w:space="1" w:color="auto"/>
-        </w:pBdr>
-        <w:spacing w:before="100" w:beforeAutospacing="1" w:after="100" w:afterAutospacing="1" w:line="240" w:lineRule="auto"/>
-        <w:rPr>
-          <w:rFonts w:ascii="Times New Roman" w:eastAsia="Times New Roman" w:hAnsi="Times New Roman" w:cs="Times New Roman"/>
-          <w:kern w:val="0"/>
-          <w:lang w:val="en-GB" w:eastAsia="fr-FR"/>
-          <w14:ligatures w14:val="none"/>
-        </w:rPr>
-      </w:pPr>
-      <w:r>
-        <w:rPr>
-          <w:rFonts w:ascii="Times New Roman" w:eastAsia="Times New Roman" w:hAnsi="Times New Roman" w:cs="Times New Roman"/>
-          <w:kern w:val="0"/>
-          <w:lang w:val="en-GB" w:eastAsia="fr-FR"/>
-          <w14:ligatures w14:val="none"/>
-        </w:rPr>
-        <w:t xml:space="preserve">    }</w:t>
-      </w:r>
-    </w:p>
-    <w:p>
-      <w:pPr>
-        <w:pBdr>
-          <w:top w:val="single" w:sz="4" w:space="1" w:color="auto"/>
-          <w:left w:val="single" w:sz="4" w:space="1" w:color="auto"/>
-          <w:bottom w:val="single" w:sz="4" w:space="1" w:color="auto"/>
-          <w:right w:val="single" w:sz="4" w:space="1" w:color="auto"/>
-        </w:pBdr>
-        <w:spacing w:before="100" w:beforeAutospacing="1" w:after="100" w:afterAutospacing="1" w:line="240" w:lineRule="auto"/>
-        <w:rPr>
-          <w:rFonts w:ascii="Times New Roman" w:eastAsia="Times New Roman" w:hAnsi="Times New Roman" w:cs="Times New Roman"/>
-          <w:kern w:val="0"/>
-          <w:lang w:val="en-GB" w:eastAsia="fr-FR"/>
-          <w14:ligatures w14:val="none"/>
-        </w:rPr>
-      </w:pPr>
-    </w:p>
-    <w:p>
-      <w:pPr>
-        <w:pBdr>
-          <w:top w:val="single" w:sz="4" w:space="1" w:color="auto"/>
-          <w:left w:val="single" w:sz="4" w:space="1" w:color="auto"/>
-          <w:bottom w:val="single" w:sz="4" w:space="1" w:color="auto"/>
-          <w:right w:val="single" w:sz="4" w:space="1" w:color="auto"/>
-        </w:pBdr>
-        <w:spacing w:before="100" w:beforeAutospacing="1" w:after="100" w:afterAutospacing="1" w:line="240" w:lineRule="auto"/>
-        <w:rPr>
-          <w:rFonts w:ascii="Times New Roman" w:eastAsia="Times New Roman" w:hAnsi="Times New Roman" w:cs="Times New Roman"/>
-          <w:kern w:val="0"/>
-          <w:lang w:val="en-GB" w:eastAsia="fr-FR"/>
-          <w14:ligatures w14:val="none"/>
-        </w:rPr>
-      </w:pPr>
-      <w:r>
-        <w:rPr>
-          <w:rFonts w:ascii="Times New Roman" w:eastAsia="Times New Roman" w:hAnsi="Times New Roman" w:cs="Times New Roman"/>
-          <w:kern w:val="0"/>
-          <w:lang w:val="en-GB" w:eastAsia="fr-FR"/>
-          <w14:ligatures w14:val="none"/>
-        </w:rPr>
-        <w:t xml:space="preserve">    if not has_upper {</w:t>
-      </w:r>
-    </w:p>
-    <w:p>
-      <w:pPr>
-        <w:pBdr>
-          <w:top w:val="single" w:sz="4" w:space="1" w:color="auto"/>
-          <w:left w:val="single" w:sz="4" w:space="1" w:color="auto"/>
-          <w:bottom w:val="single" w:sz="4" w:space="1" w:color="auto"/>
-          <w:right w:val="single" w:sz="4" w:space="1" w:color="auto"/>
-        </w:pBdr>
-        <w:spacing w:before="100" w:beforeAutospacing="1" w:after="100" w:afterAutospacing="1" w:line="240" w:lineRule="auto"/>
-        <w:rPr>
-          <w:rFonts w:ascii="Times New Roman" w:eastAsia="Times New Roman" w:hAnsi="Times New Roman" w:cs="Times New Roman"/>
-          <w:kern w:val="0"/>
-          <w:lang w:val="en-GB" w:eastAsia="fr-FR"/>
-          <w14:ligatures w14:val="none"/>
-        </w:rPr>
-      </w:pPr>
-      <w:r>
-        <w:rPr>
-          <w:rFonts w:ascii="Times New Roman" w:eastAsia="Times New Roman" w:hAnsi="Times New Roman" w:cs="Times New Roman"/>
-          <w:kern w:val="0"/>
-          <w:lang w:val="en-GB" w:eastAsia="fr-FR"/>
-          <w14:ligatures w14:val="none"/>
-        </w:rPr>
-        <w:t xml:space="preserve">        return false</w:t>
-      </w:r>
-    </w:p>
-    <w:p>
-      <w:pPr>
-        <w:pBdr>
-          <w:top w:val="single" w:sz="4" w:space="1" w:color="auto"/>
-          <w:left w:val="single" w:sz="4" w:space="1" w:color="auto"/>
-          <w:bottom w:val="single" w:sz="4" w:space="1" w:color="auto"/>
-          <w:right w:val="single" w:sz="4" w:space="1" w:color="auto"/>
-        </w:pBdr>
-        <w:spacing w:before="100" w:beforeAutospacing="1" w:after="100" w:afterAutospacing="1" w:line="240" w:lineRule="auto"/>
-        <w:rPr>
-          <w:rFonts w:ascii="Times New Roman" w:eastAsia="Times New Roman" w:hAnsi="Times New Roman" w:cs="Times New Roman"/>
-          <w:kern w:val="0"/>
-          <w:lang w:eastAsia="fr-FR"/>
-          <w14:ligatures w14:val="none"/>
-        </w:rPr>
-      </w:pPr>
-      <w:r>
-        <w:rPr>
-          <w:rFonts w:ascii="Times New Roman" w:eastAsia="Times New Roman" w:hAnsi="Times New Roman" w:cs="Times New Roman"/>
-          <w:kern w:val="0"/>
-          <w:lang w:val="en-GB" w:eastAsia="fr-FR"/>
-          <w14:ligatures w14:val="none"/>
-        </w:rPr>
-        <w:t xml:space="preserve">    </w:t>
-      </w:r>
+          <w:lang w:eastAsia="fr-FR"/>
+          <w14:ligatures w14:val="none"/>
+        </w:rPr>
+      </w:pPr>
       <w:r>
         <w:rPr>
           <w:rFonts w:ascii="Times New Roman" w:eastAsia="Times New Roman" w:hAnsi="Times New Roman" w:cs="Times New Roman"/>
@@ -5461,567 +4672,14 @@
     </w:p>
     <w:p>
       <w:pPr>
-        <w:pBdr>
-          <w:top w:val="single" w:sz="4" w:space="1" w:color="auto"/>
-          <w:left w:val="single" w:sz="4" w:space="1" w:color="auto"/>
-          <w:bottom w:val="single" w:sz="4" w:space="1" w:color="auto"/>
-          <w:right w:val="single" w:sz="4" w:space="1" w:color="auto"/>
-        </w:pBdr>
-        <w:spacing w:before="100" w:beforeAutospacing="1" w:after="100" w:afterAutospacing="1" w:line="240" w:lineRule="auto"/>
-        <w:rPr>
-          <w:rFonts w:ascii="Times New Roman" w:eastAsia="Times New Roman" w:hAnsi="Times New Roman" w:cs="Times New Roman"/>
-          <w:kern w:val="0"/>
-          <w:lang w:eastAsia="fr-FR"/>
-          <w14:ligatures w14:val="none"/>
-        </w:rPr>
-      </w:pPr>
-    </w:p>
-    <w:p>
-      <w:pPr>
-        <w:pBdr>
-          <w:top w:val="single" w:sz="4" w:space="1" w:color="auto"/>
-          <w:left w:val="single" w:sz="4" w:space="1" w:color="auto"/>
-          <w:bottom w:val="single" w:sz="4" w:space="1" w:color="auto"/>
-          <w:right w:val="single" w:sz="4" w:space="1" w:color="auto"/>
-        </w:pBdr>
-        <w:spacing w:before="100" w:beforeAutospacing="1" w:after="100" w:afterAutospacing="1" w:line="240" w:lineRule="auto"/>
-        <w:rPr>
-          <w:rFonts w:ascii="Times New Roman" w:eastAsia="Times New Roman" w:hAnsi="Times New Roman" w:cs="Times New Roman"/>
-          <w:kern w:val="0"/>
-          <w:lang w:eastAsia="fr-FR"/>
-          <w14:ligatures w14:val="none"/>
-        </w:rPr>
-      </w:pPr>
-      <w:r>
-        <w:rPr>
-          <w:rFonts w:ascii="Times New Roman" w:eastAsia="Times New Roman" w:hAnsi="Times New Roman" w:cs="Times New Roman"/>
-          <w:kern w:val="0"/>
-          <w:lang w:eastAsia="fr-FR"/>
-          <w14:ligatures w14:val="none"/>
-        </w:rPr>
-        <w:t xml:space="preserve">    // Si toutes les règles sont respectées</w:t>
-      </w:r>
-    </w:p>
-    <w:p>
-      <w:pPr>
-        <w:pBdr>
-          <w:top w:val="single" w:sz="4" w:space="1" w:color="auto"/>
-          <w:left w:val="single" w:sz="4" w:space="1" w:color="auto"/>
-          <w:bottom w:val="single" w:sz="4" w:space="1" w:color="auto"/>
-          <w:right w:val="single" w:sz="4" w:space="1" w:color="auto"/>
-        </w:pBdr>
-        <w:spacing w:before="100" w:beforeAutospacing="1" w:after="100" w:afterAutospacing="1" w:line="240" w:lineRule="auto"/>
-        <w:rPr>
-          <w:rFonts w:ascii="Times New Roman" w:eastAsia="Times New Roman" w:hAnsi="Times New Roman" w:cs="Times New Roman"/>
-          <w:kern w:val="0"/>
-          <w:lang w:eastAsia="fr-FR"/>
-          <w14:ligatures w14:val="none"/>
-        </w:rPr>
-      </w:pPr>
-      <w:r>
-        <w:rPr>
-          <w:rFonts w:ascii="Times New Roman" w:eastAsia="Times New Roman" w:hAnsi="Times New Roman" w:cs="Times New Roman"/>
-          <w:kern w:val="0"/>
-          <w:lang w:eastAsia="fr-FR"/>
-          <w14:ligatures w14:val="none"/>
-        </w:rPr>
-        <w:lastRenderedPageBreak/>
-        <w:t xml:space="preserve">    return true</w:t>
-      </w:r>
-    </w:p>
-    <w:p>
-      <w:pPr>
-        <w:pBdr>
-          <w:top w:val="single" w:sz="4" w:space="1" w:color="auto"/>
-          <w:left w:val="single" w:sz="4" w:space="1" w:color="auto"/>
-          <w:bottom w:val="single" w:sz="4" w:space="1" w:color="auto"/>
-          <w:right w:val="single" w:sz="4" w:space="1" w:color="auto"/>
-        </w:pBdr>
-        <w:spacing w:before="100" w:beforeAutospacing="1" w:after="100" w:afterAutospacing="1" w:line="240" w:lineRule="auto"/>
-        <w:rPr>
-          <w:rFonts w:ascii="Times New Roman" w:eastAsia="Times New Roman" w:hAnsi="Times New Roman" w:cs="Times New Roman"/>
-          <w:kern w:val="0"/>
-          <w:lang w:eastAsia="fr-FR"/>
-          <w14:ligatures w14:val="none"/>
-        </w:rPr>
-      </w:pPr>
-      <w:r>
-        <w:rPr>
-          <w:rFonts w:ascii="Times New Roman" w:eastAsia="Times New Roman" w:hAnsi="Times New Roman" w:cs="Times New Roman"/>
-          <w:kern w:val="0"/>
-          <w:lang w:eastAsia="fr-FR"/>
-          <w14:ligatures w14:val="none"/>
-        </w:rPr>
-        <w:t>}</w:t>
-      </w:r>
-    </w:p>
-    <w:p>
-      <w:pPr>
-        <w:pBdr>
-          <w:top w:val="single" w:sz="4" w:space="1" w:color="auto"/>
-          <w:left w:val="single" w:sz="4" w:space="1" w:color="auto"/>
-          <w:bottom w:val="single" w:sz="4" w:space="1" w:color="auto"/>
-          <w:right w:val="single" w:sz="4" w:space="1" w:color="auto"/>
-        </w:pBdr>
-        <w:spacing w:before="100" w:beforeAutospacing="1" w:after="100" w:afterAutospacing="1" w:line="240" w:lineRule="auto"/>
-        <w:rPr>
-          <w:rFonts w:ascii="Times New Roman" w:eastAsia="Times New Roman" w:hAnsi="Times New Roman" w:cs="Times New Roman"/>
-          <w:kern w:val="0"/>
-          <w:lang w:eastAsia="fr-FR"/>
-          <w14:ligatures w14:val="none"/>
-        </w:rPr>
-      </w:pPr>
-    </w:p>
-    <w:p>
-      <w:pPr>
-        <w:pBdr>
-          <w:top w:val="single" w:sz="4" w:space="1" w:color="auto"/>
-          <w:left w:val="single" w:sz="4" w:space="1" w:color="auto"/>
-          <w:bottom w:val="single" w:sz="4" w:space="1" w:color="auto"/>
-          <w:right w:val="single" w:sz="4" w:space="1" w:color="auto"/>
-        </w:pBdr>
-        <w:spacing w:before="100" w:beforeAutospacing="1" w:after="100" w:afterAutospacing="1" w:line="240" w:lineRule="auto"/>
-        <w:rPr>
-          <w:rFonts w:ascii="Times New Roman" w:eastAsia="Times New Roman" w:hAnsi="Times New Roman" w:cs="Times New Roman"/>
-          <w:kern w:val="0"/>
-          <w:lang w:eastAsia="fr-FR"/>
-          <w14:ligatures w14:val="none"/>
-        </w:rPr>
-      </w:pPr>
-    </w:p>
-    <w:p>
-      <w:pPr>
-        <w:pBdr>
-          <w:top w:val="single" w:sz="4" w:space="1" w:color="auto"/>
-          <w:left w:val="single" w:sz="4" w:space="1" w:color="auto"/>
-          <w:bottom w:val="single" w:sz="4" w:space="1" w:color="auto"/>
-          <w:right w:val="single" w:sz="4" w:space="1" w:color="auto"/>
-        </w:pBdr>
-        <w:spacing w:before="100" w:beforeAutospacing="1" w:after="100" w:afterAutospacing="1" w:line="240" w:lineRule="auto"/>
-        <w:rPr>
-          <w:rFonts w:ascii="Times New Roman" w:eastAsia="Times New Roman" w:hAnsi="Times New Roman" w:cs="Times New Roman"/>
-          <w:kern w:val="0"/>
-          <w:lang w:eastAsia="fr-FR"/>
-          <w14:ligatures w14:val="none"/>
-        </w:rPr>
-      </w:pPr>
-      <w:r>
-        <w:rPr>
-          <w:rFonts w:ascii="Times New Roman" w:eastAsia="Times New Roman" w:hAnsi="Times New Roman" w:cs="Times New Roman"/>
-          <w:kern w:val="0"/>
-          <w:lang w:eastAsia="fr-FR"/>
-          <w14:ligatures w14:val="none"/>
-        </w:rPr>
-        <w:t>// Point d'entrée du programme</w:t>
-      </w:r>
-    </w:p>
-    <w:p>
-      <w:pPr>
-        <w:pBdr>
-          <w:top w:val="single" w:sz="4" w:space="1" w:color="auto"/>
-          <w:left w:val="single" w:sz="4" w:space="1" w:color="auto"/>
-          <w:bottom w:val="single" w:sz="4" w:space="1" w:color="auto"/>
-          <w:right w:val="single" w:sz="4" w:space="1" w:color="auto"/>
-        </w:pBdr>
-        <w:spacing w:before="100" w:beforeAutospacing="1" w:after="100" w:afterAutospacing="1" w:line="240" w:lineRule="auto"/>
-        <w:rPr>
-          <w:rFonts w:ascii="Times New Roman" w:eastAsia="Times New Roman" w:hAnsi="Times New Roman" w:cs="Times New Roman"/>
-          <w:kern w:val="0"/>
-          <w:lang w:eastAsia="fr-FR"/>
-          <w14:ligatures w14:val="none"/>
-        </w:rPr>
-      </w:pPr>
-      <w:r>
-        <w:rPr>
-          <w:rFonts w:ascii="Times New Roman" w:eastAsia="Times New Roman" w:hAnsi="Times New Roman" w:cs="Times New Roman"/>
-          <w:kern w:val="0"/>
-          <w:lang w:eastAsia="fr-FR"/>
-          <w14:ligatures w14:val="none"/>
-        </w:rPr>
-        <w:t>main: fn() {</w:t>
-      </w:r>
-    </w:p>
-    <w:p>
-      <w:pPr>
-        <w:pBdr>
-          <w:top w:val="single" w:sz="4" w:space="1" w:color="auto"/>
-          <w:left w:val="single" w:sz="4" w:space="1" w:color="auto"/>
-          <w:bottom w:val="single" w:sz="4" w:space="1" w:color="auto"/>
-          <w:right w:val="single" w:sz="4" w:space="1" w:color="auto"/>
-        </w:pBdr>
-        <w:spacing w:before="100" w:beforeAutospacing="1" w:after="100" w:afterAutospacing="1" w:line="240" w:lineRule="auto"/>
-        <w:rPr>
-          <w:rFonts w:ascii="Times New Roman" w:eastAsia="Times New Roman" w:hAnsi="Times New Roman" w:cs="Times New Roman"/>
-          <w:kern w:val="0"/>
-          <w:lang w:eastAsia="fr-FR"/>
-          <w14:ligatures w14:val="none"/>
-        </w:rPr>
-      </w:pPr>
-    </w:p>
-    <w:p>
-      <w:pPr>
-        <w:pBdr>
-          <w:top w:val="single" w:sz="4" w:space="1" w:color="auto"/>
-          <w:left w:val="single" w:sz="4" w:space="1" w:color="auto"/>
-          <w:bottom w:val="single" w:sz="4" w:space="1" w:color="auto"/>
-          <w:right w:val="single" w:sz="4" w:space="1" w:color="auto"/>
-        </w:pBdr>
-        <w:spacing w:before="100" w:beforeAutospacing="1" w:after="100" w:afterAutospacing="1" w:line="240" w:lineRule="auto"/>
-        <w:rPr>
-          <w:rFonts w:ascii="Times New Roman" w:eastAsia="Times New Roman" w:hAnsi="Times New Roman" w:cs="Times New Roman"/>
-          <w:kern w:val="0"/>
-          <w:lang w:eastAsia="fr-FR"/>
-          <w14:ligatures w14:val="none"/>
-        </w:rPr>
-      </w:pPr>
-      <w:r>
-        <w:rPr>
-          <w:rFonts w:ascii="Times New Roman" w:eastAsia="Times New Roman" w:hAnsi="Times New Roman" w:cs="Times New Roman"/>
-          <w:kern w:val="0"/>
-          <w:lang w:eastAsia="fr-FR"/>
-          <w14:ligatures w14:val="none"/>
-        </w:rPr>
-        <w:t xml:space="preserve">    // Exemple de mot de passe</w:t>
-      </w:r>
-    </w:p>
-    <w:p>
-      <w:pPr>
-        <w:pBdr>
-          <w:top w:val="single" w:sz="4" w:space="1" w:color="auto"/>
-          <w:left w:val="single" w:sz="4" w:space="1" w:color="auto"/>
-          <w:bottom w:val="single" w:sz="4" w:space="1" w:color="auto"/>
-          <w:right w:val="single" w:sz="4" w:space="1" w:color="auto"/>
-        </w:pBdr>
-        <w:spacing w:before="100" w:beforeAutospacing="1" w:after="100" w:afterAutospacing="1" w:line="240" w:lineRule="auto"/>
-        <w:rPr>
-          <w:rFonts w:ascii="Times New Roman" w:eastAsia="Times New Roman" w:hAnsi="Times New Roman" w:cs="Times New Roman"/>
-          <w:kern w:val="0"/>
-          <w:lang w:val="en-GB" w:eastAsia="fr-FR"/>
-          <w14:ligatures w14:val="none"/>
-        </w:rPr>
-      </w:pPr>
-      <w:r>
-        <w:rPr>
-          <w:rFonts w:ascii="Times New Roman" w:eastAsia="Times New Roman" w:hAnsi="Times New Roman" w:cs="Times New Roman"/>
-          <w:kern w:val="0"/>
-          <w:lang w:eastAsia="fr-FR"/>
-          <w14:ligatures w14:val="none"/>
-        </w:rPr>
-        <w:t xml:space="preserve">    </w:t>
-      </w:r>
-      <w:r>
-        <w:rPr>
-          <w:rFonts w:ascii="Times New Roman" w:eastAsia="Times New Roman" w:hAnsi="Times New Roman" w:cs="Times New Roman"/>
-          <w:kern w:val="0"/>
-          <w:lang w:val="en-GB" w:eastAsia="fr-FR"/>
-          <w14:ligatures w14:val="none"/>
-        </w:rPr>
-        <w:t>let pwd = "Abcdef12"</w:t>
-      </w:r>
-    </w:p>
-    <w:p>
-      <w:pPr>
-        <w:pBdr>
-          <w:top w:val="single" w:sz="4" w:space="1" w:color="auto"/>
-          <w:left w:val="single" w:sz="4" w:space="1" w:color="auto"/>
-          <w:bottom w:val="single" w:sz="4" w:space="1" w:color="auto"/>
-          <w:right w:val="single" w:sz="4" w:space="1" w:color="auto"/>
-        </w:pBdr>
-        <w:spacing w:before="100" w:beforeAutospacing="1" w:after="100" w:afterAutospacing="1" w:line="240" w:lineRule="auto"/>
-        <w:rPr>
-          <w:rFonts w:ascii="Times New Roman" w:eastAsia="Times New Roman" w:hAnsi="Times New Roman" w:cs="Times New Roman"/>
-          <w:kern w:val="0"/>
-          <w:lang w:val="en-GB" w:eastAsia="fr-FR"/>
-          <w14:ligatures w14:val="none"/>
-        </w:rPr>
-      </w:pPr>
-    </w:p>
-    <w:p>
-      <w:pPr>
-        <w:pBdr>
-          <w:top w:val="single" w:sz="4" w:space="1" w:color="auto"/>
-          <w:left w:val="single" w:sz="4" w:space="1" w:color="auto"/>
-          <w:bottom w:val="single" w:sz="4" w:space="1" w:color="auto"/>
-          <w:right w:val="single" w:sz="4" w:space="1" w:color="auto"/>
-        </w:pBdr>
-        <w:spacing w:before="100" w:beforeAutospacing="1" w:after="100" w:afterAutospacing="1" w:line="240" w:lineRule="auto"/>
-        <w:rPr>
-          <w:rFonts w:ascii="Times New Roman" w:eastAsia="Times New Roman" w:hAnsi="Times New Roman" w:cs="Times New Roman"/>
-          <w:kern w:val="0"/>
-          <w:lang w:val="en-GB" w:eastAsia="fr-FR"/>
-          <w14:ligatures w14:val="none"/>
-        </w:rPr>
-      </w:pPr>
-      <w:r>
-        <w:rPr>
-          <w:rFonts w:ascii="Times New Roman" w:eastAsia="Times New Roman" w:hAnsi="Times New Roman" w:cs="Times New Roman"/>
-          <w:kern w:val="0"/>
-          <w:lang w:val="en-GB" w:eastAsia="fr-FR"/>
-          <w14:ligatures w14:val="none"/>
-        </w:rPr>
-        <w:t xml:space="preserve">    // Validation</w:t>
-      </w:r>
-    </w:p>
-    <w:p>
-      <w:pPr>
-        <w:pBdr>
-          <w:top w:val="single" w:sz="4" w:space="1" w:color="auto"/>
-          <w:left w:val="single" w:sz="4" w:space="1" w:color="auto"/>
-          <w:bottom w:val="single" w:sz="4" w:space="1" w:color="auto"/>
-          <w:right w:val="single" w:sz="4" w:space="1" w:color="auto"/>
-        </w:pBdr>
-        <w:spacing w:before="100" w:beforeAutospacing="1" w:after="100" w:afterAutospacing="1" w:line="240" w:lineRule="auto"/>
-        <w:rPr>
-          <w:rFonts w:ascii="Times New Roman" w:eastAsia="Times New Roman" w:hAnsi="Times New Roman" w:cs="Times New Roman"/>
-          <w:kern w:val="0"/>
-          <w:lang w:val="en-GB" w:eastAsia="fr-FR"/>
-          <w14:ligatures w14:val="none"/>
-        </w:rPr>
-      </w:pPr>
-      <w:r>
-        <w:rPr>
-          <w:rFonts w:ascii="Times New Roman" w:eastAsia="Times New Roman" w:hAnsi="Times New Roman" w:cs="Times New Roman"/>
-          <w:kern w:val="0"/>
-          <w:lang w:val="en-GB" w:eastAsia="fr-FR"/>
-          <w14:ligatures w14:val="none"/>
-        </w:rPr>
-        <w:t xml:space="preserve">    let ok = validate_password(pwd)</w:t>
-      </w:r>
-    </w:p>
-    <w:p>
-      <w:pPr>
-        <w:pBdr>
-          <w:top w:val="single" w:sz="4" w:space="1" w:color="auto"/>
-          <w:left w:val="single" w:sz="4" w:space="1" w:color="auto"/>
-          <w:bottom w:val="single" w:sz="4" w:space="1" w:color="auto"/>
-          <w:right w:val="single" w:sz="4" w:space="1" w:color="auto"/>
-        </w:pBdr>
-        <w:spacing w:before="100" w:beforeAutospacing="1" w:after="100" w:afterAutospacing="1" w:line="240" w:lineRule="auto"/>
-        <w:rPr>
-          <w:rFonts w:ascii="Times New Roman" w:eastAsia="Times New Roman" w:hAnsi="Times New Roman" w:cs="Times New Roman"/>
-          <w:kern w:val="0"/>
-          <w:lang w:val="en-GB" w:eastAsia="fr-FR"/>
-          <w14:ligatures w14:val="none"/>
-        </w:rPr>
-      </w:pPr>
-    </w:p>
-    <w:p>
-      <w:pPr>
-        <w:pBdr>
-          <w:top w:val="single" w:sz="4" w:space="1" w:color="auto"/>
-          <w:left w:val="single" w:sz="4" w:space="1" w:color="auto"/>
-          <w:bottom w:val="single" w:sz="4" w:space="1" w:color="auto"/>
-          <w:right w:val="single" w:sz="4" w:space="1" w:color="auto"/>
-        </w:pBdr>
-        <w:spacing w:before="100" w:beforeAutospacing="1" w:after="100" w:afterAutospacing="1" w:line="240" w:lineRule="auto"/>
-        <w:rPr>
-          <w:rFonts w:ascii="Times New Roman" w:eastAsia="Times New Roman" w:hAnsi="Times New Roman" w:cs="Times New Roman"/>
-          <w:kern w:val="0"/>
-          <w:lang w:eastAsia="fr-FR"/>
-          <w14:ligatures w14:val="none"/>
-        </w:rPr>
-      </w:pPr>
-      <w:r>
-        <w:rPr>
-          <w:rFonts w:ascii="Times New Roman" w:eastAsia="Times New Roman" w:hAnsi="Times New Roman" w:cs="Times New Roman"/>
-          <w:kern w:val="0"/>
-          <w:lang w:val="en-GB" w:eastAsia="fr-FR"/>
-          <w14:ligatures w14:val="none"/>
-        </w:rPr>
-        <w:t xml:space="preserve">    </w:t>
-      </w:r>
-      <w:r>
-        <w:rPr>
-          <w:rFonts w:ascii="Times New Roman" w:eastAsia="Times New Roman" w:hAnsi="Times New Roman" w:cs="Times New Roman"/>
-          <w:kern w:val="0"/>
-          <w:lang w:eastAsia="fr-FR"/>
-          <w14:ligatures w14:val="none"/>
-        </w:rPr>
-        <w:t>// Affichage du résultat</w:t>
-      </w:r>
-    </w:p>
-    <w:p>
-      <w:pPr>
-        <w:pBdr>
-          <w:top w:val="single" w:sz="4" w:space="1" w:color="auto"/>
-          <w:left w:val="single" w:sz="4" w:space="1" w:color="auto"/>
-          <w:bottom w:val="single" w:sz="4" w:space="1" w:color="auto"/>
-          <w:right w:val="single" w:sz="4" w:space="1" w:color="auto"/>
-        </w:pBdr>
-        <w:spacing w:before="100" w:beforeAutospacing="1" w:after="100" w:afterAutospacing="1" w:line="240" w:lineRule="auto"/>
-        <w:rPr>
-          <w:rFonts w:ascii="Times New Roman" w:eastAsia="Times New Roman" w:hAnsi="Times New Roman" w:cs="Times New Roman"/>
-          <w:kern w:val="0"/>
-          <w:lang w:eastAsia="fr-FR"/>
-          <w14:ligatures w14:val="none"/>
-        </w:rPr>
-      </w:pPr>
-      <w:r>
-        <w:rPr>
-          <w:rFonts w:ascii="Times New Roman" w:eastAsia="Times New Roman" w:hAnsi="Times New Roman" w:cs="Times New Roman"/>
-          <w:kern w:val="0"/>
-          <w:lang w:eastAsia="fr-FR"/>
-          <w14:ligatures w14:val="none"/>
-        </w:rPr>
-        <w:t xml:space="preserve">    if ok {</w:t>
-      </w:r>
-    </w:p>
-    <w:p>
-      <w:pPr>
-        <w:pBdr>
-          <w:top w:val="single" w:sz="4" w:space="1" w:color="auto"/>
-          <w:left w:val="single" w:sz="4" w:space="1" w:color="auto"/>
-          <w:bottom w:val="single" w:sz="4" w:space="1" w:color="auto"/>
-          <w:right w:val="single" w:sz="4" w:space="1" w:color="auto"/>
-        </w:pBdr>
-        <w:spacing w:before="100" w:beforeAutospacing="1" w:after="100" w:afterAutospacing="1" w:line="240" w:lineRule="auto"/>
-        <w:rPr>
-          <w:rFonts w:ascii="Times New Roman" w:eastAsia="Times New Roman" w:hAnsi="Times New Roman" w:cs="Times New Roman"/>
-          <w:kern w:val="0"/>
-          <w:lang w:eastAsia="fr-FR"/>
-          <w14:ligatures w14:val="none"/>
-        </w:rPr>
-      </w:pPr>
-      <w:r>
-        <w:rPr>
-          <w:rFonts w:ascii="Times New Roman" w:eastAsia="Times New Roman" w:hAnsi="Times New Roman" w:cs="Times New Roman"/>
-          <w:kern w:val="0"/>
-          <w:lang w:eastAsia="fr-FR"/>
-          <w14:ligatures w14:val="none"/>
-        </w:rPr>
-        <w:t xml:space="preserve">        print("Mot de passe valide.")</w:t>
-      </w:r>
-    </w:p>
-    <w:p>
-      <w:pPr>
-        <w:pBdr>
-          <w:top w:val="single" w:sz="4" w:space="1" w:color="auto"/>
-          <w:left w:val="single" w:sz="4" w:space="1" w:color="auto"/>
-          <w:bottom w:val="single" w:sz="4" w:space="1" w:color="auto"/>
-          <w:right w:val="single" w:sz="4" w:space="1" w:color="auto"/>
-        </w:pBdr>
-        <w:spacing w:before="100" w:beforeAutospacing="1" w:after="100" w:afterAutospacing="1" w:line="240" w:lineRule="auto"/>
-        <w:rPr>
-          <w:rFonts w:ascii="Times New Roman" w:eastAsia="Times New Roman" w:hAnsi="Times New Roman" w:cs="Times New Roman"/>
-          <w:kern w:val="0"/>
-          <w:lang w:eastAsia="fr-FR"/>
-          <w14:ligatures w14:val="none"/>
-        </w:rPr>
-      </w:pPr>
-      <w:r>
-        <w:rPr>
-          <w:rFonts w:ascii="Times New Roman" w:eastAsia="Times New Roman" w:hAnsi="Times New Roman" w:cs="Times New Roman"/>
-          <w:kern w:val="0"/>
-          <w:lang w:eastAsia="fr-FR"/>
-          <w14:ligatures w14:val="none"/>
-        </w:rPr>
-        <w:t xml:space="preserve">    } else {</w:t>
-      </w:r>
-    </w:p>
-    <w:p>
-      <w:pPr>
-        <w:pBdr>
-          <w:top w:val="single" w:sz="4" w:space="1" w:color="auto"/>
-          <w:left w:val="single" w:sz="4" w:space="1" w:color="auto"/>
-          <w:bottom w:val="single" w:sz="4" w:space="1" w:color="auto"/>
-          <w:right w:val="single" w:sz="4" w:space="1" w:color="auto"/>
-        </w:pBdr>
-        <w:spacing w:before="100" w:beforeAutospacing="1" w:after="100" w:afterAutospacing="1" w:line="240" w:lineRule="auto"/>
-        <w:rPr>
-          <w:rFonts w:ascii="Times New Roman" w:eastAsia="Times New Roman" w:hAnsi="Times New Roman" w:cs="Times New Roman"/>
-          <w:kern w:val="0"/>
-          <w:lang w:eastAsia="fr-FR"/>
-          <w14:ligatures w14:val="none"/>
-        </w:rPr>
-      </w:pPr>
-      <w:r>
-        <w:rPr>
-          <w:rFonts w:ascii="Times New Roman" w:eastAsia="Times New Roman" w:hAnsi="Times New Roman" w:cs="Times New Roman"/>
-          <w:kern w:val="0"/>
-          <w:lang w:eastAsia="fr-FR"/>
-          <w14:ligatures w14:val="none"/>
-        </w:rPr>
-        <w:t xml:space="preserve">        print("Mot de passe invalide.")</w:t>
-      </w:r>
-    </w:p>
-    <w:p>
-      <w:pPr>
-        <w:pBdr>
-          <w:top w:val="single" w:sz="4" w:space="1" w:color="auto"/>
-          <w:left w:val="single" w:sz="4" w:space="1" w:color="auto"/>
-          <w:bottom w:val="single" w:sz="4" w:space="1" w:color="auto"/>
-          <w:right w:val="single" w:sz="4" w:space="1" w:color="auto"/>
-        </w:pBdr>
-        <w:spacing w:before="100" w:beforeAutospacing="1" w:after="100" w:afterAutospacing="1" w:line="240" w:lineRule="auto"/>
-        <w:rPr>
-          <w:rFonts w:ascii="Times New Roman" w:eastAsia="Times New Roman" w:hAnsi="Times New Roman" w:cs="Times New Roman"/>
-          <w:kern w:val="0"/>
-          <w:lang w:eastAsia="fr-FR"/>
-          <w14:ligatures w14:val="none"/>
-        </w:rPr>
-      </w:pPr>
-      <w:r>
-        <w:rPr>
-          <w:rFonts w:ascii="Times New Roman" w:eastAsia="Times New Roman" w:hAnsi="Times New Roman" w:cs="Times New Roman"/>
-          <w:kern w:val="0"/>
-          <w:lang w:eastAsia="fr-FR"/>
-          <w14:ligatures w14:val="none"/>
-        </w:rPr>
-        <w:t xml:space="preserve">    }</w:t>
-      </w:r>
-    </w:p>
-    <w:p>
-      <w:pPr>
-        <w:pBdr>
-          <w:top w:val="single" w:sz="4" w:space="1" w:color="auto"/>
-          <w:left w:val="single" w:sz="4" w:space="1" w:color="auto"/>
-          <w:bottom w:val="single" w:sz="4" w:space="1" w:color="auto"/>
-          <w:right w:val="single" w:sz="4" w:space="1" w:color="auto"/>
-        </w:pBdr>
-        <w:spacing w:before="100" w:beforeAutospacing="1" w:after="100" w:afterAutospacing="1" w:line="240" w:lineRule="auto"/>
-        <w:rPr>
-          <w:rFonts w:ascii="Times New Roman" w:eastAsia="Times New Roman" w:hAnsi="Times New Roman" w:cs="Times New Roman"/>
-          <w:kern w:val="0"/>
-          <w:lang w:eastAsia="fr-FR"/>
-          <w14:ligatures w14:val="none"/>
-        </w:rPr>
-      </w:pPr>
-      <w:r>
-        <w:rPr>
-          <w:rFonts w:ascii="Times New Roman" w:eastAsia="Times New Roman" w:hAnsi="Times New Roman" w:cs="Times New Roman"/>
-          <w:kern w:val="0"/>
-          <w:lang w:eastAsia="fr-FR"/>
-          <w14:ligatures w14:val="none"/>
-        </w:rPr>
-        <w:t>}</w:t>
-      </w:r>
-      <w:r>
-        <w:rPr>
-          <w:rFonts w:ascii="Times New Roman" w:eastAsia="Times New Roman" w:hAnsi="Times New Roman" w:cs="Times New Roman"/>
-          <w:kern w:val="0"/>
-          <w:lang w:eastAsia="fr-FR"/>
-          <w14:ligatures w14:val="none"/>
-        </w:rPr>
-        <w:br/>
-      </w:r>
-      <w:r>
-        <w:rPr>
-          <w:rFonts w:ascii="Times New Roman" w:eastAsia="Times New Roman" w:hAnsi="Times New Roman" w:cs="Times New Roman"/>
-          <w:kern w:val="0"/>
-          <w:lang w:eastAsia="fr-FR"/>
-          <w14:ligatures w14:val="none"/>
-        </w:rPr>
-        <w:br/>
-      </w:r>
-      <w:r>
-        <w:rPr>
-          <w:rFonts w:ascii="Times New Roman" w:eastAsia="Times New Roman" w:hAnsi="Times New Roman" w:cs="Times New Roman"/>
-          <w:kern w:val="0"/>
-          <w:lang w:eastAsia="fr-FR"/>
-          <w14:ligatures w14:val="none"/>
-        </w:rPr>
-        <w:br/>
-      </w:r>
+        <w:spacing w:before="100" w:beforeAutospacing="1" w:after="100" w:afterAutospacing="1" w:line="240" w:lineRule="auto"/>
+        <w:rPr>
+          <w:rFonts w:ascii="Times New Roman" w:eastAsia="Times New Roman" w:hAnsi="Times New Roman" w:cs="Times New Roman"/>
+          <w:kern w:val="0"/>
+          <w:lang w:eastAsia="fr-FR"/>
+          <w14:ligatures w14:val="none"/>
+        </w:rPr>
+      </w:pPr>
       <w:r>
         <w:rPr>
           <w:rFonts w:ascii="Times New Roman" w:eastAsia="Times New Roman" w:hAnsi="Times New Roman" w:cs="Times New Roman"/>
@@ -6135,7 +4793,6 @@
           <w:lang w:eastAsia="fr-FR"/>
           <w14:ligatures w14:val="none"/>
         </w:rPr>
-        <w:lastRenderedPageBreak/>
         <w:t>Ogma est un langage narratif, strict et déterministe, conçu pour être Human Ready et AI Ready.</w:t>
       </w:r>
     </w:p>
@@ -7387,7 +6044,6 @@
   <w:style w:type="character" w:default="1" w:styleId="Policepardfaut">
     <w:name w:val="Default Paragraph Font"/>
     <w:uiPriority w:val="1"/>
-    <w:semiHidden/>
     <w:unhideWhenUsed/>
   </w:style>
   <w:style w:type="table" w:default="1" w:styleId="TableauNormal">

</xml_diff>